<commit_message>
Normalize portfolio documents and restore project detail UI
</commit_message>
<xml_diff>
--- a/public/documents/bai-1-quan-ly-tep.docx
+++ b/public/documents/bai-1-quan-ly-tep.docx
@@ -4,7 +4,29 @@
   <w:body>
     <w:p>
       <w:pPr>
+        <w:pStyle w:val="Title"/>
+        <w:keepNext w:val="0"/>
+        <w:keepLines w:val="0"/>
+        <w:spacing w:before="0" w:after="200" w:line="240" w:lineRule="auto"/>
         <w:jc w:val="center"/>
+      </w:pPr>
+      <w:r>
+        <w:rPr>
+          <w:rFonts w:ascii="Arial" w:hAnsi="Arial" w:eastAsia="Arial" w:cs="Arial"/>
+          <w:b/>
+          <w:color w:val="1B365D"/>
+          <w:sz w:val="44"/>
+        </w:rPr>
+        <w:t>Bài tập 1 — Thao tác cơ bản với tệp tin và thư mục</w:t>
+      </w:r>
+    </w:p>
+    <w:p>
+      <w:pPr>
+        <w:pStyle w:val="Heading1"/>
+        <w:keepNext w:val="0"/>
+        <w:keepLines w:val="0"/>
+        <w:spacing w:before="280" w:after="120" w:line="240" w:lineRule="auto"/>
+        <w:jc w:val="left"/>
         <w:rPr>
           <w:rFonts w:ascii="Times New Roman" w:eastAsia="Times New Roman" w:hAnsi="Times New Roman" w:cs="Times New Roman"/>
           <w:b/>
@@ -16,17 +38,62 @@
       </w:pPr>
       <w:r>
         <w:rPr>
+          <w:rFonts w:ascii="Arial" w:eastAsia="Arial" w:hAnsi="Arial" w:cs="Arial"/>
+          <w:b/>
+          <w:bCs/>
+          <w:color w:val="0F766E"/>
+          <w:sz w:val="30"/>
+          <w:szCs w:val="42"/>
+          <w:highlight w:val="white"/>
+          <w:u w:val="single"/>
+        </w:rPr>
+        <w:t>CHƯƠNG 1</w:t>
+      </w:r>
+      <w:r>
+        <w:rPr>
+          <w:rFonts w:ascii="Arial" w:eastAsia="Arial" w:hAnsi="Arial" w:cs="Arial"/>
+          <w:b/>
+          <w:bCs/>
+          <w:color w:val="0F766E"/>
+          <w:sz w:val="30"/>
+          <w:szCs w:val="42"/>
+          <w:highlight w:val="white"/>
+        </w:rPr>
+        <w:t xml:space="preserve">: </w:t>
+      </w:r>
+    </w:p>
+    <w:p>
+      <w:pPr>
+        <w:pStyle w:val="Subtitle"/>
+        <w:keepNext w:val="0"/>
+        <w:keepLines w:val="0"/>
+        <w:spacing w:before="0" w:after="240" w:line="240" w:lineRule="auto"/>
+        <w:jc w:val="center"/>
+        <w:rPr>
           <w:rFonts w:ascii="Times New Roman" w:eastAsia="Times New Roman" w:hAnsi="Times New Roman" w:cs="Times New Roman"/>
           <w:b/>
           <w:bCs/>
           <w:sz w:val="42"/>
           <w:szCs w:val="42"/>
           <w:highlight w:val="white"/>
-          <w:u w:val="single"/>
-        </w:rPr>
-        <w:t>CHƯƠNG 1</w:t>
-      </w:r>
-      <w:r>
+        </w:rPr>
+      </w:pPr>
+      <w:r>
+        <w:rPr>
+          <w:rFonts w:ascii="Arial" w:eastAsia="Arial" w:hAnsi="Arial" w:cs="Arial"/>
+          <w:b/>
+          <w:bCs/>
+          <w:highlight w:val="white"/>
+        </w:rPr>
+        <w:t>MÁY TÍNH VÀ CÁC THIẾT BỊ NGOẠI VI</w:t>
+      </w:r>
+    </w:p>
+    <w:p>
+      <w:pPr>
+        <w:keepNext w:val="0"/>
+        <w:keepLines w:val="0"/>
+        <w:spacing w:line="240" w:lineRule="auto" w:before="0" w:after="40"/>
+        <w:jc w:val="left"/>
         <w:rPr>
           <w:rFonts w:ascii="Times New Roman" w:eastAsia="Times New Roman" w:hAnsi="Times New Roman" w:cs="Times New Roman"/>
           <w:b/>
@@ -35,12 +102,15 @@
           <w:szCs w:val="42"/>
           <w:highlight w:val="white"/>
         </w:rPr>
-        <w:t xml:space="preserve">: </w:t>
-      </w:r>
-    </w:p>
-    <w:p>
-      <w:pPr>
-        <w:jc w:val="center"/>
+      </w:pPr>
+    </w:p>
+    <w:p>
+      <w:pPr>
+        <w:pStyle w:val="Heading1"/>
+        <w:keepNext w:val="0"/>
+        <w:keepLines w:val="0"/>
+        <w:spacing w:before="280" w:after="120" w:line="240" w:lineRule="auto"/>
+        <w:jc w:val="left"/>
         <w:rPr>
           <w:rFonts w:ascii="Times New Roman" w:eastAsia="Times New Roman" w:hAnsi="Times New Roman" w:cs="Times New Roman"/>
           <w:b/>
@@ -52,6 +122,37 @@
       </w:pPr>
       <w:r>
         <w:rPr>
+          <w:rFonts w:ascii="Arial" w:eastAsia="Arial" w:hAnsi="Arial" w:cs="Arial"/>
+          <w:b/>
+          <w:bCs/>
+          <w:color w:val="0F766E"/>
+          <w:sz w:val="30"/>
+          <w:szCs w:val="42"/>
+          <w:highlight w:val="white"/>
+          <w:u w:val="single"/>
+        </w:rPr>
+        <w:t>Bài tập 1</w:t>
+      </w:r>
+      <w:r>
+        <w:rPr>
+          <w:rFonts w:ascii="Arial" w:eastAsia="Arial" w:hAnsi="Arial" w:cs="Arial"/>
+          <w:b/>
+          <w:bCs/>
+          <w:color w:val="0F766E"/>
+          <w:sz w:val="30"/>
+          <w:szCs w:val="42"/>
+          <w:highlight w:val="white"/>
+        </w:rPr>
+        <w:t>:Thao tác cơ bản với tệp tin và thư mục</w:t>
+      </w:r>
+    </w:p>
+    <w:p>
+      <w:pPr>
+        <w:keepNext w:val="0"/>
+        <w:keepLines w:val="0"/>
+        <w:spacing w:before="0" w:after="40" w:line="240" w:lineRule="auto"/>
+        <w:jc w:val="left"/>
+        <w:rPr>
           <w:rFonts w:ascii="Times New Roman" w:eastAsia="Times New Roman" w:hAnsi="Times New Roman" w:cs="Times New Roman"/>
           <w:b/>
           <w:bCs/>
@@ -59,105 +160,39 @@
           <w:szCs w:val="42"/>
           <w:highlight w:val="white"/>
         </w:rPr>
-        <w:t>MÁY TÍNH VÀ CÁC THIẾT BỊ NGOẠI VI</w:t>
-      </w:r>
-    </w:p>
-    <w:p>
-      <w:pPr>
-        <w:spacing w:line="240" w:lineRule="auto"/>
-        <w:jc w:val="center"/>
-        <w:rPr>
-          <w:rFonts w:ascii="Times New Roman" w:eastAsia="Times New Roman" w:hAnsi="Times New Roman" w:cs="Times New Roman"/>
-          <w:b/>
-          <w:bCs/>
-          <w:sz w:val="42"/>
-          <w:szCs w:val="42"/>
-          <w:highlight w:val="white"/>
-        </w:rPr>
-      </w:pPr>
-    </w:p>
-    <w:p>
-      <w:pPr>
-        <w:jc w:val="center"/>
-        <w:rPr>
-          <w:rFonts w:ascii="Times New Roman" w:eastAsia="Times New Roman" w:hAnsi="Times New Roman" w:cs="Times New Roman"/>
-          <w:b/>
-          <w:bCs/>
-          <w:sz w:val="42"/>
-          <w:szCs w:val="42"/>
-          <w:highlight w:val="white"/>
-        </w:rPr>
-      </w:pPr>
-      <w:r>
-        <w:rPr>
-          <w:rFonts w:ascii="Times New Roman" w:eastAsia="Times New Roman" w:hAnsi="Times New Roman" w:cs="Times New Roman"/>
-          <w:b/>
-          <w:bCs/>
-          <w:sz w:val="42"/>
-          <w:szCs w:val="42"/>
-          <w:highlight w:val="white"/>
-          <w:u w:val="single"/>
-        </w:rPr>
-        <w:t>Bài tập 1</w:t>
-      </w:r>
-      <w:r>
-        <w:rPr>
-          <w:rFonts w:ascii="Times New Roman" w:eastAsia="Times New Roman" w:hAnsi="Times New Roman" w:cs="Times New Roman"/>
-          <w:b/>
-          <w:bCs/>
-          <w:sz w:val="42"/>
-          <w:szCs w:val="42"/>
-          <w:highlight w:val="white"/>
-        </w:rPr>
-        <w:t>:Thao tác cơ bản với tệp tin và thư mục</w:t>
-      </w:r>
-    </w:p>
-    <w:p>
-      <w:pPr>
-        <w:jc w:val="both"/>
-        <w:rPr>
-          <w:rFonts w:ascii="Times New Roman" w:eastAsia="Times New Roman" w:hAnsi="Times New Roman" w:cs="Times New Roman"/>
-          <w:b/>
-          <w:bCs/>
-          <w:sz w:val="42"/>
-          <w:szCs w:val="42"/>
-          <w:highlight w:val="white"/>
-        </w:rPr>
-      </w:pPr>
-    </w:p>
-    <w:p>
-      <w:pPr>
+      </w:pPr>
+    </w:p>
+    <w:p>
+      <w:pPr>
+        <w:keepNext w:val="0"/>
+        <w:keepLines w:val="0"/>
         <w:numPr>
           <w:ilvl w:val="0"/>
           <w:numId w:val="5"/>
         </w:numPr>
         <w:shd w:val="clear" w:color="auto" w:fill="FFFFFF"/>
-        <w:spacing w:after="240" w:line="360" w:lineRule="auto"/>
+        <w:spacing w:after="120" w:line="276" w:lineRule="auto" w:before="0"/>
         <w:ind w:right="100"/>
-        <w:jc w:val="both"/>
-        <w:rPr>
-          <w:rFonts w:ascii="Times New Roman" w:eastAsia="Times New Roman" w:hAnsi="Times New Roman" w:cs="Times New Roman"/>
-          <w:sz w:val="26"/>
-          <w:szCs w:val="26"/>
-          <w:highlight w:val="white"/>
-        </w:rPr>
-      </w:pPr>
-      <w:r>
-        <w:rPr>
-          <w:rFonts w:ascii="Times New Roman" w:eastAsia="Times New Roman" w:hAnsi="Times New Roman" w:cs="Times New Roman"/>
+        <w:jc w:val="left"/>
+        <w:rPr>
+          <w:rFonts w:ascii="Times New Roman" w:eastAsia="Times New Roman" w:hAnsi="Times New Roman" w:cs="Times New Roman"/>
+          <w:sz w:val="26"/>
+          <w:szCs w:val="26"/>
+          <w:highlight w:val="white"/>
+        </w:rPr>
+      </w:pPr>
+      <w:r>
+        <w:rPr>
+          <w:rFonts w:ascii="Arial" w:eastAsia="Arial" w:hAnsi="Arial" w:cs="Arial"/>
           <w:b/>
           <w:bCs/>
-          <w:sz w:val="26"/>
-          <w:szCs w:val="26"/>
           <w:highlight w:val="white"/>
         </w:rPr>
         <w:t xml:space="preserve">Mở File Explorer: </w:t>
       </w:r>
       <w:r>
         <w:rPr>
-          <w:rFonts w:ascii="Times New Roman" w:eastAsia="Times New Roman" w:hAnsi="Times New Roman" w:cs="Times New Roman"/>
-          <w:sz w:val="26"/>
-          <w:szCs w:val="26"/>
+          <w:rFonts w:ascii="Arial" w:eastAsia="Arial" w:hAnsi="Arial" w:cs="Arial"/>
           <w:highlight w:val="white"/>
         </w:rPr>
         <w:t>Nhấn tổ hợp phím Windows + E hoặc nhấp vào biểu tượng thư mục màu vàng trên thanh tác vụ.</w:t>
@@ -165,23 +200,23 @@
     </w:p>
     <w:p>
       <w:pPr>
-        <w:shd w:val="clear" w:color="auto" w:fill="FFFFFF"/>
-        <w:spacing w:after="240" w:line="360" w:lineRule="auto"/>
+        <w:keepNext w:val="0"/>
+        <w:keepLines w:val="0"/>
+        <w:shd w:val="clear" w:color="auto" w:fill="FFFFFF"/>
+        <w:spacing w:after="40" w:line="240" w:lineRule="auto" w:before="0"/>
         <w:ind w:left="141"/>
-        <w:jc w:val="both"/>
-        <w:rPr>
-          <w:rFonts w:ascii="Times New Roman" w:eastAsia="Times New Roman" w:hAnsi="Times New Roman" w:cs="Times New Roman"/>
-          <w:sz w:val="26"/>
-          <w:szCs w:val="26"/>
-          <w:highlight w:val="white"/>
-        </w:rPr>
-      </w:pPr>
-      <w:r>
-        <w:rPr>
-          <w:rFonts w:ascii="Times New Roman" w:eastAsia="Times New Roman" w:hAnsi="Times New Roman" w:cs="Times New Roman"/>
+        <w:jc w:val="left"/>
+        <w:rPr>
+          <w:rFonts w:ascii="Times New Roman" w:eastAsia="Times New Roman" w:hAnsi="Times New Roman" w:cs="Times New Roman"/>
+          <w:sz w:val="26"/>
+          <w:szCs w:val="26"/>
+          <w:highlight w:val="white"/>
+        </w:rPr>
+      </w:pPr>
+      <w:r>
+        <w:rPr>
+          <w:rFonts w:ascii="Arial" w:eastAsia="Arial" w:hAnsi="Arial" w:cs="Arial"/>
           <w:noProof/>
-          <w:sz w:val="26"/>
-          <w:szCs w:val="26"/>
           <w:highlight w:val="white"/>
         </w:rPr>
         <w:drawing>
@@ -223,10 +258,12 @@
     </w:p>
     <w:p>
       <w:pPr>
-        <w:shd w:val="clear" w:color="auto" w:fill="FFFFFF"/>
-        <w:spacing w:after="240" w:line="360" w:lineRule="auto"/>
+        <w:keepNext w:val="0"/>
+        <w:keepLines w:val="0"/>
+        <w:shd w:val="clear" w:color="auto" w:fill="FFFFFF"/>
+        <w:spacing w:after="40" w:line="240" w:lineRule="auto" w:before="0"/>
         <w:ind w:right="100"/>
-        <w:jc w:val="both"/>
+        <w:jc w:val="left"/>
         <w:rPr>
           <w:rFonts w:ascii="Times New Roman" w:eastAsia="Times New Roman" w:hAnsi="Times New Roman" w:cs="Times New Roman"/>
           <w:b/>
@@ -239,37 +276,35 @@
     </w:p>
     <w:p>
       <w:pPr>
+        <w:keepNext w:val="0"/>
+        <w:keepLines w:val="0"/>
         <w:numPr>
           <w:ilvl w:val="0"/>
           <w:numId w:val="5"/>
         </w:numPr>
         <w:shd w:val="clear" w:color="auto" w:fill="FFFFFF"/>
-        <w:spacing w:after="240" w:line="360" w:lineRule="auto"/>
+        <w:spacing w:after="120" w:line="276" w:lineRule="auto" w:before="0"/>
         <w:ind w:right="100"/>
-        <w:jc w:val="both"/>
-        <w:rPr>
-          <w:rFonts w:ascii="Times New Roman" w:eastAsia="Times New Roman" w:hAnsi="Times New Roman" w:cs="Times New Roman"/>
-          <w:sz w:val="26"/>
-          <w:szCs w:val="26"/>
-          <w:highlight w:val="white"/>
-        </w:rPr>
-      </w:pPr>
-      <w:r>
-        <w:rPr>
-          <w:rFonts w:ascii="Times New Roman" w:eastAsia="Times New Roman" w:hAnsi="Times New Roman" w:cs="Times New Roman"/>
+        <w:jc w:val="left"/>
+        <w:rPr>
+          <w:rFonts w:ascii="Times New Roman" w:eastAsia="Times New Roman" w:hAnsi="Times New Roman" w:cs="Times New Roman"/>
+          <w:sz w:val="26"/>
+          <w:szCs w:val="26"/>
+          <w:highlight w:val="white"/>
+        </w:rPr>
+      </w:pPr>
+      <w:r>
+        <w:rPr>
+          <w:rFonts w:ascii="Arial" w:eastAsia="Arial" w:hAnsi="Arial" w:cs="Arial"/>
           <w:b/>
           <w:bCs/>
-          <w:sz w:val="26"/>
-          <w:szCs w:val="26"/>
           <w:highlight w:val="white"/>
         </w:rPr>
         <w:t>Truy cập ổ đĩa/thư mục:</w:t>
       </w:r>
       <w:r>
         <w:rPr>
-          <w:rFonts w:ascii="Times New Roman" w:eastAsia="Times New Roman" w:hAnsi="Times New Roman" w:cs="Times New Roman"/>
-          <w:sz w:val="26"/>
-          <w:szCs w:val="26"/>
+          <w:rFonts w:ascii="Arial" w:eastAsia="Arial" w:hAnsi="Arial" w:cs="Arial"/>
           <w:highlight w:val="white"/>
         </w:rPr>
         <w:t xml:space="preserve"> Ở cột bên trái, nhấp vào This PC, sau đó nhấp đúp vào một ổ đĩa không phải ổ hệ thống (ví dụ: ổ D: hoặc E:). Nếu chỉ có ổ C:, hãy vào thư mục Documents.</w:t>
@@ -277,22 +312,22 @@
     </w:p>
     <w:p>
       <w:pPr>
-        <w:shd w:val="clear" w:color="auto" w:fill="FFFFFF"/>
-        <w:spacing w:after="240" w:line="360" w:lineRule="auto"/>
+        <w:keepNext w:val="0"/>
+        <w:keepLines w:val="0"/>
+        <w:shd w:val="clear" w:color="auto" w:fill="FFFFFF"/>
+        <w:spacing w:after="40" w:line="240" w:lineRule="auto" w:before="0"/>
         <w:ind w:left="141" w:right="100"/>
-        <w:jc w:val="both"/>
-        <w:rPr>
-          <w:rFonts w:ascii="Times New Roman" w:eastAsia="Times New Roman" w:hAnsi="Times New Roman" w:cs="Times New Roman"/>
-          <w:sz w:val="26"/>
-          <w:szCs w:val="26"/>
-          <w:highlight w:val="white"/>
-        </w:rPr>
-      </w:pPr>
-      <w:r>
-        <w:rPr>
-          <w:rFonts w:ascii="Times New Roman" w:eastAsia="Times New Roman" w:hAnsi="Times New Roman" w:cs="Times New Roman"/>
-          <w:sz w:val="26"/>
-          <w:szCs w:val="26"/>
+        <w:jc w:val="left"/>
+        <w:rPr>
+          <w:rFonts w:ascii="Times New Roman" w:eastAsia="Times New Roman" w:hAnsi="Times New Roman" w:cs="Times New Roman"/>
+          <w:sz w:val="26"/>
+          <w:szCs w:val="26"/>
+          <w:highlight w:val="white"/>
+        </w:rPr>
+      </w:pPr>
+      <w:r>
+        <w:rPr>
+          <w:rFonts w:ascii="Arial" w:eastAsia="Arial" w:hAnsi="Arial" w:cs="Arial"/>
         </w:rPr>
         <w:drawing>
           <wp:inline distT="0" distB="0" distL="0" distR="0" wp14:anchorId="48E145B3" wp14:editId="191551ED">
@@ -333,10 +368,12 @@
     </w:p>
     <w:p>
       <w:pPr>
-        <w:shd w:val="clear" w:color="auto" w:fill="FFFFFF"/>
-        <w:spacing w:after="240" w:line="360" w:lineRule="auto"/>
+        <w:keepNext w:val="0"/>
+        <w:keepLines w:val="0"/>
+        <w:shd w:val="clear" w:color="auto" w:fill="FFFFFF"/>
+        <w:spacing w:after="40" w:line="240" w:lineRule="auto" w:before="0"/>
         <w:ind w:right="100"/>
-        <w:jc w:val="both"/>
+        <w:jc w:val="left"/>
         <w:rPr>
           <w:rFonts w:ascii="Times New Roman" w:eastAsia="Times New Roman" w:hAnsi="Times New Roman" w:cs="Times New Roman"/>
           <w:b/>
@@ -349,10 +386,12 @@
     </w:p>
     <w:p>
       <w:pPr>
-        <w:shd w:val="clear" w:color="auto" w:fill="FFFFFF"/>
-        <w:spacing w:after="240" w:line="360" w:lineRule="auto"/>
+        <w:keepNext w:val="0"/>
+        <w:keepLines w:val="0"/>
+        <w:shd w:val="clear" w:color="auto" w:fill="FFFFFF"/>
+        <w:spacing w:after="40" w:line="240" w:lineRule="auto" w:before="0"/>
         <w:ind w:right="100"/>
-        <w:jc w:val="both"/>
+        <w:jc w:val="left"/>
         <w:rPr>
           <w:rFonts w:ascii="Times New Roman" w:eastAsia="Times New Roman" w:hAnsi="Times New Roman" w:cs="Times New Roman"/>
           <w:b/>
@@ -365,10 +404,12 @@
     </w:p>
     <w:p>
       <w:pPr>
-        <w:shd w:val="clear" w:color="auto" w:fill="FFFFFF"/>
-        <w:spacing w:after="240" w:line="360" w:lineRule="auto"/>
+        <w:keepNext w:val="0"/>
+        <w:keepLines w:val="0"/>
+        <w:shd w:val="clear" w:color="auto" w:fill="FFFFFF"/>
+        <w:spacing w:after="40" w:line="240" w:lineRule="auto" w:before="0"/>
         <w:ind w:right="100"/>
-        <w:jc w:val="both"/>
+        <w:jc w:val="left"/>
         <w:rPr>
           <w:rFonts w:ascii="Times New Roman" w:eastAsia="Times New Roman" w:hAnsi="Times New Roman" w:cs="Times New Roman"/>
           <w:b/>
@@ -381,10 +422,12 @@
     </w:p>
     <w:p>
       <w:pPr>
-        <w:shd w:val="clear" w:color="auto" w:fill="FFFFFF"/>
-        <w:spacing w:after="240" w:line="360" w:lineRule="auto"/>
+        <w:keepNext w:val="0"/>
+        <w:keepLines w:val="0"/>
+        <w:shd w:val="clear" w:color="auto" w:fill="FFFFFF"/>
+        <w:spacing w:after="40" w:line="240" w:lineRule="auto" w:before="0"/>
         <w:ind w:right="100"/>
-        <w:jc w:val="both"/>
+        <w:jc w:val="left"/>
         <w:rPr>
           <w:rFonts w:ascii="Times New Roman" w:eastAsia="Times New Roman" w:hAnsi="Times New Roman" w:cs="Times New Roman"/>
           <w:b/>
@@ -397,37 +440,35 @@
     </w:p>
     <w:p>
       <w:pPr>
+        <w:keepNext w:val="0"/>
+        <w:keepLines w:val="0"/>
         <w:numPr>
           <w:ilvl w:val="0"/>
           <w:numId w:val="5"/>
         </w:numPr>
         <w:shd w:val="clear" w:color="auto" w:fill="FFFFFF"/>
-        <w:spacing w:after="240" w:line="360" w:lineRule="auto"/>
+        <w:spacing w:after="120" w:line="276" w:lineRule="auto" w:before="0"/>
         <w:ind w:right="100"/>
-        <w:jc w:val="both"/>
-        <w:rPr>
-          <w:rFonts w:ascii="Times New Roman" w:eastAsia="Times New Roman" w:hAnsi="Times New Roman" w:cs="Times New Roman"/>
-          <w:sz w:val="26"/>
-          <w:szCs w:val="26"/>
-          <w:highlight w:val="white"/>
-        </w:rPr>
-      </w:pPr>
-      <w:r>
-        <w:rPr>
-          <w:rFonts w:ascii="Times New Roman" w:eastAsia="Times New Roman" w:hAnsi="Times New Roman" w:cs="Times New Roman"/>
+        <w:jc w:val="left"/>
+        <w:rPr>
+          <w:rFonts w:ascii="Times New Roman" w:eastAsia="Times New Roman" w:hAnsi="Times New Roman" w:cs="Times New Roman"/>
+          <w:sz w:val="26"/>
+          <w:szCs w:val="26"/>
+          <w:highlight w:val="white"/>
+        </w:rPr>
+      </w:pPr>
+      <w:r>
+        <w:rPr>
+          <w:rFonts w:ascii="Arial" w:eastAsia="Arial" w:hAnsi="Arial" w:cs="Arial"/>
           <w:b/>
           <w:bCs/>
-          <w:sz w:val="26"/>
-          <w:szCs w:val="26"/>
           <w:highlight w:val="white"/>
         </w:rPr>
         <w:t xml:space="preserve">Tạo thư mục mới: </w:t>
       </w:r>
       <w:r>
         <w:rPr>
-          <w:rFonts w:ascii="Times New Roman" w:eastAsia="Times New Roman" w:hAnsi="Times New Roman" w:cs="Times New Roman"/>
-          <w:sz w:val="26"/>
-          <w:szCs w:val="26"/>
+          <w:rFonts w:ascii="Arial" w:eastAsia="Arial" w:hAnsi="Arial" w:cs="Arial"/>
           <w:highlight w:val="white"/>
         </w:rPr>
         <w:t>Nhấp chuột phải vào một khoảng trống -&gt; chọn New -&gt; Folder. Đặt tên thư mục là ThucHanh_hotensinhvien (VD: ThucHanh_NguyenVanA). Nhấn Enter.</w:t>
@@ -435,22 +476,22 @@
     </w:p>
     <w:p>
       <w:pPr>
-        <w:shd w:val="clear" w:color="auto" w:fill="FFFFFF"/>
-        <w:spacing w:after="240" w:line="360" w:lineRule="auto"/>
+        <w:keepNext w:val="0"/>
+        <w:keepLines w:val="0"/>
+        <w:shd w:val="clear" w:color="auto" w:fill="FFFFFF"/>
+        <w:spacing w:after="40" w:line="240" w:lineRule="auto" w:before="0"/>
         <w:ind w:left="141" w:right="100"/>
-        <w:jc w:val="both"/>
-        <w:rPr>
-          <w:rFonts w:ascii="Times New Roman" w:eastAsia="Times New Roman" w:hAnsi="Times New Roman" w:cs="Times New Roman"/>
-          <w:sz w:val="26"/>
-          <w:szCs w:val="26"/>
-          <w:highlight w:val="white"/>
-        </w:rPr>
-      </w:pPr>
-      <w:r>
-        <w:rPr>
-          <w:rFonts w:ascii="Times New Roman" w:eastAsia="Times New Roman" w:hAnsi="Times New Roman" w:cs="Times New Roman"/>
-          <w:sz w:val="26"/>
-          <w:szCs w:val="26"/>
+        <w:jc w:val="left"/>
+        <w:rPr>
+          <w:rFonts w:ascii="Times New Roman" w:eastAsia="Times New Roman" w:hAnsi="Times New Roman" w:cs="Times New Roman"/>
+          <w:sz w:val="26"/>
+          <w:szCs w:val="26"/>
+          <w:highlight w:val="white"/>
+        </w:rPr>
+      </w:pPr>
+      <w:r>
+        <w:rPr>
+          <w:rFonts w:ascii="Arial" w:eastAsia="Arial" w:hAnsi="Arial" w:cs="Arial"/>
         </w:rPr>
         <w:drawing>
           <wp:inline distT="0" distB="0" distL="0" distR="0" wp14:anchorId="25248B8C" wp14:editId="27B909CF">
@@ -491,10 +532,12 @@
     </w:p>
     <w:p>
       <w:pPr>
-        <w:shd w:val="clear" w:color="auto" w:fill="FFFFFF"/>
-        <w:spacing w:after="240" w:line="360" w:lineRule="auto"/>
+        <w:keepNext w:val="0"/>
+        <w:keepLines w:val="0"/>
+        <w:shd w:val="clear" w:color="auto" w:fill="FFFFFF"/>
+        <w:spacing w:after="40" w:line="240" w:lineRule="auto" w:before="0"/>
         <w:ind w:left="425" w:right="100"/>
-        <w:jc w:val="both"/>
+        <w:jc w:val="left"/>
         <w:rPr>
           <w:rFonts w:ascii="Times New Roman" w:eastAsia="Times New Roman" w:hAnsi="Times New Roman" w:cs="Times New Roman"/>
           <w:b/>
@@ -507,37 +550,35 @@
     </w:p>
     <w:p>
       <w:pPr>
+        <w:keepNext w:val="0"/>
+        <w:keepLines w:val="0"/>
         <w:numPr>
           <w:ilvl w:val="0"/>
           <w:numId w:val="5"/>
         </w:numPr>
         <w:shd w:val="clear" w:color="auto" w:fill="FFFFFF"/>
-        <w:spacing w:after="240" w:line="360" w:lineRule="auto"/>
+        <w:spacing w:after="120" w:line="276" w:lineRule="auto" w:before="0"/>
         <w:ind w:right="100"/>
-        <w:jc w:val="both"/>
-        <w:rPr>
-          <w:rFonts w:ascii="Times New Roman" w:eastAsia="Times New Roman" w:hAnsi="Times New Roman" w:cs="Times New Roman"/>
-          <w:sz w:val="26"/>
-          <w:szCs w:val="26"/>
-          <w:highlight w:val="white"/>
-        </w:rPr>
-      </w:pPr>
-      <w:r>
-        <w:rPr>
-          <w:rFonts w:ascii="Times New Roman" w:eastAsia="Times New Roman" w:hAnsi="Times New Roman" w:cs="Times New Roman"/>
+        <w:jc w:val="left"/>
+        <w:rPr>
+          <w:rFonts w:ascii="Times New Roman" w:eastAsia="Times New Roman" w:hAnsi="Times New Roman" w:cs="Times New Roman"/>
+          <w:sz w:val="26"/>
+          <w:szCs w:val="26"/>
+          <w:highlight w:val="white"/>
+        </w:rPr>
+      </w:pPr>
+      <w:r>
+        <w:rPr>
+          <w:rFonts w:ascii="Arial" w:eastAsia="Arial" w:hAnsi="Arial" w:cs="Arial"/>
           <w:b/>
           <w:bCs/>
-          <w:sz w:val="26"/>
-          <w:szCs w:val="26"/>
           <w:highlight w:val="white"/>
         </w:rPr>
         <w:t>Vào thư mục vừa tạo:</w:t>
       </w:r>
       <w:r>
         <w:rPr>
-          <w:rFonts w:ascii="Times New Roman" w:eastAsia="Times New Roman" w:hAnsi="Times New Roman" w:cs="Times New Roman"/>
-          <w:sz w:val="26"/>
-          <w:szCs w:val="26"/>
+          <w:rFonts w:ascii="Arial" w:eastAsia="Arial" w:hAnsi="Arial" w:cs="Arial"/>
           <w:highlight w:val="white"/>
         </w:rPr>
         <w:t xml:space="preserve"> Nhấp đúp vào thư mục ThucHanh_NguyenVanA.</w:t>
@@ -545,23 +586,23 @@
     </w:p>
     <w:p>
       <w:pPr>
-        <w:shd w:val="clear" w:color="auto" w:fill="FFFFFF"/>
-        <w:spacing w:after="240" w:line="360" w:lineRule="auto"/>
+        <w:keepNext w:val="0"/>
+        <w:keepLines w:val="0"/>
+        <w:shd w:val="clear" w:color="auto" w:fill="FFFFFF"/>
+        <w:spacing w:after="40" w:line="240" w:lineRule="auto" w:before="0"/>
         <w:ind w:left="141" w:right="100"/>
-        <w:jc w:val="both"/>
-        <w:rPr>
-          <w:rFonts w:ascii="Times New Roman" w:eastAsia="Times New Roman" w:hAnsi="Times New Roman" w:cs="Times New Roman"/>
-          <w:sz w:val="26"/>
-          <w:szCs w:val="26"/>
-          <w:highlight w:val="white"/>
-        </w:rPr>
-      </w:pPr>
-      <w:r>
-        <w:rPr>
-          <w:rFonts w:ascii="Times New Roman" w:eastAsia="Times New Roman" w:hAnsi="Times New Roman" w:cs="Times New Roman"/>
+        <w:jc w:val="left"/>
+        <w:rPr>
+          <w:rFonts w:ascii="Times New Roman" w:eastAsia="Times New Roman" w:hAnsi="Times New Roman" w:cs="Times New Roman"/>
+          <w:sz w:val="26"/>
+          <w:szCs w:val="26"/>
+          <w:highlight w:val="white"/>
+        </w:rPr>
+      </w:pPr>
+      <w:r>
+        <w:rPr>
+          <w:rFonts w:ascii="Arial" w:eastAsia="Arial" w:hAnsi="Arial" w:cs="Arial"/>
           <w:noProof/>
-          <w:sz w:val="26"/>
-          <w:szCs w:val="26"/>
         </w:rPr>
         <w:lastRenderedPageBreak/>
         <w:drawing>
@@ -603,37 +644,35 @@
     </w:p>
     <w:p>
       <w:pPr>
+        <w:keepNext w:val="0"/>
+        <w:keepLines w:val="0"/>
         <w:numPr>
           <w:ilvl w:val="0"/>
           <w:numId w:val="5"/>
         </w:numPr>
         <w:shd w:val="clear" w:color="auto" w:fill="FFFFFF"/>
-        <w:spacing w:after="240" w:line="360" w:lineRule="auto"/>
+        <w:spacing w:after="120" w:line="276" w:lineRule="auto" w:before="0"/>
         <w:ind w:right="100"/>
-        <w:jc w:val="both"/>
-        <w:rPr>
-          <w:rFonts w:ascii="Times New Roman" w:eastAsia="Times New Roman" w:hAnsi="Times New Roman" w:cs="Times New Roman"/>
-          <w:sz w:val="26"/>
-          <w:szCs w:val="26"/>
-          <w:highlight w:val="white"/>
-        </w:rPr>
-      </w:pPr>
-      <w:r>
-        <w:rPr>
-          <w:rFonts w:ascii="Times New Roman" w:eastAsia="Times New Roman" w:hAnsi="Times New Roman" w:cs="Times New Roman"/>
+        <w:jc w:val="left"/>
+        <w:rPr>
+          <w:rFonts w:ascii="Times New Roman" w:eastAsia="Times New Roman" w:hAnsi="Times New Roman" w:cs="Times New Roman"/>
+          <w:sz w:val="26"/>
+          <w:szCs w:val="26"/>
+          <w:highlight w:val="white"/>
+        </w:rPr>
+      </w:pPr>
+      <w:r>
+        <w:rPr>
+          <w:rFonts w:ascii="Arial" w:eastAsia="Arial" w:hAnsi="Arial" w:cs="Arial"/>
           <w:b/>
           <w:bCs/>
-          <w:sz w:val="26"/>
-          <w:szCs w:val="26"/>
           <w:highlight w:val="white"/>
         </w:rPr>
         <w:t>Tạo tệp tin văn bản:</w:t>
       </w:r>
       <w:r>
         <w:rPr>
-          <w:rFonts w:ascii="Times New Roman" w:eastAsia="Times New Roman" w:hAnsi="Times New Roman" w:cs="Times New Roman"/>
-          <w:sz w:val="26"/>
-          <w:szCs w:val="26"/>
+          <w:rFonts w:ascii="Arial" w:eastAsia="Arial" w:hAnsi="Arial" w:cs="Arial"/>
           <w:highlight w:val="white"/>
         </w:rPr>
         <w:t xml:space="preserve"> Nhấp chuột phải vào khoảng trống -&gt; New -&gt; Text Document. Đặt tên là GhiChu.txt. Nhấn Enter.</w:t>
@@ -641,22 +680,22 @@
     </w:p>
     <w:p>
       <w:pPr>
-        <w:shd w:val="clear" w:color="auto" w:fill="FFFFFF"/>
-        <w:spacing w:after="240" w:line="360" w:lineRule="auto"/>
+        <w:keepNext w:val="0"/>
+        <w:keepLines w:val="0"/>
+        <w:shd w:val="clear" w:color="auto" w:fill="FFFFFF"/>
+        <w:spacing w:after="40" w:line="240" w:lineRule="auto" w:before="0"/>
         <w:ind w:left="425" w:right="100" w:hanging="283"/>
-        <w:jc w:val="both"/>
-        <w:rPr>
-          <w:rFonts w:ascii="Times New Roman" w:eastAsia="Times New Roman" w:hAnsi="Times New Roman" w:cs="Times New Roman"/>
-          <w:sz w:val="26"/>
-          <w:szCs w:val="26"/>
-          <w:highlight w:val="white"/>
-        </w:rPr>
-      </w:pPr>
-      <w:r>
-        <w:rPr>
-          <w:rFonts w:ascii="Times New Roman" w:eastAsia="Times New Roman" w:hAnsi="Times New Roman" w:cs="Times New Roman"/>
-          <w:sz w:val="26"/>
-          <w:szCs w:val="26"/>
+        <w:jc w:val="left"/>
+        <w:rPr>
+          <w:rFonts w:ascii="Times New Roman" w:eastAsia="Times New Roman" w:hAnsi="Times New Roman" w:cs="Times New Roman"/>
+          <w:sz w:val="26"/>
+          <w:szCs w:val="26"/>
+          <w:highlight w:val="white"/>
+        </w:rPr>
+      </w:pPr>
+      <w:r>
+        <w:rPr>
+          <w:rFonts w:ascii="Arial" w:eastAsia="Arial" w:hAnsi="Arial" w:cs="Arial"/>
         </w:rPr>
         <w:drawing>
           <wp:inline distT="0" distB="0" distL="0" distR="0" wp14:anchorId="2A327754" wp14:editId="169824F7">
@@ -697,51 +736,51 @@
     </w:p>
     <w:p>
       <w:pPr>
-        <w:shd w:val="clear" w:color="auto" w:fill="FFFFFF"/>
-        <w:spacing w:after="240" w:line="360" w:lineRule="auto"/>
+        <w:keepNext w:val="0"/>
+        <w:keepLines w:val="0"/>
+        <w:shd w:val="clear" w:color="auto" w:fill="FFFFFF"/>
+        <w:spacing w:after="40" w:line="240" w:lineRule="auto" w:before="0"/>
         <w:ind w:left="425" w:right="100"/>
-        <w:jc w:val="both"/>
-        <w:rPr>
-          <w:rFonts w:ascii="Times New Roman" w:eastAsia="Times New Roman" w:hAnsi="Times New Roman" w:cs="Times New Roman"/>
-          <w:sz w:val="26"/>
-          <w:szCs w:val="26"/>
-          <w:highlight w:val="white"/>
-        </w:rPr>
-      </w:pPr>
-    </w:p>
-    <w:p>
-      <w:pPr>
+        <w:jc w:val="left"/>
+        <w:rPr>
+          <w:rFonts w:ascii="Times New Roman" w:eastAsia="Times New Roman" w:hAnsi="Times New Roman" w:cs="Times New Roman"/>
+          <w:sz w:val="26"/>
+          <w:szCs w:val="26"/>
+          <w:highlight w:val="white"/>
+        </w:rPr>
+      </w:pPr>
+    </w:p>
+    <w:p>
+      <w:pPr>
+        <w:keepNext w:val="0"/>
+        <w:keepLines w:val="0"/>
         <w:numPr>
           <w:ilvl w:val="0"/>
           <w:numId w:val="5"/>
         </w:numPr>
         <w:shd w:val="clear" w:color="auto" w:fill="FFFFFF"/>
-        <w:spacing w:after="240" w:line="360" w:lineRule="auto"/>
+        <w:spacing w:after="120" w:line="276" w:lineRule="auto" w:before="0"/>
         <w:ind w:right="100"/>
-        <w:jc w:val="both"/>
-        <w:rPr>
-          <w:rFonts w:ascii="Times New Roman" w:eastAsia="Times New Roman" w:hAnsi="Times New Roman" w:cs="Times New Roman"/>
-          <w:sz w:val="26"/>
-          <w:szCs w:val="26"/>
-          <w:highlight w:val="white"/>
-        </w:rPr>
-      </w:pPr>
-      <w:r>
-        <w:rPr>
-          <w:rFonts w:ascii="Times New Roman" w:eastAsia="Times New Roman" w:hAnsi="Times New Roman" w:cs="Times New Roman"/>
+        <w:jc w:val="left"/>
+        <w:rPr>
+          <w:rFonts w:ascii="Times New Roman" w:eastAsia="Times New Roman" w:hAnsi="Times New Roman" w:cs="Times New Roman"/>
+          <w:sz w:val="26"/>
+          <w:szCs w:val="26"/>
+          <w:highlight w:val="white"/>
+        </w:rPr>
+      </w:pPr>
+      <w:r>
+        <w:rPr>
+          <w:rFonts w:ascii="Arial" w:eastAsia="Arial" w:hAnsi="Arial" w:cs="Arial"/>
           <w:b/>
           <w:bCs/>
-          <w:sz w:val="26"/>
-          <w:szCs w:val="26"/>
           <w:highlight w:val="white"/>
         </w:rPr>
         <w:t>Đổi tên tệp tin:</w:t>
       </w:r>
       <w:r>
         <w:rPr>
-          <w:rFonts w:ascii="Times New Roman" w:eastAsia="Times New Roman" w:hAnsi="Times New Roman" w:cs="Times New Roman"/>
-          <w:sz w:val="26"/>
-          <w:szCs w:val="26"/>
+          <w:rFonts w:ascii="Arial" w:eastAsia="Arial" w:hAnsi="Arial" w:cs="Arial"/>
           <w:highlight w:val="white"/>
         </w:rPr>
         <w:t xml:space="preserve"> Nhấp chuột phải vào tệp GhiChu.txt -&gt; chọn Rename. Đổi tên thành GhiChuQuanTrong.txt. Nhấn Enter.</w:t>
@@ -749,36 +788,38 @@
     </w:p>
     <w:p>
       <w:pPr>
-        <w:shd w:val="clear" w:color="auto" w:fill="FFFFFF"/>
-        <w:spacing w:after="240" w:line="360" w:lineRule="auto"/>
+        <w:keepNext w:val="0"/>
+        <w:keepLines w:val="0"/>
+        <w:shd w:val="clear" w:color="auto" w:fill="FFFFFF"/>
+        <w:spacing w:after="40" w:line="240" w:lineRule="auto" w:before="0"/>
         <w:ind w:left="141" w:right="100"/>
-        <w:jc w:val="both"/>
-        <w:rPr>
-          <w:rFonts w:ascii="Times New Roman" w:eastAsia="Times New Roman" w:hAnsi="Times New Roman" w:cs="Times New Roman"/>
-          <w:sz w:val="26"/>
-          <w:szCs w:val="26"/>
-          <w:highlight w:val="white"/>
-        </w:rPr>
-      </w:pPr>
-    </w:p>
-    <w:p>
-      <w:pPr>
-        <w:shd w:val="clear" w:color="auto" w:fill="FFFFFF"/>
-        <w:spacing w:after="240" w:line="360" w:lineRule="auto"/>
+        <w:jc w:val="left"/>
+        <w:rPr>
+          <w:rFonts w:ascii="Times New Roman" w:eastAsia="Times New Roman" w:hAnsi="Times New Roman" w:cs="Times New Roman"/>
+          <w:sz w:val="26"/>
+          <w:szCs w:val="26"/>
+          <w:highlight w:val="white"/>
+        </w:rPr>
+      </w:pPr>
+    </w:p>
+    <w:p>
+      <w:pPr>
+        <w:keepNext w:val="0"/>
+        <w:keepLines w:val="0"/>
+        <w:shd w:val="clear" w:color="auto" w:fill="FFFFFF"/>
+        <w:spacing w:after="40" w:line="240" w:lineRule="auto" w:before="0"/>
         <w:ind w:left="141" w:right="100"/>
-        <w:jc w:val="both"/>
-        <w:rPr>
-          <w:rFonts w:ascii="Times New Roman" w:eastAsia="Times New Roman" w:hAnsi="Times New Roman" w:cs="Times New Roman"/>
-          <w:sz w:val="26"/>
-          <w:szCs w:val="26"/>
-          <w:highlight w:val="white"/>
-        </w:rPr>
-      </w:pPr>
-      <w:r>
-        <w:rPr>
-          <w:rFonts w:ascii="Times New Roman" w:eastAsia="Times New Roman" w:hAnsi="Times New Roman" w:cs="Times New Roman"/>
-          <w:sz w:val="26"/>
-          <w:szCs w:val="26"/>
+        <w:jc w:val="left"/>
+        <w:rPr>
+          <w:rFonts w:ascii="Times New Roman" w:eastAsia="Times New Roman" w:hAnsi="Times New Roman" w:cs="Times New Roman"/>
+          <w:sz w:val="26"/>
+          <w:szCs w:val="26"/>
+          <w:highlight w:val="white"/>
+        </w:rPr>
+      </w:pPr>
+      <w:r>
+        <w:rPr>
+          <w:rFonts w:ascii="Arial" w:eastAsia="Arial" w:hAnsi="Arial" w:cs="Arial"/>
         </w:rPr>
         <w:drawing>
           <wp:inline distT="0" distB="0" distL="0" distR="0" wp14:anchorId="447E084E" wp14:editId="596A3ABC">
@@ -818,6 +859,7 @@
       </w:r>
       <w:r>
         <w:rPr>
+          <w:rFonts w:ascii="Arial" w:hAnsi="Arial" w:eastAsia="Arial" w:cs="Arial"/>
           <w:noProof/>
           <w14:ligatures w14:val="standardContextual"/>
         </w:rPr>
@@ -825,9 +867,7 @@
       </w:r>
       <w:r>
         <w:rPr>
-          <w:rFonts w:ascii="Times New Roman" w:eastAsia="Times New Roman" w:hAnsi="Times New Roman" w:cs="Times New Roman"/>
-          <w:sz w:val="26"/>
-          <w:szCs w:val="26"/>
+          <w:rFonts w:ascii="Arial" w:eastAsia="Arial" w:hAnsi="Arial" w:cs="Arial"/>
         </w:rPr>
         <w:drawing>
           <wp:inline distT="0" distB="0" distL="0" distR="0" wp14:anchorId="4DFED26B" wp14:editId="703952AD">
@@ -868,50 +908,50 @@
     </w:p>
     <w:p>
       <w:pPr>
-        <w:shd w:val="clear" w:color="auto" w:fill="FFFFFF"/>
-        <w:spacing w:after="240" w:line="360" w:lineRule="auto"/>
+        <w:keepNext w:val="0"/>
+        <w:keepLines w:val="0"/>
+        <w:shd w:val="clear" w:color="auto" w:fill="FFFFFF"/>
+        <w:spacing w:after="40" w:line="240" w:lineRule="auto" w:before="0"/>
         <w:ind w:left="425"/>
-        <w:jc w:val="both"/>
-        <w:rPr>
-          <w:rFonts w:ascii="Times New Roman" w:eastAsia="Times New Roman" w:hAnsi="Times New Roman" w:cs="Times New Roman"/>
-          <w:sz w:val="26"/>
-          <w:szCs w:val="26"/>
-          <w:highlight w:val="white"/>
-        </w:rPr>
-      </w:pPr>
-    </w:p>
-    <w:p>
-      <w:pPr>
+        <w:jc w:val="left"/>
+        <w:rPr>
+          <w:rFonts w:ascii="Times New Roman" w:eastAsia="Times New Roman" w:hAnsi="Times New Roman" w:cs="Times New Roman"/>
+          <w:sz w:val="26"/>
+          <w:szCs w:val="26"/>
+          <w:highlight w:val="white"/>
+        </w:rPr>
+      </w:pPr>
+    </w:p>
+    <w:p>
+      <w:pPr>
+        <w:keepNext w:val="0"/>
+        <w:keepLines w:val="0"/>
         <w:numPr>
           <w:ilvl w:val="0"/>
           <w:numId w:val="5"/>
         </w:numPr>
         <w:shd w:val="clear" w:color="auto" w:fill="FFFFFF"/>
-        <w:spacing w:after="240" w:line="360" w:lineRule="auto"/>
-        <w:jc w:val="both"/>
-        <w:rPr>
-          <w:rFonts w:ascii="Times New Roman" w:eastAsia="Times New Roman" w:hAnsi="Times New Roman" w:cs="Times New Roman"/>
-          <w:sz w:val="26"/>
-          <w:szCs w:val="26"/>
-          <w:highlight w:val="white"/>
-        </w:rPr>
-      </w:pPr>
-      <w:r>
-        <w:rPr>
-          <w:rFonts w:ascii="Times New Roman" w:eastAsia="Times New Roman" w:hAnsi="Times New Roman" w:cs="Times New Roman"/>
+        <w:spacing w:after="120" w:line="276" w:lineRule="auto" w:before="0"/>
+        <w:jc w:val="left"/>
+        <w:rPr>
+          <w:rFonts w:ascii="Times New Roman" w:eastAsia="Times New Roman" w:hAnsi="Times New Roman" w:cs="Times New Roman"/>
+          <w:sz w:val="26"/>
+          <w:szCs w:val="26"/>
+          <w:highlight w:val="white"/>
+        </w:rPr>
+      </w:pPr>
+      <w:r>
+        <w:rPr>
+          <w:rFonts w:ascii="Arial" w:eastAsia="Arial" w:hAnsi="Arial" w:cs="Arial"/>
           <w:b/>
           <w:bCs/>
-          <w:sz w:val="26"/>
-          <w:szCs w:val="26"/>
           <w:highlight w:val="white"/>
         </w:rPr>
         <w:t>Tạo thư mục con:</w:t>
       </w:r>
       <w:r>
         <w:rPr>
-          <w:rFonts w:ascii="Times New Roman" w:eastAsia="Times New Roman" w:hAnsi="Times New Roman" w:cs="Times New Roman"/>
-          <w:sz w:val="26"/>
-          <w:szCs w:val="26"/>
+          <w:rFonts w:ascii="Arial" w:eastAsia="Arial" w:hAnsi="Arial" w:cs="Arial"/>
           <w:highlight w:val="white"/>
         </w:rPr>
         <w:t xml:space="preserve"> Trong thư mục ThucHanh_NguyenVanA, nhấp chuột phải -&gt; New -&gt; Folder. Đặt tên là TaiLieu.</w:t>
@@ -919,22 +959,22 @@
     </w:p>
     <w:p>
       <w:pPr>
-        <w:shd w:val="clear" w:color="auto" w:fill="FFFFFF"/>
-        <w:spacing w:after="240" w:line="360" w:lineRule="auto"/>
+        <w:keepNext w:val="0"/>
+        <w:keepLines w:val="0"/>
+        <w:shd w:val="clear" w:color="auto" w:fill="FFFFFF"/>
+        <w:spacing w:after="40" w:line="240" w:lineRule="auto" w:before="0"/>
         <w:ind w:left="141"/>
-        <w:jc w:val="both"/>
-        <w:rPr>
-          <w:rFonts w:ascii="Times New Roman" w:eastAsia="Times New Roman" w:hAnsi="Times New Roman" w:cs="Times New Roman"/>
-          <w:sz w:val="26"/>
-          <w:szCs w:val="26"/>
-          <w:highlight w:val="white"/>
-        </w:rPr>
-      </w:pPr>
-      <w:r>
-        <w:rPr>
-          <w:rFonts w:ascii="Times New Roman" w:eastAsia="Times New Roman" w:hAnsi="Times New Roman" w:cs="Times New Roman"/>
-          <w:sz w:val="26"/>
-          <w:szCs w:val="26"/>
+        <w:jc w:val="left"/>
+        <w:rPr>
+          <w:rFonts w:ascii="Times New Roman" w:eastAsia="Times New Roman" w:hAnsi="Times New Roman" w:cs="Times New Roman"/>
+          <w:sz w:val="26"/>
+          <w:szCs w:val="26"/>
+          <w:highlight w:val="white"/>
+        </w:rPr>
+      </w:pPr>
+      <w:r>
+        <w:rPr>
+          <w:rFonts w:ascii="Arial" w:eastAsia="Arial" w:hAnsi="Arial" w:cs="Arial"/>
         </w:rPr>
         <w:lastRenderedPageBreak/>
         <w:drawing>
@@ -976,54 +1016,62 @@
     </w:p>
     <w:p>
       <w:pPr>
-        <w:shd w:val="clear" w:color="auto" w:fill="FFFFFF"/>
-        <w:spacing w:after="240" w:line="360" w:lineRule="auto"/>
+        <w:keepNext w:val="0"/>
+        <w:keepLines w:val="0"/>
+        <w:shd w:val="clear" w:color="auto" w:fill="FFFFFF"/>
+        <w:spacing w:after="40" w:line="240" w:lineRule="auto" w:before="0"/>
         <w:ind w:left="425"/>
-        <w:jc w:val="both"/>
-        <w:rPr>
-          <w:rFonts w:ascii="Times New Roman" w:eastAsia="Times New Roman" w:hAnsi="Times New Roman" w:cs="Times New Roman"/>
-          <w:sz w:val="26"/>
-          <w:szCs w:val="26"/>
-          <w:highlight w:val="white"/>
-        </w:rPr>
-      </w:pPr>
-    </w:p>
-    <w:p>
-      <w:pPr>
-        <w:shd w:val="clear" w:color="auto" w:fill="FFFFFF"/>
-        <w:spacing w:after="240" w:line="360" w:lineRule="auto"/>
+        <w:jc w:val="left"/>
+        <w:rPr>
+          <w:rFonts w:ascii="Times New Roman" w:eastAsia="Times New Roman" w:hAnsi="Times New Roman" w:cs="Times New Roman"/>
+          <w:sz w:val="26"/>
+          <w:szCs w:val="26"/>
+          <w:highlight w:val="white"/>
+        </w:rPr>
+      </w:pPr>
+    </w:p>
+    <w:p>
+      <w:pPr>
+        <w:keepNext w:val="0"/>
+        <w:keepLines w:val="0"/>
+        <w:shd w:val="clear" w:color="auto" w:fill="FFFFFF"/>
+        <w:spacing w:after="40" w:line="240" w:lineRule="auto" w:before="0"/>
         <w:ind w:left="425"/>
-        <w:jc w:val="both"/>
-        <w:rPr>
-          <w:rFonts w:ascii="Times New Roman" w:eastAsia="Times New Roman" w:hAnsi="Times New Roman" w:cs="Times New Roman"/>
-          <w:sz w:val="26"/>
-          <w:szCs w:val="26"/>
-          <w:highlight w:val="white"/>
-        </w:rPr>
-      </w:pPr>
-    </w:p>
-    <w:p>
-      <w:pPr>
+        <w:jc w:val="left"/>
+        <w:rPr>
+          <w:rFonts w:ascii="Times New Roman" w:eastAsia="Times New Roman" w:hAnsi="Times New Roman" w:cs="Times New Roman"/>
+          <w:sz w:val="26"/>
+          <w:szCs w:val="26"/>
+          <w:highlight w:val="white"/>
+        </w:rPr>
+      </w:pPr>
+    </w:p>
+    <w:p>
+      <w:pPr>
+        <w:pStyle w:val="Heading3"/>
+        <w:keepNext w:val="0"/>
+        <w:keepLines w:val="0"/>
         <w:numPr>
           <w:ilvl w:val="0"/>
           <w:numId w:val="5"/>
         </w:numPr>
         <w:shd w:val="clear" w:color="auto" w:fill="FFFFFF"/>
-        <w:spacing w:line="360" w:lineRule="auto"/>
-        <w:jc w:val="both"/>
-        <w:rPr>
-          <w:rFonts w:ascii="Times New Roman" w:eastAsia="Times New Roman" w:hAnsi="Times New Roman" w:cs="Times New Roman"/>
-          <w:sz w:val="26"/>
-          <w:szCs w:val="26"/>
-          <w:highlight w:val="white"/>
-        </w:rPr>
-      </w:pPr>
-      <w:r>
-        <w:rPr>
-          <w:rFonts w:ascii="Times New Roman" w:eastAsia="Times New Roman" w:hAnsi="Times New Roman" w:cs="Times New Roman"/>
+        <w:spacing w:line="240" w:lineRule="auto" w:before="160" w:after="60"/>
+        <w:jc w:val="left"/>
+        <w:rPr>
+          <w:rFonts w:ascii="Times New Roman" w:eastAsia="Times New Roman" w:hAnsi="Times New Roman" w:cs="Times New Roman"/>
+          <w:sz w:val="26"/>
+          <w:szCs w:val="26"/>
+          <w:highlight w:val="white"/>
+        </w:rPr>
+      </w:pPr>
+      <w:r>
+        <w:rPr>
+          <w:rFonts w:ascii="Arial" w:eastAsia="Arial" w:hAnsi="Arial" w:cs="Arial"/>
           <w:b/>
           <w:bCs/>
-          <w:sz w:val="26"/>
+          <w:color w:val="0F766E"/>
+          <w:sz w:val="23"/>
           <w:szCs w:val="26"/>
           <w:highlight w:val="white"/>
         </w:rPr>
@@ -1032,25 +1080,25 @@
     </w:p>
     <w:p>
       <w:pPr>
+        <w:keepNext w:val="0"/>
+        <w:keepLines w:val="0"/>
         <w:numPr>
           <w:ilvl w:val="0"/>
           <w:numId w:val="6"/>
         </w:numPr>
         <w:shd w:val="clear" w:color="auto" w:fill="FFFFFF"/>
-        <w:spacing w:after="240" w:line="360" w:lineRule="auto"/>
-        <w:jc w:val="both"/>
-        <w:rPr>
-          <w:rFonts w:ascii="Times New Roman" w:eastAsia="Times New Roman" w:hAnsi="Times New Roman" w:cs="Times New Roman"/>
-          <w:sz w:val="26"/>
-          <w:szCs w:val="26"/>
-          <w:highlight w:val="white"/>
-        </w:rPr>
-      </w:pPr>
-      <w:r>
-        <w:rPr>
-          <w:rFonts w:ascii="Times New Roman" w:eastAsia="Times New Roman" w:hAnsi="Times New Roman" w:cs="Times New Roman"/>
-          <w:sz w:val="26"/>
-          <w:szCs w:val="26"/>
+        <w:spacing w:after="120" w:line="276" w:lineRule="auto" w:before="0"/>
+        <w:jc w:val="left"/>
+        <w:rPr>
+          <w:rFonts w:ascii="Times New Roman" w:eastAsia="Times New Roman" w:hAnsi="Times New Roman" w:cs="Times New Roman"/>
+          <w:sz w:val="26"/>
+          <w:szCs w:val="26"/>
+          <w:highlight w:val="white"/>
+        </w:rPr>
+      </w:pPr>
+      <w:r>
+        <w:rPr>
+          <w:rFonts w:ascii="Arial" w:eastAsia="Arial" w:hAnsi="Arial" w:cs="Arial"/>
           <w:highlight w:val="white"/>
         </w:rPr>
         <w:t>Nhấp chuột phải vào tệp GhiChuQuanTrong.txt -&gt; chọn Copy (hoặc chọn tệp rồi nhấn Ctrl + C).</w:t>
@@ -1058,22 +1106,22 @@
     </w:p>
     <w:p>
       <w:pPr>
-        <w:shd w:val="clear" w:color="auto" w:fill="FFFFFF"/>
-        <w:spacing w:after="240" w:line="360" w:lineRule="auto"/>
+        <w:keepNext w:val="0"/>
+        <w:keepLines w:val="0"/>
+        <w:shd w:val="clear" w:color="auto" w:fill="FFFFFF"/>
+        <w:spacing w:after="40" w:line="240" w:lineRule="auto" w:before="0"/>
         <w:ind w:left="141"/>
-        <w:jc w:val="both"/>
-        <w:rPr>
-          <w:rFonts w:ascii="Times New Roman" w:eastAsia="Times New Roman" w:hAnsi="Times New Roman" w:cs="Times New Roman"/>
-          <w:sz w:val="26"/>
-          <w:szCs w:val="26"/>
-          <w:highlight w:val="white"/>
-        </w:rPr>
-      </w:pPr>
-      <w:r>
-        <w:rPr>
-          <w:rFonts w:ascii="Times New Roman" w:eastAsia="Times New Roman" w:hAnsi="Times New Roman" w:cs="Times New Roman"/>
-          <w:sz w:val="26"/>
-          <w:szCs w:val="26"/>
+        <w:jc w:val="left"/>
+        <w:rPr>
+          <w:rFonts w:ascii="Times New Roman" w:eastAsia="Times New Roman" w:hAnsi="Times New Roman" w:cs="Times New Roman"/>
+          <w:sz w:val="26"/>
+          <w:szCs w:val="26"/>
+          <w:highlight w:val="white"/>
+        </w:rPr>
+      </w:pPr>
+      <w:r>
+        <w:rPr>
+          <w:rFonts w:ascii="Arial" w:eastAsia="Arial" w:hAnsi="Arial" w:cs="Arial"/>
         </w:rPr>
         <w:drawing>
           <wp:inline distT="0" distB="0" distL="0" distR="0" wp14:anchorId="3DA4D4EF" wp14:editId="38589C2E">
@@ -1114,25 +1162,25 @@
     </w:p>
     <w:p>
       <w:pPr>
+        <w:keepNext w:val="0"/>
+        <w:keepLines w:val="0"/>
         <w:numPr>
           <w:ilvl w:val="0"/>
           <w:numId w:val="4"/>
         </w:numPr>
         <w:shd w:val="clear" w:color="auto" w:fill="FFFFFF"/>
-        <w:spacing w:after="240" w:line="360" w:lineRule="auto"/>
-        <w:jc w:val="both"/>
-        <w:rPr>
-          <w:rFonts w:ascii="Times New Roman" w:eastAsia="Times New Roman" w:hAnsi="Times New Roman" w:cs="Times New Roman"/>
-          <w:sz w:val="26"/>
-          <w:szCs w:val="26"/>
-          <w:highlight w:val="white"/>
-        </w:rPr>
-      </w:pPr>
-      <w:r>
-        <w:rPr>
-          <w:rFonts w:ascii="Times New Roman" w:eastAsia="Times New Roman" w:hAnsi="Times New Roman" w:cs="Times New Roman"/>
-          <w:sz w:val="26"/>
-          <w:szCs w:val="26"/>
+        <w:spacing w:after="120" w:line="276" w:lineRule="auto" w:before="0"/>
+        <w:jc w:val="left"/>
+        <w:rPr>
+          <w:rFonts w:ascii="Times New Roman" w:eastAsia="Times New Roman" w:hAnsi="Times New Roman" w:cs="Times New Roman"/>
+          <w:sz w:val="26"/>
+          <w:szCs w:val="26"/>
+          <w:highlight w:val="white"/>
+        </w:rPr>
+      </w:pPr>
+      <w:r>
+        <w:rPr>
+          <w:rFonts w:ascii="Arial" w:eastAsia="Arial" w:hAnsi="Arial" w:cs="Arial"/>
           <w:highlight w:val="white"/>
         </w:rPr>
         <w:lastRenderedPageBreak/>
@@ -1141,22 +1189,22 @@
     </w:p>
     <w:p>
       <w:pPr>
-        <w:shd w:val="clear" w:color="auto" w:fill="FFFFFF"/>
-        <w:spacing w:after="240" w:line="360" w:lineRule="auto"/>
+        <w:keepNext w:val="0"/>
+        <w:keepLines w:val="0"/>
+        <w:shd w:val="clear" w:color="auto" w:fill="FFFFFF"/>
+        <w:spacing w:after="40" w:line="240" w:lineRule="auto" w:before="0"/>
         <w:ind w:left="141"/>
-        <w:jc w:val="both"/>
-        <w:rPr>
-          <w:rFonts w:ascii="Times New Roman" w:eastAsia="Times New Roman" w:hAnsi="Times New Roman" w:cs="Times New Roman"/>
-          <w:sz w:val="26"/>
-          <w:szCs w:val="26"/>
-          <w:highlight w:val="white"/>
-        </w:rPr>
-      </w:pPr>
-      <w:r>
-        <w:rPr>
-          <w:rFonts w:ascii="Times New Roman" w:eastAsia="Times New Roman" w:hAnsi="Times New Roman" w:cs="Times New Roman"/>
-          <w:sz w:val="26"/>
-          <w:szCs w:val="26"/>
+        <w:jc w:val="left"/>
+        <w:rPr>
+          <w:rFonts w:ascii="Times New Roman" w:eastAsia="Times New Roman" w:hAnsi="Times New Roman" w:cs="Times New Roman"/>
+          <w:sz w:val="26"/>
+          <w:szCs w:val="26"/>
+          <w:highlight w:val="white"/>
+        </w:rPr>
+      </w:pPr>
+      <w:r>
+        <w:rPr>
+          <w:rFonts w:ascii="Arial" w:eastAsia="Arial" w:hAnsi="Arial" w:cs="Arial"/>
         </w:rPr>
         <w:drawing>
           <wp:inline distT="0" distB="0" distL="0" distR="0" wp14:anchorId="2537AC21" wp14:editId="270A513E">
@@ -1197,26 +1245,30 @@
     </w:p>
     <w:p>
       <w:pPr>
+        <w:pStyle w:val="Heading3"/>
+        <w:keepNext w:val="0"/>
+        <w:keepLines w:val="0"/>
         <w:numPr>
           <w:ilvl w:val="0"/>
           <w:numId w:val="5"/>
         </w:numPr>
         <w:shd w:val="clear" w:color="auto" w:fill="FFFFFF"/>
-        <w:spacing w:line="360" w:lineRule="auto"/>
-        <w:jc w:val="both"/>
-        <w:rPr>
-          <w:rFonts w:ascii="Times New Roman" w:eastAsia="Times New Roman" w:hAnsi="Times New Roman" w:cs="Times New Roman"/>
-          <w:sz w:val="26"/>
-          <w:szCs w:val="26"/>
-          <w:highlight w:val="white"/>
-        </w:rPr>
-      </w:pPr>
-      <w:r>
-        <w:rPr>
-          <w:rFonts w:ascii="Times New Roman" w:eastAsia="Times New Roman" w:hAnsi="Times New Roman" w:cs="Times New Roman"/>
+        <w:spacing w:line="240" w:lineRule="auto" w:before="160" w:after="60"/>
+        <w:jc w:val="left"/>
+        <w:rPr>
+          <w:rFonts w:ascii="Times New Roman" w:eastAsia="Times New Roman" w:hAnsi="Times New Roman" w:cs="Times New Roman"/>
+          <w:sz w:val="26"/>
+          <w:szCs w:val="26"/>
+          <w:highlight w:val="white"/>
+        </w:rPr>
+      </w:pPr>
+      <w:r>
+        <w:rPr>
+          <w:rFonts w:ascii="Arial" w:eastAsia="Arial" w:hAnsi="Arial" w:cs="Arial"/>
           <w:b/>
           <w:bCs/>
-          <w:sz w:val="26"/>
+          <w:color w:val="0F766E"/>
+          <w:sz w:val="23"/>
           <w:szCs w:val="26"/>
           <w:highlight w:val="white"/>
         </w:rPr>
@@ -1225,25 +1277,25 @@
     </w:p>
     <w:p>
       <w:pPr>
+        <w:keepNext w:val="0"/>
+        <w:keepLines w:val="0"/>
         <w:numPr>
           <w:ilvl w:val="0"/>
           <w:numId w:val="3"/>
         </w:numPr>
         <w:shd w:val="clear" w:color="auto" w:fill="FFFFFF"/>
-        <w:spacing w:after="240" w:line="360" w:lineRule="auto"/>
-        <w:jc w:val="both"/>
-        <w:rPr>
-          <w:rFonts w:ascii="Times New Roman" w:eastAsia="Times New Roman" w:hAnsi="Times New Roman" w:cs="Times New Roman"/>
-          <w:sz w:val="26"/>
-          <w:szCs w:val="26"/>
-          <w:highlight w:val="white"/>
-        </w:rPr>
-      </w:pPr>
-      <w:r>
-        <w:rPr>
-          <w:rFonts w:ascii="Times New Roman" w:eastAsia="Times New Roman" w:hAnsi="Times New Roman" w:cs="Times New Roman"/>
-          <w:sz w:val="26"/>
-          <w:szCs w:val="26"/>
+        <w:spacing w:after="120" w:line="276" w:lineRule="auto" w:before="0"/>
+        <w:jc w:val="left"/>
+        <w:rPr>
+          <w:rFonts w:ascii="Times New Roman" w:eastAsia="Times New Roman" w:hAnsi="Times New Roman" w:cs="Times New Roman"/>
+          <w:sz w:val="26"/>
+          <w:szCs w:val="26"/>
+          <w:highlight w:val="white"/>
+        </w:rPr>
+      </w:pPr>
+      <w:r>
+        <w:rPr>
+          <w:rFonts w:ascii="Arial" w:eastAsia="Arial" w:hAnsi="Arial" w:cs="Arial"/>
           <w:highlight w:val="white"/>
         </w:rPr>
         <w:t>Quay lại thư mục ThucHanh_NguyenVanA. Tạo một tệp mới tên là DiChuyen.txt.</w:t>
@@ -1251,22 +1303,22 @@
     </w:p>
     <w:p>
       <w:pPr>
-        <w:shd w:val="clear" w:color="auto" w:fill="FFFFFF"/>
-        <w:spacing w:after="240" w:line="360" w:lineRule="auto"/>
+        <w:keepNext w:val="0"/>
+        <w:keepLines w:val="0"/>
+        <w:shd w:val="clear" w:color="auto" w:fill="FFFFFF"/>
+        <w:spacing w:after="40" w:line="240" w:lineRule="auto" w:before="0"/>
         <w:ind w:left="141"/>
-        <w:jc w:val="both"/>
-        <w:rPr>
-          <w:rFonts w:ascii="Times New Roman" w:eastAsia="Times New Roman" w:hAnsi="Times New Roman" w:cs="Times New Roman"/>
-          <w:sz w:val="26"/>
-          <w:szCs w:val="26"/>
-          <w:highlight w:val="white"/>
-        </w:rPr>
-      </w:pPr>
-      <w:r>
-        <w:rPr>
-          <w:rFonts w:ascii="Times New Roman" w:eastAsia="Times New Roman" w:hAnsi="Times New Roman" w:cs="Times New Roman"/>
-          <w:sz w:val="26"/>
-          <w:szCs w:val="26"/>
+        <w:jc w:val="left"/>
+        <w:rPr>
+          <w:rFonts w:ascii="Times New Roman" w:eastAsia="Times New Roman" w:hAnsi="Times New Roman" w:cs="Times New Roman"/>
+          <w:sz w:val="26"/>
+          <w:szCs w:val="26"/>
+          <w:highlight w:val="white"/>
+        </w:rPr>
+      </w:pPr>
+      <w:r>
+        <w:rPr>
+          <w:rFonts w:ascii="Arial" w:eastAsia="Arial" w:hAnsi="Arial" w:cs="Arial"/>
         </w:rPr>
         <w:drawing>
           <wp:inline distT="0" distB="0" distL="0" distR="0" wp14:anchorId="66258CCA" wp14:editId="179AEB88">
@@ -1307,25 +1359,25 @@
     </w:p>
     <w:p>
       <w:pPr>
+        <w:keepNext w:val="0"/>
+        <w:keepLines w:val="0"/>
         <w:numPr>
           <w:ilvl w:val="0"/>
           <w:numId w:val="1"/>
         </w:numPr>
         <w:shd w:val="clear" w:color="auto" w:fill="FFFFFF"/>
-        <w:spacing w:after="240" w:line="360" w:lineRule="auto"/>
-        <w:jc w:val="both"/>
-        <w:rPr>
-          <w:rFonts w:ascii="Times New Roman" w:eastAsia="Times New Roman" w:hAnsi="Times New Roman" w:cs="Times New Roman"/>
-          <w:sz w:val="26"/>
-          <w:szCs w:val="26"/>
-          <w:highlight w:val="white"/>
-        </w:rPr>
-      </w:pPr>
-      <w:r>
-        <w:rPr>
-          <w:rFonts w:ascii="Times New Roman" w:eastAsia="Times New Roman" w:hAnsi="Times New Roman" w:cs="Times New Roman"/>
-          <w:sz w:val="26"/>
-          <w:szCs w:val="26"/>
+        <w:spacing w:after="120" w:line="276" w:lineRule="auto" w:before="0"/>
+        <w:jc w:val="left"/>
+        <w:rPr>
+          <w:rFonts w:ascii="Times New Roman" w:eastAsia="Times New Roman" w:hAnsi="Times New Roman" w:cs="Times New Roman"/>
+          <w:sz w:val="26"/>
+          <w:szCs w:val="26"/>
+          <w:highlight w:val="white"/>
+        </w:rPr>
+      </w:pPr>
+      <w:r>
+        <w:rPr>
+          <w:rFonts w:ascii="Arial" w:eastAsia="Arial" w:hAnsi="Arial" w:cs="Arial"/>
           <w:highlight w:val="white"/>
         </w:rPr>
         <w:lastRenderedPageBreak/>
@@ -1334,22 +1386,22 @@
     </w:p>
     <w:p>
       <w:pPr>
-        <w:shd w:val="clear" w:color="auto" w:fill="FFFFFF"/>
-        <w:spacing w:after="240" w:line="360" w:lineRule="auto"/>
+        <w:keepNext w:val="0"/>
+        <w:keepLines w:val="0"/>
+        <w:shd w:val="clear" w:color="auto" w:fill="FFFFFF"/>
+        <w:spacing w:after="40" w:line="240" w:lineRule="auto" w:before="0"/>
         <w:ind w:left="141"/>
-        <w:jc w:val="both"/>
-        <w:rPr>
-          <w:rFonts w:ascii="Times New Roman" w:eastAsia="Times New Roman" w:hAnsi="Times New Roman" w:cs="Times New Roman"/>
-          <w:sz w:val="26"/>
-          <w:szCs w:val="26"/>
-          <w:highlight w:val="white"/>
-        </w:rPr>
-      </w:pPr>
-      <w:r>
-        <w:rPr>
-          <w:rFonts w:ascii="Times New Roman" w:eastAsia="Times New Roman" w:hAnsi="Times New Roman" w:cs="Times New Roman"/>
-          <w:sz w:val="26"/>
-          <w:szCs w:val="26"/>
+        <w:jc w:val="left"/>
+        <w:rPr>
+          <w:rFonts w:ascii="Times New Roman" w:eastAsia="Times New Roman" w:hAnsi="Times New Roman" w:cs="Times New Roman"/>
+          <w:sz w:val="26"/>
+          <w:szCs w:val="26"/>
+          <w:highlight w:val="white"/>
+        </w:rPr>
+      </w:pPr>
+      <w:r>
+        <w:rPr>
+          <w:rFonts w:ascii="Arial" w:eastAsia="Arial" w:hAnsi="Arial" w:cs="Arial"/>
         </w:rPr>
         <w:drawing>
           <wp:inline distT="0" distB="0" distL="0" distR="0" wp14:anchorId="07639C74" wp14:editId="5BF1641C">
@@ -1390,25 +1442,25 @@
     </w:p>
     <w:p>
       <w:pPr>
+        <w:keepNext w:val="0"/>
+        <w:keepLines w:val="0"/>
         <w:numPr>
           <w:ilvl w:val="0"/>
           <w:numId w:val="2"/>
         </w:numPr>
         <w:shd w:val="clear" w:color="auto" w:fill="FFFFFF"/>
-        <w:spacing w:after="240" w:line="360" w:lineRule="auto"/>
-        <w:jc w:val="both"/>
-        <w:rPr>
-          <w:rFonts w:ascii="Times New Roman" w:eastAsia="Times New Roman" w:hAnsi="Times New Roman" w:cs="Times New Roman"/>
-          <w:sz w:val="26"/>
-          <w:szCs w:val="26"/>
-          <w:highlight w:val="white"/>
-        </w:rPr>
-      </w:pPr>
-      <w:r>
-        <w:rPr>
-          <w:rFonts w:ascii="Times New Roman" w:eastAsia="Times New Roman" w:hAnsi="Times New Roman" w:cs="Times New Roman"/>
-          <w:sz w:val="26"/>
-          <w:szCs w:val="26"/>
+        <w:spacing w:after="120" w:line="276" w:lineRule="auto" w:before="0"/>
+        <w:jc w:val="left"/>
+        <w:rPr>
+          <w:rFonts w:ascii="Times New Roman" w:eastAsia="Times New Roman" w:hAnsi="Times New Roman" w:cs="Times New Roman"/>
+          <w:sz w:val="26"/>
+          <w:szCs w:val="26"/>
+          <w:highlight w:val="white"/>
+        </w:rPr>
+      </w:pPr>
+      <w:r>
+        <w:rPr>
+          <w:rFonts w:ascii="Arial" w:eastAsia="Arial" w:hAnsi="Arial" w:cs="Arial"/>
           <w:highlight w:val="white"/>
         </w:rPr>
         <w:t>Nhấp đúp vào thư mục TaiLieu, nhấp chuột phải vào khoảng trống -&gt; chọn Paste (hoặc nhấn Ctrl + V). Tệp gốc đã biến mất khỏi vị trí cũ và chỉ còn ở vị trí mới.</w:t>
@@ -1416,22 +1468,22 @@
     </w:p>
     <w:p>
       <w:pPr>
-        <w:shd w:val="clear" w:color="auto" w:fill="FFFFFF"/>
-        <w:spacing w:after="240" w:line="360" w:lineRule="auto"/>
+        <w:keepNext w:val="0"/>
+        <w:keepLines w:val="0"/>
+        <w:shd w:val="clear" w:color="auto" w:fill="FFFFFF"/>
+        <w:spacing w:after="40" w:line="240" w:lineRule="auto" w:before="0"/>
         <w:ind w:left="141"/>
-        <w:jc w:val="both"/>
-        <w:rPr>
-          <w:rFonts w:ascii="Times New Roman" w:eastAsia="Times New Roman" w:hAnsi="Times New Roman" w:cs="Times New Roman"/>
-          <w:sz w:val="26"/>
-          <w:szCs w:val="26"/>
-          <w:highlight w:val="white"/>
-        </w:rPr>
-      </w:pPr>
-      <w:r>
-        <w:rPr>
-          <w:rFonts w:ascii="Times New Roman" w:eastAsia="Times New Roman" w:hAnsi="Times New Roman" w:cs="Times New Roman"/>
-          <w:sz w:val="26"/>
-          <w:szCs w:val="26"/>
+        <w:jc w:val="left"/>
+        <w:rPr>
+          <w:rFonts w:ascii="Times New Roman" w:eastAsia="Times New Roman" w:hAnsi="Times New Roman" w:cs="Times New Roman"/>
+          <w:sz w:val="26"/>
+          <w:szCs w:val="26"/>
+          <w:highlight w:val="white"/>
+        </w:rPr>
+      </w:pPr>
+      <w:r>
+        <w:rPr>
+          <w:rFonts w:ascii="Arial" w:eastAsia="Arial" w:hAnsi="Arial" w:cs="Arial"/>
         </w:rPr>
         <w:lastRenderedPageBreak/>
         <w:drawing>
@@ -1472,6 +1524,7 @@
       </w:r>
       <w:r>
         <w:rPr>
+          <w:rFonts w:ascii="Arial" w:hAnsi="Arial" w:eastAsia="Arial" w:cs="Arial"/>
           <w:noProof/>
           <w14:ligatures w14:val="standardContextual"/>
         </w:rPr>
@@ -1479,9 +1532,7 @@
       </w:r>
       <w:r>
         <w:rPr>
-          <w:rFonts w:ascii="Times New Roman" w:eastAsia="Times New Roman" w:hAnsi="Times New Roman" w:cs="Times New Roman"/>
-          <w:sz w:val="26"/>
-          <w:szCs w:val="26"/>
+          <w:rFonts w:ascii="Arial" w:eastAsia="Arial" w:hAnsi="Arial" w:cs="Arial"/>
         </w:rPr>
         <w:drawing>
           <wp:inline distT="0" distB="0" distL="0" distR="0" wp14:anchorId="4B035759" wp14:editId="4879DC9F">
@@ -1522,62 +1573,64 @@
     </w:p>
     <w:p>
       <w:pPr>
-        <w:shd w:val="clear" w:color="auto" w:fill="FFFFFF"/>
-        <w:spacing w:after="240" w:line="360" w:lineRule="auto"/>
-        <w:jc w:val="both"/>
-        <w:rPr>
-          <w:rFonts w:ascii="Times New Roman" w:eastAsia="Times New Roman" w:hAnsi="Times New Roman" w:cs="Times New Roman"/>
-          <w:sz w:val="26"/>
-          <w:szCs w:val="26"/>
-          <w:highlight w:val="white"/>
-        </w:rPr>
-      </w:pPr>
-    </w:p>
-    <w:p>
-      <w:pPr>
-        <w:shd w:val="clear" w:color="auto" w:fill="FFFFFF"/>
-        <w:spacing w:after="240" w:line="360" w:lineRule="auto"/>
-        <w:jc w:val="both"/>
-        <w:rPr>
-          <w:rFonts w:ascii="Times New Roman" w:eastAsia="Times New Roman" w:hAnsi="Times New Roman" w:cs="Times New Roman"/>
-          <w:sz w:val="26"/>
-          <w:szCs w:val="26"/>
-          <w:highlight w:val="white"/>
-        </w:rPr>
-      </w:pPr>
-    </w:p>
-    <w:p>
-      <w:pPr>
+        <w:keepNext w:val="0"/>
+        <w:keepLines w:val="0"/>
+        <w:shd w:val="clear" w:color="auto" w:fill="FFFFFF"/>
+        <w:spacing w:after="40" w:line="240" w:lineRule="auto" w:before="0"/>
+        <w:jc w:val="left"/>
+        <w:rPr>
+          <w:rFonts w:ascii="Times New Roman" w:eastAsia="Times New Roman" w:hAnsi="Times New Roman" w:cs="Times New Roman"/>
+          <w:sz w:val="26"/>
+          <w:szCs w:val="26"/>
+          <w:highlight w:val="white"/>
+        </w:rPr>
+      </w:pPr>
+    </w:p>
+    <w:p>
+      <w:pPr>
+        <w:keepNext w:val="0"/>
+        <w:keepLines w:val="0"/>
+        <w:shd w:val="clear" w:color="auto" w:fill="FFFFFF"/>
+        <w:spacing w:after="40" w:line="240" w:lineRule="auto" w:before="0"/>
+        <w:jc w:val="left"/>
+        <w:rPr>
+          <w:rFonts w:ascii="Times New Roman" w:eastAsia="Times New Roman" w:hAnsi="Times New Roman" w:cs="Times New Roman"/>
+          <w:sz w:val="26"/>
+          <w:szCs w:val="26"/>
+          <w:highlight w:val="white"/>
+        </w:rPr>
+      </w:pPr>
+    </w:p>
+    <w:p>
+      <w:pPr>
+        <w:keepNext w:val="0"/>
+        <w:keepLines w:val="0"/>
         <w:numPr>
           <w:ilvl w:val="0"/>
           <w:numId w:val="5"/>
         </w:numPr>
         <w:shd w:val="clear" w:color="auto" w:fill="FFFFFF"/>
-        <w:spacing w:after="240" w:line="360" w:lineRule="auto"/>
-        <w:jc w:val="both"/>
-        <w:rPr>
-          <w:rFonts w:ascii="Times New Roman" w:eastAsia="Times New Roman" w:hAnsi="Times New Roman" w:cs="Times New Roman"/>
-          <w:sz w:val="26"/>
-          <w:szCs w:val="26"/>
-          <w:highlight w:val="white"/>
-        </w:rPr>
-      </w:pPr>
-      <w:r>
-        <w:rPr>
-          <w:rFonts w:ascii="Times New Roman" w:eastAsia="Times New Roman" w:hAnsi="Times New Roman" w:cs="Times New Roman"/>
+        <w:spacing w:after="120" w:line="276" w:lineRule="auto" w:before="0"/>
+        <w:jc w:val="left"/>
+        <w:rPr>
+          <w:rFonts w:ascii="Times New Roman" w:eastAsia="Times New Roman" w:hAnsi="Times New Roman" w:cs="Times New Roman"/>
+          <w:sz w:val="26"/>
+          <w:szCs w:val="26"/>
+          <w:highlight w:val="white"/>
+        </w:rPr>
+      </w:pPr>
+      <w:r>
+        <w:rPr>
+          <w:rFonts w:ascii="Arial" w:eastAsia="Arial" w:hAnsi="Arial" w:cs="Arial"/>
           <w:b/>
           <w:bCs/>
-          <w:sz w:val="26"/>
-          <w:szCs w:val="26"/>
           <w:highlight w:val="white"/>
         </w:rPr>
         <w:t>Xóa tệp tin:</w:t>
       </w:r>
       <w:r>
         <w:rPr>
-          <w:rFonts w:ascii="Times New Roman" w:eastAsia="Times New Roman" w:hAnsi="Times New Roman" w:cs="Times New Roman"/>
-          <w:sz w:val="26"/>
-          <w:szCs w:val="26"/>
+          <w:rFonts w:ascii="Arial" w:eastAsia="Arial" w:hAnsi="Arial" w:cs="Arial"/>
           <w:highlight w:val="white"/>
         </w:rPr>
         <w:t xml:space="preserve"> Trong thư mục TaiLieu, nhấp chuột phải vào tệp GhiChuQuanTrong.txt -&gt; chọn Delete. Tệp sẽ được chuyển vào Thùng rác (Recycle Bin).</w:t>
@@ -1585,10 +1638,12 @@
     </w:p>
     <w:p>
       <w:pPr>
-        <w:shd w:val="clear" w:color="auto" w:fill="FFFFFF"/>
-        <w:spacing w:after="240" w:line="360" w:lineRule="auto"/>
+        <w:keepNext w:val="0"/>
+        <w:keepLines w:val="0"/>
+        <w:shd w:val="clear" w:color="auto" w:fill="FFFFFF"/>
+        <w:spacing w:after="40" w:line="240" w:lineRule="auto" w:before="0"/>
         <w:ind w:left="141"/>
-        <w:jc w:val="both"/>
+        <w:jc w:val="left"/>
         <w:rPr>
           <w:rFonts w:ascii="Times New Roman" w:eastAsia="Times New Roman" w:hAnsi="Times New Roman" w:cs="Times New Roman"/>
           <w:b/>
@@ -1600,11 +1655,9 @@
       </w:pPr>
       <w:r>
         <w:rPr>
-          <w:rFonts w:ascii="Times New Roman" w:eastAsia="Times New Roman" w:hAnsi="Times New Roman" w:cs="Times New Roman"/>
+          <w:rFonts w:ascii="Arial" w:eastAsia="Arial" w:hAnsi="Arial" w:cs="Arial"/>
           <w:b/>
           <w:bCs/>
-          <w:sz w:val="26"/>
-          <w:szCs w:val="26"/>
         </w:rPr>
         <w:lastRenderedPageBreak/>
         <w:drawing>
@@ -1646,36 +1699,34 @@
     </w:p>
     <w:p>
       <w:pPr>
+        <w:keepNext w:val="0"/>
+        <w:keepLines w:val="0"/>
         <w:numPr>
           <w:ilvl w:val="0"/>
           <w:numId w:val="5"/>
         </w:numPr>
         <w:shd w:val="clear" w:color="auto" w:fill="FFFFFF"/>
-        <w:spacing w:after="240" w:line="360" w:lineRule="auto"/>
-        <w:jc w:val="both"/>
-        <w:rPr>
-          <w:rFonts w:ascii="Times New Roman" w:eastAsia="Times New Roman" w:hAnsi="Times New Roman" w:cs="Times New Roman"/>
-          <w:sz w:val="26"/>
-          <w:szCs w:val="26"/>
-          <w:highlight w:val="white"/>
-        </w:rPr>
-      </w:pPr>
-      <w:r>
-        <w:rPr>
-          <w:rFonts w:ascii="Times New Roman" w:eastAsia="Times New Roman" w:hAnsi="Times New Roman" w:cs="Times New Roman"/>
+        <w:spacing w:after="120" w:line="276" w:lineRule="auto" w:before="0"/>
+        <w:jc w:val="left"/>
+        <w:rPr>
+          <w:rFonts w:ascii="Times New Roman" w:eastAsia="Times New Roman" w:hAnsi="Times New Roman" w:cs="Times New Roman"/>
+          <w:sz w:val="26"/>
+          <w:szCs w:val="26"/>
+          <w:highlight w:val="white"/>
+        </w:rPr>
+      </w:pPr>
+      <w:r>
+        <w:rPr>
+          <w:rFonts w:ascii="Arial" w:eastAsia="Arial" w:hAnsi="Arial" w:cs="Arial"/>
           <w:b/>
           <w:bCs/>
-          <w:sz w:val="26"/>
-          <w:szCs w:val="26"/>
           <w:highlight w:val="white"/>
         </w:rPr>
         <w:t>Xóa vĩnh viễn:</w:t>
       </w:r>
       <w:r>
         <w:rPr>
-          <w:rFonts w:ascii="Times New Roman" w:eastAsia="Times New Roman" w:hAnsi="Times New Roman" w:cs="Times New Roman"/>
-          <w:sz w:val="26"/>
-          <w:szCs w:val="26"/>
+          <w:rFonts w:ascii="Arial" w:eastAsia="Arial" w:hAnsi="Arial" w:cs="Arial"/>
           <w:highlight w:val="white"/>
         </w:rPr>
         <w:t xml:space="preserve"> Chọn tệp DiChuyen.txt, nhấn giữ phím Shift và nhấn phím Delete. Một cảnh báo sẽ hiện ra. Nếu đồng ý, tệp sẽ bị xóa vĩnh viễn mà không qua Thùng rác.</w:t>
@@ -1683,22 +1734,22 @@
     </w:p>
     <w:p>
       <w:pPr>
-        <w:shd w:val="clear" w:color="auto" w:fill="FFFFFF"/>
-        <w:spacing w:after="240" w:line="360" w:lineRule="auto"/>
+        <w:keepNext w:val="0"/>
+        <w:keepLines w:val="0"/>
+        <w:shd w:val="clear" w:color="auto" w:fill="FFFFFF"/>
+        <w:spacing w:after="40" w:line="240" w:lineRule="auto" w:before="0"/>
         <w:ind w:left="141"/>
-        <w:jc w:val="both"/>
-        <w:rPr>
-          <w:rFonts w:ascii="Times New Roman" w:eastAsia="Times New Roman" w:hAnsi="Times New Roman" w:cs="Times New Roman"/>
-          <w:sz w:val="26"/>
-          <w:szCs w:val="26"/>
-          <w:highlight w:val="white"/>
-        </w:rPr>
-      </w:pPr>
-      <w:r>
-        <w:rPr>
-          <w:rFonts w:ascii="Times New Roman" w:eastAsia="Times New Roman" w:hAnsi="Times New Roman" w:cs="Times New Roman"/>
-          <w:sz w:val="26"/>
-          <w:szCs w:val="26"/>
+        <w:jc w:val="left"/>
+        <w:rPr>
+          <w:rFonts w:ascii="Times New Roman" w:eastAsia="Times New Roman" w:hAnsi="Times New Roman" w:cs="Times New Roman"/>
+          <w:sz w:val="26"/>
+          <w:szCs w:val="26"/>
+          <w:highlight w:val="white"/>
+        </w:rPr>
+      </w:pPr>
+      <w:r>
+        <w:rPr>
+          <w:rFonts w:ascii="Arial" w:eastAsia="Arial" w:hAnsi="Arial" w:cs="Arial"/>
         </w:rPr>
         <w:drawing>
           <wp:inline distT="0" distB="0" distL="0" distR="0" wp14:anchorId="195C02FB" wp14:editId="4777A197">
@@ -1739,36 +1790,34 @@
     </w:p>
     <w:p>
       <w:pPr>
+        <w:keepNext w:val="0"/>
+        <w:keepLines w:val="0"/>
         <w:numPr>
           <w:ilvl w:val="0"/>
           <w:numId w:val="5"/>
         </w:numPr>
         <w:shd w:val="clear" w:color="auto" w:fill="FFFFFF"/>
-        <w:spacing w:after="240" w:line="360" w:lineRule="auto"/>
-        <w:jc w:val="both"/>
-        <w:rPr>
-          <w:rFonts w:ascii="Times New Roman" w:eastAsia="Times New Roman" w:hAnsi="Times New Roman" w:cs="Times New Roman"/>
-          <w:sz w:val="26"/>
-          <w:szCs w:val="26"/>
-          <w:highlight w:val="white"/>
-        </w:rPr>
-      </w:pPr>
-      <w:r>
-        <w:rPr>
-          <w:rFonts w:ascii="Times New Roman" w:eastAsia="Times New Roman" w:hAnsi="Times New Roman" w:cs="Times New Roman"/>
+        <w:spacing w:after="120" w:line="276" w:lineRule="auto" w:before="0"/>
+        <w:jc w:val="left"/>
+        <w:rPr>
+          <w:rFonts w:ascii="Times New Roman" w:eastAsia="Times New Roman" w:hAnsi="Times New Roman" w:cs="Times New Roman"/>
+          <w:sz w:val="26"/>
+          <w:szCs w:val="26"/>
+          <w:highlight w:val="white"/>
+        </w:rPr>
+      </w:pPr>
+      <w:r>
+        <w:rPr>
+          <w:rFonts w:ascii="Arial" w:eastAsia="Arial" w:hAnsi="Arial" w:cs="Arial"/>
           <w:b/>
           <w:bCs/>
-          <w:sz w:val="26"/>
-          <w:szCs w:val="26"/>
           <w:highlight w:val="white"/>
         </w:rPr>
         <w:t xml:space="preserve">Khôi phục từ Thùng rác (Tùy chọn): </w:t>
       </w:r>
       <w:r>
         <w:rPr>
-          <w:rFonts w:ascii="Times New Roman" w:eastAsia="Times New Roman" w:hAnsi="Times New Roman" w:cs="Times New Roman"/>
-          <w:sz w:val="26"/>
-          <w:szCs w:val="26"/>
+          <w:rFonts w:ascii="Arial" w:eastAsia="Arial" w:hAnsi="Arial" w:cs="Arial"/>
           <w:highlight w:val="white"/>
         </w:rPr>
         <w:t>Tìm biểu tượng Recycle Bin trên màn hình nền, nhấp đúp để mở. Tìm tệp GhiChuQuanTrong.txt đã xóa, nhấp chuột phải vào nó và chọn Restore. Tệp sẽ quay trở lại vị trí ban đầu.</w:t>
@@ -1776,22 +1825,22 @@
     </w:p>
     <w:p>
       <w:pPr>
-        <w:shd w:val="clear" w:color="auto" w:fill="FFFFFF"/>
-        <w:spacing w:after="240" w:line="360" w:lineRule="auto"/>
+        <w:keepNext w:val="0"/>
+        <w:keepLines w:val="0"/>
+        <w:shd w:val="clear" w:color="auto" w:fill="FFFFFF"/>
+        <w:spacing w:after="40" w:line="240" w:lineRule="auto" w:before="0"/>
         <w:ind w:left="141"/>
-        <w:jc w:val="both"/>
-        <w:rPr>
-          <w:rFonts w:ascii="Times New Roman" w:eastAsia="Times New Roman" w:hAnsi="Times New Roman" w:cs="Times New Roman"/>
-          <w:sz w:val="26"/>
-          <w:szCs w:val="26"/>
-          <w:highlight w:val="white"/>
-        </w:rPr>
-      </w:pPr>
-      <w:r>
-        <w:rPr>
-          <w:rFonts w:ascii="Times New Roman" w:eastAsia="Times New Roman" w:hAnsi="Times New Roman" w:cs="Times New Roman"/>
-          <w:sz w:val="26"/>
-          <w:szCs w:val="26"/>
+        <w:jc w:val="left"/>
+        <w:rPr>
+          <w:rFonts w:ascii="Times New Roman" w:eastAsia="Times New Roman" w:hAnsi="Times New Roman" w:cs="Times New Roman"/>
+          <w:sz w:val="26"/>
+          <w:szCs w:val="26"/>
+          <w:highlight w:val="white"/>
+        </w:rPr>
+      </w:pPr>
+      <w:r>
+        <w:rPr>
+          <w:rFonts w:ascii="Arial" w:eastAsia="Arial" w:hAnsi="Arial" w:cs="Arial"/>
         </w:rPr>
         <w:lastRenderedPageBreak/>
         <w:drawing>
@@ -1832,6 +1881,7 @@
       </w:r>
       <w:r>
         <w:rPr>
+          <w:rFonts w:ascii="Arial" w:hAnsi="Arial" w:eastAsia="Arial" w:cs="Arial"/>
           <w:noProof/>
           <w14:ligatures w14:val="standardContextual"/>
         </w:rPr>
@@ -1839,9 +1889,7 @@
       </w:r>
       <w:r>
         <w:rPr>
-          <w:rFonts w:ascii="Times New Roman" w:eastAsia="Times New Roman" w:hAnsi="Times New Roman" w:cs="Times New Roman"/>
-          <w:sz w:val="26"/>
-          <w:szCs w:val="26"/>
+          <w:rFonts w:ascii="Arial" w:eastAsia="Arial" w:hAnsi="Arial" w:cs="Arial"/>
         </w:rPr>
         <w:drawing>
           <wp:inline distT="0" distB="0" distL="0" distR="0" wp14:anchorId="565EF65A" wp14:editId="6E57C24F">
@@ -1882,8 +1930,10 @@
     </w:p>
     <w:p>
       <w:pPr>
-        <w:spacing w:line="360" w:lineRule="auto"/>
-        <w:jc w:val="both"/>
+        <w:keepNext w:val="0"/>
+        <w:keepLines w:val="0"/>
+        <w:spacing w:line="240" w:lineRule="auto" w:before="0" w:after="40"/>
+        <w:jc w:val="left"/>
         <w:rPr>
           <w:rFonts w:ascii="Times New Roman" w:eastAsia="Times New Roman" w:hAnsi="Times New Roman" w:cs="Times New Roman"/>
           <w:b/>
@@ -1894,10 +1944,17 @@
         </w:rPr>
       </w:pPr>
     </w:p>
-    <w:p/>
+    <w:p>
+      <w:pPr>
+        <w:keepNext w:val="0"/>
+        <w:keepLines w:val="0"/>
+        <w:spacing w:before="0" w:after="40" w:line="240" w:lineRule="auto"/>
+        <w:jc w:val="left"/>
+      </w:pPr>
+    </w:p>
     <w:sectPr>
-      <w:pgSz w:w="11909" w:h="16834"/>
-      <w:pgMar w:top="1440" w:right="1440" w:bottom="1440" w:left="1440" w:header="720" w:footer="720" w:gutter="0"/>
+      <w:pgSz w:w="11906" w:h="16838"/>
+      <w:pgMar w:top="1134" w:right="1134" w:bottom="1134" w:left="1134" w:header="567" w:footer="567" w:gutter="0"/>
       <w:pgNumType w:start="1"/>
       <w:cols w:space="720"/>
     </w:sectPr>
@@ -3026,10 +3083,12 @@
     <w:qFormat/>
     <w:rsid w:val="00607A85"/>
     <w:pPr>
-      <w:spacing w:after="0" w:line="276" w:lineRule="auto"/>
+      <w:spacing w:after="120" w:line="276" w:lineRule="auto" w:before="0"/>
     </w:pPr>
     <w:rPr>
       <w:rFonts w:ascii="Arial" w:eastAsia="Arial" w:hAnsi="Arial" w:cs="Arial"/>
+      <w:b w:val="0"/>
+      <w:color w:val="243447"/>
       <w:kern w:val="0"/>
       <w:sz w:val="22"/>
       <w:szCs w:val="22"/>
@@ -3048,13 +3107,14 @@
     <w:pPr>
       <w:keepNext/>
       <w:keepLines/>
-      <w:spacing w:before="360" w:after="80"/>
+      <w:spacing w:before="280" w:after="120"/>
       <w:outlineLvl w:val="0"/>
     </w:pPr>
     <w:rPr>
-      <w:rFonts w:asciiTheme="majorHAnsi" w:eastAsiaTheme="majorEastAsia" w:hAnsiTheme="majorHAnsi" w:cstheme="majorBidi"/>
-      <w:color w:val="2F5496" w:themeColor="accent1" w:themeShade="BF"/>
-      <w:sz w:val="40"/>
+      <w:rFonts w:asciiTheme="majorHAnsi" w:eastAsiaTheme="majorEastAsia" w:hAnsiTheme="majorHAnsi" w:cstheme="majorBidi" w:ascii="Arial" w:hAnsi="Arial" w:eastAsia="Arial" w:cs="Arial"/>
+      <w:b/>
+      <w:color w:val="0F766E"/>
+      <w:sz w:val="30"/>
       <w:szCs w:val="40"/>
     </w:rPr>
   </w:style>
@@ -3071,13 +3131,14 @@
     <w:pPr>
       <w:keepNext/>
       <w:keepLines/>
-      <w:spacing w:before="160" w:after="80"/>
+      <w:spacing w:before="200" w:after="80"/>
       <w:outlineLvl w:val="1"/>
     </w:pPr>
     <w:rPr>
-      <w:rFonts w:asciiTheme="majorHAnsi" w:eastAsiaTheme="majorEastAsia" w:hAnsiTheme="majorHAnsi" w:cstheme="majorBidi"/>
-      <w:color w:val="2F5496" w:themeColor="accent1" w:themeShade="BF"/>
-      <w:sz w:val="32"/>
+      <w:rFonts w:asciiTheme="majorHAnsi" w:eastAsiaTheme="majorEastAsia" w:hAnsiTheme="majorHAnsi" w:cstheme="majorBidi" w:ascii="Arial" w:hAnsi="Arial" w:eastAsia="Arial" w:cs="Arial"/>
+      <w:b/>
+      <w:color w:val="1B365D"/>
+      <w:sz w:val="25"/>
       <w:szCs w:val="32"/>
     </w:rPr>
   </w:style>
@@ -3094,13 +3155,14 @@
     <w:pPr>
       <w:keepNext/>
       <w:keepLines/>
-      <w:spacing w:before="160" w:after="80"/>
+      <w:spacing w:before="160" w:after="60"/>
       <w:outlineLvl w:val="2"/>
     </w:pPr>
     <w:rPr>
-      <w:rFonts w:eastAsiaTheme="majorEastAsia" w:cstheme="majorBidi"/>
-      <w:color w:val="2F5496" w:themeColor="accent1" w:themeShade="BF"/>
-      <w:sz w:val="28"/>
+      <w:rFonts w:eastAsiaTheme="majorEastAsia" w:cstheme="majorBidi" w:ascii="Arial" w:hAnsi="Arial" w:eastAsia="Arial" w:cs="Arial"/>
+      <w:b/>
+      <w:color w:val="0F766E"/>
+      <w:sz w:val="23"/>
       <w:szCs w:val="28"/>
     </w:rPr>
   </w:style>
@@ -3389,14 +3451,18 @@
     <w:qFormat/>
     <w:rsid w:val="00607A85"/>
     <w:pPr>
-      <w:spacing w:after="80" w:line="240" w:lineRule="auto"/>
+      <w:keepNext/>
+      <w:spacing w:after="200" w:line="240" w:lineRule="auto" w:before="0"/>
       <w:contextualSpacing/>
+      <w:jc w:val="center"/>
     </w:pPr>
     <w:rPr>
-      <w:rFonts w:asciiTheme="majorHAnsi" w:eastAsiaTheme="majorEastAsia" w:hAnsiTheme="majorHAnsi" w:cstheme="majorBidi"/>
+      <w:rFonts w:asciiTheme="majorHAnsi" w:eastAsiaTheme="majorEastAsia" w:hAnsiTheme="majorHAnsi" w:cstheme="majorBidi" w:ascii="Arial" w:hAnsi="Arial" w:eastAsia="Arial" w:cs="Arial"/>
+      <w:b/>
+      <w:color w:val="1B365D"/>
       <w:spacing w:val="-10"/>
       <w:kern w:val="28"/>
-      <w:sz w:val="56"/>
+      <w:sz w:val="44"/>
       <w:szCs w:val="56"/>
     </w:rPr>
   </w:style>
@@ -3423,15 +3489,19 @@
     <w:qFormat/>
     <w:rsid w:val="00607A85"/>
     <w:pPr>
+      <w:keepNext/>
       <w:numPr>
         <w:ilvl w:val="1"/>
       </w:numPr>
+      <w:spacing w:before="0" w:after="240"/>
+      <w:jc w:val="center"/>
     </w:pPr>
     <w:rPr>
-      <w:rFonts w:eastAsiaTheme="majorEastAsia" w:cstheme="majorBidi"/>
-      <w:color w:val="595959" w:themeColor="text1" w:themeTint="A6"/>
+      <w:rFonts w:eastAsiaTheme="majorEastAsia" w:cstheme="majorBidi" w:ascii="Arial" w:hAnsi="Arial" w:eastAsia="Arial" w:cs="Arial"/>
+      <w:b w:val="0"/>
+      <w:color w:val="5B6472"/>
       <w:spacing w:val="15"/>
-      <w:sz w:val="28"/>
+      <w:sz w:val="24"/>
       <w:szCs w:val="28"/>
     </w:rPr>
   </w:style>
@@ -3486,9 +3556,16 @@
     <w:qFormat/>
     <w:rsid w:val="00607A85"/>
     <w:pPr>
+      <w:spacing w:before="0" w:after="60" w:line="276" w:lineRule="auto"/>
       <w:ind w:left="720"/>
       <w:contextualSpacing/>
     </w:pPr>
+    <w:rPr>
+      <w:rFonts w:ascii="Arial" w:hAnsi="Arial" w:eastAsia="Arial" w:cs="Arial"/>
+      <w:b w:val="0"/>
+      <w:color w:val="243447"/>
+      <w:sz w:val="22"/>
+    </w:rPr>
   </w:style>
   <w:style w:type="character" w:styleId="IntenseEmphasis">
     <w:name w:val="Intense Emphasis"/>
@@ -3549,6 +3626,42 @@
       <w:smallCaps/>
       <w:color w:val="2F5496" w:themeColor="accent1" w:themeShade="BF"/>
       <w:spacing w:val="5"/>
+    </w:rPr>
+  </w:style>
+  <w:style w:type="paragraph" w:customStyle="1" w:styleId="Normal(Web)">
+    <w:name w:val="Normal (Web)"/>
+    <w:pPr>
+      <w:spacing w:before="0" w:after="120" w:line="276" w:lineRule="auto"/>
+    </w:pPr>
+    <w:rPr>
+      <w:rFonts w:ascii="Arial" w:hAnsi="Arial" w:eastAsia="Arial" w:cs="Arial"/>
+      <w:b w:val="0"/>
+      <w:color w:val="243447"/>
+      <w:sz w:val="22"/>
+    </w:rPr>
+  </w:style>
+  <w:style w:type="paragraph" w:customStyle="1" w:styleId="ListBullet">
+    <w:name w:val="List Bullet"/>
+    <w:pPr>
+      <w:spacing w:before="0" w:after="60" w:line="276" w:lineRule="auto"/>
+    </w:pPr>
+    <w:rPr>
+      <w:rFonts w:ascii="Arial" w:hAnsi="Arial" w:eastAsia="Arial" w:cs="Arial"/>
+      <w:b w:val="0"/>
+      <w:color w:val="243447"/>
+      <w:sz w:val="22"/>
+    </w:rPr>
+  </w:style>
+  <w:style w:type="paragraph" w:customStyle="1" w:styleId="ListNumber">
+    <w:name w:val="List Number"/>
+    <w:pPr>
+      <w:spacing w:before="0" w:after="60" w:line="276" w:lineRule="auto"/>
+    </w:pPr>
+    <w:rPr>
+      <w:rFonts w:ascii="Arial" w:hAnsi="Arial" w:eastAsia="Arial" w:cs="Arial"/>
+      <w:b w:val="0"/>
+      <w:color w:val="243447"/>
+      <w:sz w:val="22"/>
     </w:rPr>
   </w:style>
 </w:styles>

</xml_diff>

<commit_message>
Cập nhật bài tập
</commit_message>
<xml_diff>
--- a/public/documents/bai-1-quan-ly-tep.docx
+++ b/public/documents/bai-1-quan-ly-tep.docx
@@ -5,171 +5,73 @@
     <w:p>
       <w:pPr>
         <w:pStyle w:val="Title"/>
-        <w:keepNext w:val="0"/>
+        <w:keepNext/>
         <w:keepLines w:val="0"/>
+        <w:widowControl/>
         <w:spacing w:before="0" w:after="200" w:line="240" w:lineRule="auto"/>
         <w:jc w:val="center"/>
       </w:pPr>
       <w:r>
         <w:rPr>
-          <w:rFonts w:ascii="Arial" w:hAnsi="Arial" w:eastAsia="Arial" w:cs="Arial"/>
+          <w:rFonts w:ascii="Arial" w:hAnsi="Arial" w:cs="Arial" w:eastAsia="Arial"/>
           <w:b/>
-          <w:color w:val="1B365D"/>
-          <w:sz w:val="44"/>
+          <w:color w:val="0E5C50"/>
+          <w:sz w:val="40"/>
         </w:rPr>
         <w:t>Bài tập 1 — Thao tác cơ bản với tệp tin và thư mục</w:t>
       </w:r>
     </w:p>
     <w:p>
       <w:pPr>
-        <w:pStyle w:val="Heading1"/>
-        <w:keepNext w:val="0"/>
-        <w:keepLines w:val="0"/>
-        <w:spacing w:before="280" w:after="120" w:line="240" w:lineRule="auto"/>
-        <w:jc w:val="left"/>
-        <w:rPr>
-          <w:rFonts w:ascii="Times New Roman" w:eastAsia="Times New Roman" w:hAnsi="Times New Roman" w:cs="Times New Roman"/>
-          <w:b/>
-          <w:bCs/>
-          <w:sz w:val="42"/>
-          <w:szCs w:val="42"/>
-          <w:highlight w:val="white"/>
-        </w:rPr>
+        <w:pStyle w:val="Subtitle"/>
+        <w:jc w:val="center"/>
       </w:pPr>
       <w:r>
         <w:rPr>
-          <w:rFonts w:ascii="Arial" w:eastAsia="Arial" w:hAnsi="Arial" w:cs="Arial"/>
-          <w:b/>
-          <w:bCs/>
-          <w:color w:val="0F766E"/>
-          <w:sz w:val="30"/>
-          <w:szCs w:val="42"/>
-          <w:highlight w:val="white"/>
-          <w:u w:val="single"/>
-        </w:rPr>
-        <w:t>CHƯƠNG 1</w:t>
-      </w:r>
-      <w:r>
-        <w:rPr>
-          <w:rFonts w:ascii="Arial" w:eastAsia="Arial" w:hAnsi="Arial" w:cs="Arial"/>
-          <w:b/>
-          <w:bCs/>
-          <w:color w:val="0F766E"/>
-          <w:sz w:val="30"/>
-          <w:szCs w:val="42"/>
-          <w:highlight w:val="white"/>
-        </w:rPr>
-        <w:t xml:space="preserve">: </w:t>
+          <w:rFonts w:ascii="Arial" w:hAnsi="Arial" w:cs="Arial" w:eastAsia="Arial"/>
+          <w:color w:val="66737D"/>
+          <w:sz w:val="21"/>
+        </w:rPr>
+        <w:t>Trịnh Thị Kiều Oanh · MSSV 25041302 · Lớp 25R1</w:t>
       </w:r>
     </w:p>
     <w:p>
       <w:pPr>
         <w:pStyle w:val="Subtitle"/>
-        <w:keepNext w:val="0"/>
-        <w:keepLines w:val="0"/>
-        <w:spacing w:before="0" w:after="240" w:line="240" w:lineRule="auto"/>
         <w:jc w:val="center"/>
-        <w:rPr>
-          <w:rFonts w:ascii="Times New Roman" w:eastAsia="Times New Roman" w:hAnsi="Times New Roman" w:cs="Times New Roman"/>
-          <w:b/>
-          <w:bCs/>
-          <w:sz w:val="42"/>
-          <w:szCs w:val="42"/>
-          <w:highlight w:val="white"/>
-        </w:rPr>
+        <w:pBdr>
+          <w:bottom w:val="single" w:sz="6" w:space="5" w:color="B8D3CC"/>
+        </w:pBdr>
       </w:pPr>
       <w:r>
         <w:rPr>
-          <w:rFonts w:ascii="Arial" w:eastAsia="Arial" w:hAnsi="Arial" w:cs="Arial"/>
-          <w:b/>
-          <w:bCs/>
-          <w:highlight w:val="white"/>
-        </w:rPr>
-        <w:t>MÁY TÍNH VÀ CÁC THIẾT BỊ NGOẠI VI</w:t>
+          <w:rFonts w:ascii="Arial" w:hAnsi="Arial" w:cs="Arial" w:eastAsia="Arial"/>
+          <w:color w:val="66737D"/>
+          <w:sz w:val="21"/>
+        </w:rPr>
+        <w:t>Nhập môn Công nghệ số và Ứng dụng Trí tuệ nhân tạo</w:t>
       </w:r>
     </w:p>
     <w:p>
       <w:pPr>
-        <w:keepNext w:val="0"/>
-        <w:keepLines w:val="0"/>
-        <w:spacing w:line="240" w:lineRule="auto" w:before="0" w:after="40"/>
-        <w:jc w:val="left"/>
-        <w:rPr>
-          <w:rFonts w:ascii="Times New Roman" w:eastAsia="Times New Roman" w:hAnsi="Times New Roman" w:cs="Times New Roman"/>
+        <w:pStyle w:val="Heading1"/>
+      </w:pPr>
+      <w:r>
+        <w:rPr>
+          <w:rFonts w:ascii="Arial" w:hAnsi="Arial" w:cs="Arial" w:eastAsia="Arial"/>
           <w:b/>
-          <w:bCs/>
-          <w:sz w:val="42"/>
-          <w:szCs w:val="42"/>
-          <w:highlight w:val="white"/>
-        </w:rPr>
-      </w:pPr>
-    </w:p>
-    <w:p>
-      <w:pPr>
-        <w:pStyle w:val="Heading1"/>
-        <w:keepNext w:val="0"/>
-        <w:keepLines w:val="0"/>
-        <w:spacing w:before="280" w:after="120" w:line="240" w:lineRule="auto"/>
-        <w:jc w:val="left"/>
-        <w:rPr>
-          <w:rFonts w:ascii="Times New Roman" w:eastAsia="Times New Roman" w:hAnsi="Times New Roman" w:cs="Times New Roman"/>
-          <w:b/>
-          <w:bCs/>
-          <w:sz w:val="42"/>
-          <w:szCs w:val="42"/>
-          <w:highlight w:val="white"/>
-        </w:rPr>
-      </w:pPr>
-      <w:r>
-        <w:rPr>
-          <w:rFonts w:ascii="Arial" w:eastAsia="Arial" w:hAnsi="Arial" w:cs="Arial"/>
-          <w:b/>
-          <w:bCs/>
-          <w:color w:val="0F766E"/>
-          <w:sz w:val="30"/>
-          <w:szCs w:val="42"/>
-          <w:highlight w:val="white"/>
-          <w:u w:val="single"/>
-        </w:rPr>
-        <w:t>Bài tập 1</w:t>
-      </w:r>
-      <w:r>
-        <w:rPr>
-          <w:rFonts w:ascii="Arial" w:eastAsia="Arial" w:hAnsi="Arial" w:cs="Arial"/>
-          <w:b/>
-          <w:bCs/>
-          <w:color w:val="0F766E"/>
-          <w:sz w:val="30"/>
-          <w:szCs w:val="42"/>
-          <w:highlight w:val="white"/>
-        </w:rPr>
-        <w:t>:Thao tác cơ bản với tệp tin và thư mục</w:t>
+          <w:color w:val="0E5C50"/>
+          <w:sz w:val="28"/>
+        </w:rPr>
+        <w:t>I. Quy trình thực hành</w:t>
       </w:r>
     </w:p>
     <w:p>
       <w:pPr>
+        <w:pStyle w:val="ListParagraph"/>
         <w:keepNext w:val="0"/>
         <w:keepLines w:val="0"/>
-        <w:spacing w:before="0" w:after="40" w:line="240" w:lineRule="auto"/>
-        <w:jc w:val="left"/>
-        <w:rPr>
-          <w:rFonts w:ascii="Times New Roman" w:eastAsia="Times New Roman" w:hAnsi="Times New Roman" w:cs="Times New Roman"/>
-          <w:b/>
-          <w:bCs/>
-          <w:sz w:val="42"/>
-          <w:szCs w:val="42"/>
-          <w:highlight w:val="white"/>
-        </w:rPr>
-      </w:pPr>
-    </w:p>
-    <w:p>
-      <w:pPr>
-        <w:keepNext w:val="0"/>
-        <w:keepLines w:val="0"/>
-        <w:numPr>
-          <w:ilvl w:val="0"/>
-          <w:numId w:val="5"/>
-        </w:numPr>
+        <w:widowControl/>
         <w:shd w:val="clear" w:color="auto" w:fill="FFFFFF"/>
         <w:spacing w:after="120" w:line="276" w:lineRule="auto" w:before="0"/>
         <w:ind w:right="100"/>
@@ -180,32 +82,24 @@
           <w:szCs w:val="26"/>
           <w:highlight w:val="white"/>
         </w:rPr>
+        <w:numPr>
+          <w:ilvl w:val="0"/>
+          <w:numId w:val="23"/>
+        </w:numPr>
       </w:pPr>
       <w:r>
-        <w:rPr>
-          <w:rFonts w:ascii="Arial" w:eastAsia="Arial" w:hAnsi="Arial" w:cs="Arial"/>
-          <w:b/>
-          <w:bCs/>
-          <w:highlight w:val="white"/>
-        </w:rPr>
-        <w:t xml:space="preserve">Mở File Explorer: </w:t>
-      </w:r>
-      <w:r>
-        <w:rPr>
-          <w:rFonts w:ascii="Arial" w:eastAsia="Arial" w:hAnsi="Arial" w:cs="Arial"/>
-          <w:highlight w:val="white"/>
-        </w:rPr>
-        <w:t>Nhấn tổ hợp phím Windows + E hoặc nhấp vào biểu tượng thư mục màu vàng trên thanh tác vụ.</w:t>
+        <w:t>Bước 1. Mở File Explorer: Nhấn tổ hợp phím Windows + E hoặc nhấp vào biểu tượng thư mục màu vàng trên thanh tác vụ.</w:t>
       </w:r>
     </w:p>
     <w:p>
       <w:pPr>
+        <w:pStyle w:val="Caption"/>
         <w:keepNext w:val="0"/>
         <w:keepLines w:val="0"/>
         <w:shd w:val="clear" w:color="auto" w:fill="FFFFFF"/>
-        <w:spacing w:after="40" w:line="240" w:lineRule="auto" w:before="0"/>
-        <w:ind w:left="141"/>
-        <w:jc w:val="left"/>
+        <w:spacing w:after="160" w:line="240" w:lineRule="auto" w:before="80"/>
+        <w:ind/>
+        <w:jc w:val="center"/>
         <w:rPr>
           <w:rFonts w:ascii="Times New Roman" w:eastAsia="Times New Roman" w:hAnsi="Times New Roman" w:cs="Times New Roman"/>
           <w:sz w:val="26"/>
@@ -216,7 +110,10 @@
       <w:r>
         <w:rPr>
           <w:rFonts w:ascii="Arial" w:eastAsia="Arial" w:hAnsi="Arial" w:cs="Arial"/>
+          <w:i/>
           <w:noProof/>
+          <w:color w:val="66737D"/>
+          <w:sz w:val="19"/>
           <w:highlight w:val="white"/>
         </w:rPr>
         <w:drawing>
@@ -258,30 +155,10 @@
     </w:p>
     <w:p>
       <w:pPr>
+        <w:pStyle w:val="ListParagraph"/>
         <w:keepNext w:val="0"/>
         <w:keepLines w:val="0"/>
-        <w:shd w:val="clear" w:color="auto" w:fill="FFFFFF"/>
-        <w:spacing w:after="40" w:line="240" w:lineRule="auto" w:before="0"/>
-        <w:ind w:right="100"/>
-        <w:jc w:val="left"/>
-        <w:rPr>
-          <w:rFonts w:ascii="Times New Roman" w:eastAsia="Times New Roman" w:hAnsi="Times New Roman" w:cs="Times New Roman"/>
-          <w:b/>
-          <w:bCs/>
-          <w:sz w:val="26"/>
-          <w:szCs w:val="26"/>
-          <w:highlight w:val="white"/>
-        </w:rPr>
-      </w:pPr>
-    </w:p>
-    <w:p>
-      <w:pPr>
-        <w:keepNext w:val="0"/>
-        <w:keepLines w:val="0"/>
-        <w:numPr>
-          <w:ilvl w:val="0"/>
-          <w:numId w:val="5"/>
-        </w:numPr>
+        <w:widowControl/>
         <w:shd w:val="clear" w:color="auto" w:fill="FFFFFF"/>
         <w:spacing w:after="120" w:line="276" w:lineRule="auto" w:before="0"/>
         <w:ind w:right="100"/>
@@ -292,32 +169,24 @@
           <w:szCs w:val="26"/>
           <w:highlight w:val="white"/>
         </w:rPr>
+        <w:numPr>
+          <w:ilvl w:val="0"/>
+          <w:numId w:val="7"/>
+        </w:numPr>
       </w:pPr>
       <w:r>
-        <w:rPr>
-          <w:rFonts w:ascii="Arial" w:eastAsia="Arial" w:hAnsi="Arial" w:cs="Arial"/>
-          <w:b/>
-          <w:bCs/>
-          <w:highlight w:val="white"/>
-        </w:rPr>
-        <w:t>Truy cập ổ đĩa/thư mục:</w:t>
-      </w:r>
-      <w:r>
-        <w:rPr>
-          <w:rFonts w:ascii="Arial" w:eastAsia="Arial" w:hAnsi="Arial" w:cs="Arial"/>
-          <w:highlight w:val="white"/>
-        </w:rPr>
-        <w:t xml:space="preserve"> Ở cột bên trái, nhấp vào This PC, sau đó nhấp đúp vào một ổ đĩa không phải ổ hệ thống (ví dụ: ổ D: hoặc E:). Nếu chỉ có ổ C:, hãy vào thư mục Documents.</w:t>
+        <w:t>Bước 2. Truy cập ổ đĩa hoặc thư mục: Ở cột bên trái, chọn This PC, sau đó mở một ổ đĩa không phải ổ hệ thống (ví dụ: ổ D: hoặc E:). Nếu máy chỉ có ổ C:, mở thư mục Documents.</w:t>
       </w:r>
     </w:p>
     <w:p>
       <w:pPr>
+        <w:pStyle w:val="Caption"/>
         <w:keepNext w:val="0"/>
         <w:keepLines w:val="0"/>
         <w:shd w:val="clear" w:color="auto" w:fill="FFFFFF"/>
-        <w:spacing w:after="40" w:line="240" w:lineRule="auto" w:before="0"/>
-        <w:ind w:left="141" w:right="100"/>
-        <w:jc w:val="left"/>
+        <w:spacing w:after="160" w:line="240" w:lineRule="auto" w:before="80"/>
+        <w:ind w:right="100"/>
+        <w:jc w:val="center"/>
         <w:rPr>
           <w:rFonts w:ascii="Times New Roman" w:eastAsia="Times New Roman" w:hAnsi="Times New Roman" w:cs="Times New Roman"/>
           <w:sz w:val="26"/>
@@ -328,6 +197,9 @@
       <w:r>
         <w:rPr>
           <w:rFonts w:ascii="Arial" w:eastAsia="Arial" w:hAnsi="Arial" w:cs="Arial"/>
+          <w:i/>
+          <w:color w:val="66737D"/>
+          <w:sz w:val="19"/>
         </w:rPr>
         <w:drawing>
           <wp:inline distT="0" distB="0" distL="0" distR="0" wp14:anchorId="48E145B3" wp14:editId="191551ED">
@@ -368,84 +240,10 @@
     </w:p>
     <w:p>
       <w:pPr>
+        <w:pStyle w:val="ListParagraph"/>
         <w:keepNext w:val="0"/>
         <w:keepLines w:val="0"/>
-        <w:shd w:val="clear" w:color="auto" w:fill="FFFFFF"/>
-        <w:spacing w:after="40" w:line="240" w:lineRule="auto" w:before="0"/>
-        <w:ind w:right="100"/>
-        <w:jc w:val="left"/>
-        <w:rPr>
-          <w:rFonts w:ascii="Times New Roman" w:eastAsia="Times New Roman" w:hAnsi="Times New Roman" w:cs="Times New Roman"/>
-          <w:b/>
-          <w:bCs/>
-          <w:sz w:val="26"/>
-          <w:szCs w:val="26"/>
-          <w:highlight w:val="white"/>
-        </w:rPr>
-      </w:pPr>
-    </w:p>
-    <w:p>
-      <w:pPr>
-        <w:keepNext w:val="0"/>
-        <w:keepLines w:val="0"/>
-        <w:shd w:val="clear" w:color="auto" w:fill="FFFFFF"/>
-        <w:spacing w:after="40" w:line="240" w:lineRule="auto" w:before="0"/>
-        <w:ind w:right="100"/>
-        <w:jc w:val="left"/>
-        <w:rPr>
-          <w:rFonts w:ascii="Times New Roman" w:eastAsia="Times New Roman" w:hAnsi="Times New Roman" w:cs="Times New Roman"/>
-          <w:b/>
-          <w:bCs/>
-          <w:sz w:val="26"/>
-          <w:szCs w:val="26"/>
-          <w:highlight w:val="white"/>
-        </w:rPr>
-      </w:pPr>
-    </w:p>
-    <w:p>
-      <w:pPr>
-        <w:keepNext w:val="0"/>
-        <w:keepLines w:val="0"/>
-        <w:shd w:val="clear" w:color="auto" w:fill="FFFFFF"/>
-        <w:spacing w:after="40" w:line="240" w:lineRule="auto" w:before="0"/>
-        <w:ind w:right="100"/>
-        <w:jc w:val="left"/>
-        <w:rPr>
-          <w:rFonts w:ascii="Times New Roman" w:eastAsia="Times New Roman" w:hAnsi="Times New Roman" w:cs="Times New Roman"/>
-          <w:b/>
-          <w:bCs/>
-          <w:sz w:val="26"/>
-          <w:szCs w:val="26"/>
-          <w:highlight w:val="white"/>
-        </w:rPr>
-      </w:pPr>
-    </w:p>
-    <w:p>
-      <w:pPr>
-        <w:keepNext w:val="0"/>
-        <w:keepLines w:val="0"/>
-        <w:shd w:val="clear" w:color="auto" w:fill="FFFFFF"/>
-        <w:spacing w:after="40" w:line="240" w:lineRule="auto" w:before="0"/>
-        <w:ind w:right="100"/>
-        <w:jc w:val="left"/>
-        <w:rPr>
-          <w:rFonts w:ascii="Times New Roman" w:eastAsia="Times New Roman" w:hAnsi="Times New Roman" w:cs="Times New Roman"/>
-          <w:b/>
-          <w:bCs/>
-          <w:sz w:val="26"/>
-          <w:szCs w:val="26"/>
-          <w:highlight w:val="white"/>
-        </w:rPr>
-      </w:pPr>
-    </w:p>
-    <w:p>
-      <w:pPr>
-        <w:keepNext w:val="0"/>
-        <w:keepLines w:val="0"/>
-        <w:numPr>
-          <w:ilvl w:val="0"/>
-          <w:numId w:val="5"/>
-        </w:numPr>
+        <w:widowControl/>
         <w:shd w:val="clear" w:color="auto" w:fill="FFFFFF"/>
         <w:spacing w:after="120" w:line="276" w:lineRule="auto" w:before="0"/>
         <w:ind w:right="100"/>
@@ -456,32 +254,24 @@
           <w:szCs w:val="26"/>
           <w:highlight w:val="white"/>
         </w:rPr>
+        <w:numPr>
+          <w:ilvl w:val="0"/>
+          <w:numId w:val="23"/>
+        </w:numPr>
       </w:pPr>
       <w:r>
-        <w:rPr>
-          <w:rFonts w:ascii="Arial" w:eastAsia="Arial" w:hAnsi="Arial" w:cs="Arial"/>
-          <w:b/>
-          <w:bCs/>
-          <w:highlight w:val="white"/>
-        </w:rPr>
-        <w:t xml:space="preserve">Tạo thư mục mới: </w:t>
-      </w:r>
-      <w:r>
-        <w:rPr>
-          <w:rFonts w:ascii="Arial" w:eastAsia="Arial" w:hAnsi="Arial" w:cs="Arial"/>
-          <w:highlight w:val="white"/>
-        </w:rPr>
-        <w:t>Nhấp chuột phải vào một khoảng trống -&gt; chọn New -&gt; Folder. Đặt tên thư mục là ThucHanh_hotensinhvien (VD: ThucHanh_NguyenVanA). Nhấn Enter.</w:t>
+        <w:t>Bước 3. Tạo thư mục mới: Nhấp chuột phải vào khoảng trống, chọn New → Folder. Đặt tên thư mục là ThucHanh_HoTenSinhVien (ví dụ: ThucHanh_TrinhThiKieuOanh), rồi nhấn Enter.</w:t>
       </w:r>
     </w:p>
     <w:p>
       <w:pPr>
+        <w:pStyle w:val="Caption"/>
         <w:keepNext w:val="0"/>
         <w:keepLines w:val="0"/>
         <w:shd w:val="clear" w:color="auto" w:fill="FFFFFF"/>
-        <w:spacing w:after="40" w:line="240" w:lineRule="auto" w:before="0"/>
-        <w:ind w:left="141" w:right="100"/>
-        <w:jc w:val="left"/>
+        <w:spacing w:after="160" w:line="240" w:lineRule="auto" w:before="80"/>
+        <w:ind w:right="100"/>
+        <w:jc w:val="center"/>
         <w:rPr>
           <w:rFonts w:ascii="Times New Roman" w:eastAsia="Times New Roman" w:hAnsi="Times New Roman" w:cs="Times New Roman"/>
           <w:sz w:val="26"/>
@@ -492,6 +282,9 @@
       <w:r>
         <w:rPr>
           <w:rFonts w:ascii="Arial" w:eastAsia="Arial" w:hAnsi="Arial" w:cs="Arial"/>
+          <w:i/>
+          <w:color w:val="66737D"/>
+          <w:sz w:val="19"/>
         </w:rPr>
         <w:drawing>
           <wp:inline distT="0" distB="0" distL="0" distR="0" wp14:anchorId="25248B8C" wp14:editId="27B909CF">
@@ -532,30 +325,10 @@
     </w:p>
     <w:p>
       <w:pPr>
+        <w:pStyle w:val="ListParagraph"/>
         <w:keepNext w:val="0"/>
         <w:keepLines w:val="0"/>
-        <w:shd w:val="clear" w:color="auto" w:fill="FFFFFF"/>
-        <w:spacing w:after="40" w:line="240" w:lineRule="auto" w:before="0"/>
-        <w:ind w:left="425" w:right="100"/>
-        <w:jc w:val="left"/>
-        <w:rPr>
-          <w:rFonts w:ascii="Times New Roman" w:eastAsia="Times New Roman" w:hAnsi="Times New Roman" w:cs="Times New Roman"/>
-          <w:b/>
-          <w:bCs/>
-          <w:sz w:val="26"/>
-          <w:szCs w:val="26"/>
-          <w:highlight w:val="white"/>
-        </w:rPr>
-      </w:pPr>
-    </w:p>
-    <w:p>
-      <w:pPr>
-        <w:keepNext w:val="0"/>
-        <w:keepLines w:val="0"/>
-        <w:numPr>
-          <w:ilvl w:val="0"/>
-          <w:numId w:val="5"/>
-        </w:numPr>
+        <w:widowControl/>
         <w:shd w:val="clear" w:color="auto" w:fill="FFFFFF"/>
         <w:spacing w:after="120" w:line="276" w:lineRule="auto" w:before="0"/>
         <w:ind w:right="100"/>
@@ -566,32 +339,24 @@
           <w:szCs w:val="26"/>
           <w:highlight w:val="white"/>
         </w:rPr>
+        <w:numPr>
+          <w:ilvl w:val="0"/>
+          <w:numId w:val="23"/>
+        </w:numPr>
       </w:pPr>
       <w:r>
-        <w:rPr>
-          <w:rFonts w:ascii="Arial" w:eastAsia="Arial" w:hAnsi="Arial" w:cs="Arial"/>
-          <w:b/>
-          <w:bCs/>
-          <w:highlight w:val="white"/>
-        </w:rPr>
-        <w:t>Vào thư mục vừa tạo:</w:t>
-      </w:r>
-      <w:r>
-        <w:rPr>
-          <w:rFonts w:ascii="Arial" w:eastAsia="Arial" w:hAnsi="Arial" w:cs="Arial"/>
-          <w:highlight w:val="white"/>
-        </w:rPr>
-        <w:t xml:space="preserve"> Nhấp đúp vào thư mục ThucHanh_NguyenVanA.</w:t>
+        <w:t>Bước 4. Vào thư mục vừa tạo: Nhấp đúp vào thư mục ThucHanh_HoTenSinhVien.</w:t>
       </w:r>
     </w:p>
     <w:p>
       <w:pPr>
+        <w:pStyle w:val="Caption"/>
         <w:keepNext w:val="0"/>
         <w:keepLines w:val="0"/>
         <w:shd w:val="clear" w:color="auto" w:fill="FFFFFF"/>
-        <w:spacing w:after="40" w:line="240" w:lineRule="auto" w:before="0"/>
-        <w:ind w:left="141" w:right="100"/>
-        <w:jc w:val="left"/>
+        <w:spacing w:after="160" w:line="240" w:lineRule="auto" w:before="80"/>
+        <w:ind w:right="100"/>
+        <w:jc w:val="center"/>
         <w:rPr>
           <w:rFonts w:ascii="Times New Roman" w:eastAsia="Times New Roman" w:hAnsi="Times New Roman" w:cs="Times New Roman"/>
           <w:sz w:val="26"/>
@@ -602,7 +367,10 @@
       <w:r>
         <w:rPr>
           <w:rFonts w:ascii="Arial" w:eastAsia="Arial" w:hAnsi="Arial" w:cs="Arial"/>
+          <w:i/>
           <w:noProof/>
+          <w:color w:val="66737D"/>
+          <w:sz w:val="19"/>
         </w:rPr>
         <w:lastRenderedPageBreak/>
         <w:drawing>
@@ -644,12 +412,10 @@
     </w:p>
     <w:p>
       <w:pPr>
+        <w:pStyle w:val="ListParagraph"/>
         <w:keepNext w:val="0"/>
         <w:keepLines w:val="0"/>
-        <w:numPr>
-          <w:ilvl w:val="0"/>
-          <w:numId w:val="5"/>
-        </w:numPr>
+        <w:widowControl/>
         <w:shd w:val="clear" w:color="auto" w:fill="FFFFFF"/>
         <w:spacing w:after="120" w:line="276" w:lineRule="auto" w:before="0"/>
         <w:ind w:right="100"/>
@@ -660,32 +426,24 @@
           <w:szCs w:val="26"/>
           <w:highlight w:val="white"/>
         </w:rPr>
+        <w:numPr>
+          <w:ilvl w:val="0"/>
+          <w:numId w:val="23"/>
+        </w:numPr>
       </w:pPr>
       <w:r>
-        <w:rPr>
-          <w:rFonts w:ascii="Arial" w:eastAsia="Arial" w:hAnsi="Arial" w:cs="Arial"/>
-          <w:b/>
-          <w:bCs/>
-          <w:highlight w:val="white"/>
-        </w:rPr>
-        <w:t>Tạo tệp tin văn bản:</w:t>
-      </w:r>
-      <w:r>
-        <w:rPr>
-          <w:rFonts w:ascii="Arial" w:eastAsia="Arial" w:hAnsi="Arial" w:cs="Arial"/>
-          <w:highlight w:val="white"/>
-        </w:rPr>
-        <w:t xml:space="preserve"> Nhấp chuột phải vào khoảng trống -&gt; New -&gt; Text Document. Đặt tên là GhiChu.txt. Nhấn Enter.</w:t>
+        <w:t>Bước 5. Tạo tệp tin văn bản: Nhấp chuột phải vào khoảng trống, chọn New → Text Document. Đặt tên là GhiChu.txt rồi nhấn Enter.</w:t>
       </w:r>
     </w:p>
     <w:p>
       <w:pPr>
+        <w:pStyle w:val="Caption"/>
         <w:keepNext w:val="0"/>
         <w:keepLines w:val="0"/>
         <w:shd w:val="clear" w:color="auto" w:fill="FFFFFF"/>
-        <w:spacing w:after="40" w:line="240" w:lineRule="auto" w:before="0"/>
-        <w:ind w:left="425" w:right="100" w:hanging="283"/>
-        <w:jc w:val="left"/>
+        <w:spacing w:after="160" w:line="240" w:lineRule="auto" w:before="80"/>
+        <w:ind w:right="100"/>
+        <w:jc w:val="center"/>
         <w:rPr>
           <w:rFonts w:ascii="Times New Roman" w:eastAsia="Times New Roman" w:hAnsi="Times New Roman" w:cs="Times New Roman"/>
           <w:sz w:val="26"/>
@@ -696,6 +454,9 @@
       <w:r>
         <w:rPr>
           <w:rFonts w:ascii="Arial" w:eastAsia="Arial" w:hAnsi="Arial" w:cs="Arial"/>
+          <w:i/>
+          <w:color w:val="66737D"/>
+          <w:sz w:val="19"/>
         </w:rPr>
         <w:drawing>
           <wp:inline distT="0" distB="0" distL="0" distR="0" wp14:anchorId="2A327754" wp14:editId="169824F7">
@@ -736,11 +497,13 @@
     </w:p>
     <w:p>
       <w:pPr>
+        <w:pStyle w:val="ListParagraph"/>
         <w:keepNext w:val="0"/>
         <w:keepLines w:val="0"/>
+        <w:widowControl/>
         <w:shd w:val="clear" w:color="auto" w:fill="FFFFFF"/>
-        <w:spacing w:after="40" w:line="240" w:lineRule="auto" w:before="0"/>
-        <w:ind w:left="425" w:right="100"/>
+        <w:spacing w:after="120" w:line="276" w:lineRule="auto" w:before="0"/>
+        <w:ind w:right="100"/>
         <w:jc w:val="left"/>
         <w:rPr>
           <w:rFonts w:ascii="Times New Roman" w:eastAsia="Times New Roman" w:hAnsi="Times New Roman" w:cs="Times New Roman"/>
@@ -748,20 +511,24 @@
           <w:szCs w:val="26"/>
           <w:highlight w:val="white"/>
         </w:rPr>
-      </w:pPr>
+        <w:numPr>
+          <w:ilvl w:val="0"/>
+          <w:numId w:val="23"/>
+        </w:numPr>
+      </w:pPr>
+      <w:r>
+        <w:t>Bước 6. Đổi tên tệp tin: Nhấp chuột phải vào GhiChu.txt, chọn Rename và đổi tên thành GhiChuQuanTrong.txt.</w:t>
+      </w:r>
     </w:p>
     <w:p>
       <w:pPr>
+        <w:pStyle w:val="Caption"/>
         <w:keepNext w:val="0"/>
         <w:keepLines w:val="0"/>
-        <w:numPr>
-          <w:ilvl w:val="0"/>
-          <w:numId w:val="5"/>
-        </w:numPr>
         <w:shd w:val="clear" w:color="auto" w:fill="FFFFFF"/>
-        <w:spacing w:after="120" w:line="276" w:lineRule="auto" w:before="0"/>
+        <w:spacing w:after="160" w:line="240" w:lineRule="auto" w:before="80"/>
         <w:ind w:right="100"/>
-        <w:jc w:val="left"/>
+        <w:jc w:val="center"/>
         <w:rPr>
           <w:rFonts w:ascii="Times New Roman" w:eastAsia="Times New Roman" w:hAnsi="Times New Roman" w:cs="Times New Roman"/>
           <w:sz w:val="26"/>
@@ -772,54 +539,9 @@
       <w:r>
         <w:rPr>
           <w:rFonts w:ascii="Arial" w:eastAsia="Arial" w:hAnsi="Arial" w:cs="Arial"/>
-          <w:b/>
-          <w:bCs/>
-          <w:highlight w:val="white"/>
-        </w:rPr>
-        <w:t>Đổi tên tệp tin:</w:t>
-      </w:r>
-      <w:r>
-        <w:rPr>
-          <w:rFonts w:ascii="Arial" w:eastAsia="Arial" w:hAnsi="Arial" w:cs="Arial"/>
-          <w:highlight w:val="white"/>
-        </w:rPr>
-        <w:t xml:space="preserve"> Nhấp chuột phải vào tệp GhiChu.txt -&gt; chọn Rename. Đổi tên thành GhiChuQuanTrong.txt. Nhấn Enter.</w:t>
-      </w:r>
-    </w:p>
-    <w:p>
-      <w:pPr>
-        <w:keepNext w:val="0"/>
-        <w:keepLines w:val="0"/>
-        <w:shd w:val="clear" w:color="auto" w:fill="FFFFFF"/>
-        <w:spacing w:after="40" w:line="240" w:lineRule="auto" w:before="0"/>
-        <w:ind w:left="141" w:right="100"/>
-        <w:jc w:val="left"/>
-        <w:rPr>
-          <w:rFonts w:ascii="Times New Roman" w:eastAsia="Times New Roman" w:hAnsi="Times New Roman" w:cs="Times New Roman"/>
-          <w:sz w:val="26"/>
-          <w:szCs w:val="26"/>
-          <w:highlight w:val="white"/>
-        </w:rPr>
-      </w:pPr>
-    </w:p>
-    <w:p>
-      <w:pPr>
-        <w:keepNext w:val="0"/>
-        <w:keepLines w:val="0"/>
-        <w:shd w:val="clear" w:color="auto" w:fill="FFFFFF"/>
-        <w:spacing w:after="40" w:line="240" w:lineRule="auto" w:before="0"/>
-        <w:ind w:left="141" w:right="100"/>
-        <w:jc w:val="left"/>
-        <w:rPr>
-          <w:rFonts w:ascii="Times New Roman" w:eastAsia="Times New Roman" w:hAnsi="Times New Roman" w:cs="Times New Roman"/>
-          <w:sz w:val="26"/>
-          <w:szCs w:val="26"/>
-          <w:highlight w:val="white"/>
-        </w:rPr>
-      </w:pPr>
-      <w:r>
-        <w:rPr>
-          <w:rFonts w:ascii="Arial" w:eastAsia="Arial" w:hAnsi="Arial" w:cs="Arial"/>
+          <w:i/>
+          <w:color w:val="66737D"/>
+          <w:sz w:val="19"/>
         </w:rPr>
         <w:drawing>
           <wp:inline distT="0" distB="0" distL="0" distR="0" wp14:anchorId="447E084E" wp14:editId="596A3ABC">
@@ -860,14 +582,20 @@
       <w:r>
         <w:rPr>
           <w:rFonts w:ascii="Arial" w:hAnsi="Arial" w:eastAsia="Arial" w:cs="Arial"/>
+          <w:i/>
           <w:noProof/>
           <w14:ligatures w14:val="standardContextual"/>
+          <w:color w:val="66737D"/>
+          <w:sz w:val="19"/>
         </w:rPr>
         <w:t xml:space="preserve"> </w:t>
       </w:r>
       <w:r>
         <w:rPr>
           <w:rFonts w:ascii="Arial" w:eastAsia="Arial" w:hAnsi="Arial" w:cs="Arial"/>
+          <w:i/>
+          <w:color w:val="66737D"/>
+          <w:sz w:val="19"/>
         </w:rPr>
         <w:drawing>
           <wp:inline distT="0" distB="0" distL="0" distR="0" wp14:anchorId="4DFED26B" wp14:editId="703952AD">
@@ -908,11 +636,12 @@
     </w:p>
     <w:p>
       <w:pPr>
+        <w:pStyle w:val="ListParagraph"/>
         <w:keepNext w:val="0"/>
         <w:keepLines w:val="0"/>
+        <w:widowControl/>
         <w:shd w:val="clear" w:color="auto" w:fill="FFFFFF"/>
-        <w:spacing w:after="40" w:line="240" w:lineRule="auto" w:before="0"/>
-        <w:ind w:left="425"/>
+        <w:spacing w:after="120" w:line="276" w:lineRule="auto" w:before="0"/>
         <w:jc w:val="left"/>
         <w:rPr>
           <w:rFonts w:ascii="Times New Roman" w:eastAsia="Times New Roman" w:hAnsi="Times New Roman" w:cs="Times New Roman"/>
@@ -920,19 +649,24 @@
           <w:szCs w:val="26"/>
           <w:highlight w:val="white"/>
         </w:rPr>
-      </w:pPr>
+        <w:numPr>
+          <w:ilvl w:val="0"/>
+          <w:numId w:val="23"/>
+        </w:numPr>
+      </w:pPr>
+      <w:r>
+        <w:t>Bước 7. Tạo thư mục con: Trong thư mục ThucHanh_HoTenSinhVien, chọn New → Folder và đặt tên là TaiLieu.</w:t>
+      </w:r>
     </w:p>
     <w:p>
       <w:pPr>
+        <w:pStyle w:val="Caption"/>
         <w:keepNext w:val="0"/>
         <w:keepLines w:val="0"/>
-        <w:numPr>
-          <w:ilvl w:val="0"/>
-          <w:numId w:val="5"/>
-        </w:numPr>
         <w:shd w:val="clear" w:color="auto" w:fill="FFFFFF"/>
-        <w:spacing w:after="120" w:line="276" w:lineRule="auto" w:before="0"/>
-        <w:jc w:val="left"/>
+        <w:spacing w:after="160" w:line="240" w:lineRule="auto" w:before="80"/>
+        <w:ind/>
+        <w:jc w:val="center"/>
         <w:rPr>
           <w:rFonts w:ascii="Times New Roman" w:eastAsia="Times New Roman" w:hAnsi="Times New Roman" w:cs="Times New Roman"/>
           <w:sz w:val="26"/>
@@ -943,38 +677,9 @@
       <w:r>
         <w:rPr>
           <w:rFonts w:ascii="Arial" w:eastAsia="Arial" w:hAnsi="Arial" w:cs="Arial"/>
-          <w:b/>
-          <w:bCs/>
-          <w:highlight w:val="white"/>
-        </w:rPr>
-        <w:t>Tạo thư mục con:</w:t>
-      </w:r>
-      <w:r>
-        <w:rPr>
-          <w:rFonts w:ascii="Arial" w:eastAsia="Arial" w:hAnsi="Arial" w:cs="Arial"/>
-          <w:highlight w:val="white"/>
-        </w:rPr>
-        <w:t xml:space="preserve"> Trong thư mục ThucHanh_NguyenVanA, nhấp chuột phải -&gt; New -&gt; Folder. Đặt tên là TaiLieu.</w:t>
-      </w:r>
-    </w:p>
-    <w:p>
-      <w:pPr>
-        <w:keepNext w:val="0"/>
-        <w:keepLines w:val="0"/>
-        <w:shd w:val="clear" w:color="auto" w:fill="FFFFFF"/>
-        <w:spacing w:after="40" w:line="240" w:lineRule="auto" w:before="0"/>
-        <w:ind w:left="141"/>
-        <w:jc w:val="left"/>
-        <w:rPr>
-          <w:rFonts w:ascii="Times New Roman" w:eastAsia="Times New Roman" w:hAnsi="Times New Roman" w:cs="Times New Roman"/>
-          <w:sz w:val="26"/>
-          <w:szCs w:val="26"/>
-          <w:highlight w:val="white"/>
-        </w:rPr>
-      </w:pPr>
-      <w:r>
-        <w:rPr>
-          <w:rFonts w:ascii="Arial" w:eastAsia="Arial" w:hAnsi="Arial" w:cs="Arial"/>
+          <w:i/>
+          <w:color w:val="66737D"/>
+          <w:sz w:val="19"/>
         </w:rPr>
         <w:lastRenderedPageBreak/>
         <w:drawing>
@@ -1016,11 +721,12 @@
     </w:p>
     <w:p>
       <w:pPr>
+        <w:pStyle w:val="ListParagraph"/>
         <w:keepNext w:val="0"/>
         <w:keepLines w:val="0"/>
+        <w:widowControl/>
         <w:shd w:val="clear" w:color="auto" w:fill="FFFFFF"/>
-        <w:spacing w:after="40" w:line="240" w:lineRule="auto" w:before="0"/>
-        <w:ind w:left="425"/>
+        <w:spacing w:line="276" w:lineRule="auto" w:before="160" w:after="60"/>
         <w:jc w:val="left"/>
         <w:rPr>
           <w:rFonts w:ascii="Times New Roman" w:eastAsia="Times New Roman" w:hAnsi="Times New Roman" w:cs="Times New Roman"/>
@@ -1028,15 +734,23 @@
           <w:szCs w:val="26"/>
           <w:highlight w:val="white"/>
         </w:rPr>
-      </w:pPr>
+        <w:numPr>
+          <w:ilvl w:val="0"/>
+          <w:numId w:val="23"/>
+        </w:numPr>
+      </w:pPr>
+      <w:r>
+        <w:t>Bước 8. Sao chép tệp tin (Copy/Paste): Chọn GhiChuQuanTrong.txt, nhấn Ctrl + C; mở thư mục TaiLieu và nhấn Ctrl + V để tạo một bản sao.</w:t>
+      </w:r>
     </w:p>
     <w:p>
       <w:pPr>
+        <w:pStyle w:val="ListParagraph"/>
         <w:keepNext w:val="0"/>
         <w:keepLines w:val="0"/>
+        <w:widowControl/>
         <w:shd w:val="clear" w:color="auto" w:fill="FFFFFF"/>
-        <w:spacing w:after="40" w:line="240" w:lineRule="auto" w:before="0"/>
-        <w:ind w:left="425"/>
+        <w:spacing w:after="120" w:line="276" w:lineRule="auto" w:before="0"/>
         <w:jc w:val="left"/>
         <w:rPr>
           <w:rFonts w:ascii="Times New Roman" w:eastAsia="Times New Roman" w:hAnsi="Times New Roman" w:cs="Times New Roman"/>
@@ -1044,20 +758,24 @@
           <w:szCs w:val="26"/>
           <w:highlight w:val="white"/>
         </w:rPr>
-      </w:pPr>
+        <w:numPr>
+          <w:ilvl w:val="1"/>
+          <w:numId w:val="25"/>
+        </w:numPr>
+      </w:pPr>
+      <w:r>
+        <w:t>• Chi tiết: Nhấp chuột phải vào tệp GhiChuQuanTrong.txt → chọn Copy (hoặc chọn tệp rồi nhấn Ctrl + C).</w:t>
+      </w:r>
     </w:p>
     <w:p>
       <w:pPr>
-        <w:pStyle w:val="Heading3"/>
+        <w:pStyle w:val="Caption"/>
         <w:keepNext w:val="0"/>
         <w:keepLines w:val="0"/>
-        <w:numPr>
-          <w:ilvl w:val="0"/>
-          <w:numId w:val="5"/>
-        </w:numPr>
         <w:shd w:val="clear" w:color="auto" w:fill="FFFFFF"/>
-        <w:spacing w:line="240" w:lineRule="auto" w:before="160" w:after="60"/>
-        <w:jc w:val="left"/>
+        <w:spacing w:after="160" w:line="240" w:lineRule="auto" w:before="80"/>
+        <w:ind/>
+        <w:jc w:val="center"/>
         <w:rPr>
           <w:rFonts w:ascii="Times New Roman" w:eastAsia="Times New Roman" w:hAnsi="Times New Roman" w:cs="Times New Roman"/>
           <w:sz w:val="26"/>
@@ -1068,60 +786,9 @@
       <w:r>
         <w:rPr>
           <w:rFonts w:ascii="Arial" w:eastAsia="Arial" w:hAnsi="Arial" w:cs="Arial"/>
-          <w:b/>
-          <w:bCs/>
-          <w:color w:val="0F766E"/>
-          <w:sz w:val="23"/>
-          <w:szCs w:val="26"/>
-          <w:highlight w:val="white"/>
-        </w:rPr>
-        <w:t>Sao chép tệp tin (Copy &amp; Paste):</w:t>
-      </w:r>
-    </w:p>
-    <w:p>
-      <w:pPr>
-        <w:keepNext w:val="0"/>
-        <w:keepLines w:val="0"/>
-        <w:numPr>
-          <w:ilvl w:val="0"/>
-          <w:numId w:val="6"/>
-        </w:numPr>
-        <w:shd w:val="clear" w:color="auto" w:fill="FFFFFF"/>
-        <w:spacing w:after="120" w:line="276" w:lineRule="auto" w:before="0"/>
-        <w:jc w:val="left"/>
-        <w:rPr>
-          <w:rFonts w:ascii="Times New Roman" w:eastAsia="Times New Roman" w:hAnsi="Times New Roman" w:cs="Times New Roman"/>
-          <w:sz w:val="26"/>
-          <w:szCs w:val="26"/>
-          <w:highlight w:val="white"/>
-        </w:rPr>
-      </w:pPr>
-      <w:r>
-        <w:rPr>
-          <w:rFonts w:ascii="Arial" w:eastAsia="Arial" w:hAnsi="Arial" w:cs="Arial"/>
-          <w:highlight w:val="white"/>
-        </w:rPr>
-        <w:t>Nhấp chuột phải vào tệp GhiChuQuanTrong.txt -&gt; chọn Copy (hoặc chọn tệp rồi nhấn Ctrl + C).</w:t>
-      </w:r>
-    </w:p>
-    <w:p>
-      <w:pPr>
-        <w:keepNext w:val="0"/>
-        <w:keepLines w:val="0"/>
-        <w:shd w:val="clear" w:color="auto" w:fill="FFFFFF"/>
-        <w:spacing w:after="40" w:line="240" w:lineRule="auto" w:before="0"/>
-        <w:ind w:left="141"/>
-        <w:jc w:val="left"/>
-        <w:rPr>
-          <w:rFonts w:ascii="Times New Roman" w:eastAsia="Times New Roman" w:hAnsi="Times New Roman" w:cs="Times New Roman"/>
-          <w:sz w:val="26"/>
-          <w:szCs w:val="26"/>
-          <w:highlight w:val="white"/>
-        </w:rPr>
-      </w:pPr>
-      <w:r>
-        <w:rPr>
-          <w:rFonts w:ascii="Arial" w:eastAsia="Arial" w:hAnsi="Arial" w:cs="Arial"/>
+          <w:i/>
+          <w:color w:val="66737D"/>
+          <w:sz w:val="19"/>
         </w:rPr>
         <w:drawing>
           <wp:inline distT="0" distB="0" distL="0" distR="0" wp14:anchorId="3DA4D4EF" wp14:editId="38589C2E">
@@ -1162,12 +829,10 @@
     </w:p>
     <w:p>
       <w:pPr>
+        <w:pStyle w:val="ListParagraph"/>
         <w:keepNext w:val="0"/>
         <w:keepLines w:val="0"/>
-        <w:numPr>
-          <w:ilvl w:val="0"/>
-          <w:numId w:val="4"/>
-        </w:numPr>
+        <w:widowControl/>
         <w:shd w:val="clear" w:color="auto" w:fill="FFFFFF"/>
         <w:spacing w:after="120" w:line="276" w:lineRule="auto" w:before="0"/>
         <w:jc w:val="left"/>
@@ -1177,24 +842,24 @@
           <w:szCs w:val="26"/>
           <w:highlight w:val="white"/>
         </w:rPr>
+        <w:numPr>
+          <w:ilvl w:val="1"/>
+          <w:numId w:val="25"/>
+        </w:numPr>
       </w:pPr>
       <w:r>
-        <w:rPr>
-          <w:rFonts w:ascii="Arial" w:eastAsia="Arial" w:hAnsi="Arial" w:cs="Arial"/>
-          <w:highlight w:val="white"/>
-        </w:rPr>
-        <w:lastRenderedPageBreak/>
-        <w:t>Nhấp đúp vào thư mục TaiLieu, nhấp chuột phải vào khoảng trống bên trong -&gt; chọn Paste (hoặc nhấn Ctrl + V). Bây giờ bạn có một bản sao của tệp trong thư mục TaiLieu.</w:t>
+        <w:t>• Chi tiết: Nhấp đúp vào thư mục TaiLieu, nhấp chuột phải vào khoảng trống bên trong → chọn Paste (hoặc nhấn Ctrl + V). Bây giờ bạn có một bản sao của tệp trong thư mục TaiLieu.</w:t>
       </w:r>
     </w:p>
     <w:p>
       <w:pPr>
+        <w:pStyle w:val="Caption"/>
         <w:keepNext w:val="0"/>
         <w:keepLines w:val="0"/>
         <w:shd w:val="clear" w:color="auto" w:fill="FFFFFF"/>
-        <w:spacing w:after="40" w:line="240" w:lineRule="auto" w:before="0"/>
-        <w:ind w:left="141"/>
-        <w:jc w:val="left"/>
+        <w:spacing w:after="160" w:line="240" w:lineRule="auto" w:before="80"/>
+        <w:ind/>
+        <w:jc w:val="center"/>
         <w:rPr>
           <w:rFonts w:ascii="Times New Roman" w:eastAsia="Times New Roman" w:hAnsi="Times New Roman" w:cs="Times New Roman"/>
           <w:sz w:val="26"/>
@@ -1205,6 +870,9 @@
       <w:r>
         <w:rPr>
           <w:rFonts w:ascii="Arial" w:eastAsia="Arial" w:hAnsi="Arial" w:cs="Arial"/>
+          <w:i/>
+          <w:color w:val="66737D"/>
+          <w:sz w:val="19"/>
         </w:rPr>
         <w:drawing>
           <wp:inline distT="0" distB="0" distL="0" distR="0" wp14:anchorId="2537AC21" wp14:editId="270A513E">
@@ -1245,15 +913,12 @@
     </w:p>
     <w:p>
       <w:pPr>
-        <w:pStyle w:val="Heading3"/>
+        <w:pStyle w:val="ListParagraph"/>
         <w:keepNext w:val="0"/>
         <w:keepLines w:val="0"/>
-        <w:numPr>
-          <w:ilvl w:val="0"/>
-          <w:numId w:val="5"/>
-        </w:numPr>
+        <w:widowControl/>
         <w:shd w:val="clear" w:color="auto" w:fill="FFFFFF"/>
-        <w:spacing w:line="240" w:lineRule="auto" w:before="160" w:after="60"/>
+        <w:spacing w:line="276" w:lineRule="auto" w:before="160" w:after="60"/>
         <w:jc w:val="left"/>
         <w:rPr>
           <w:rFonts w:ascii="Times New Roman" w:eastAsia="Times New Roman" w:hAnsi="Times New Roman" w:cs="Times New Roman"/>
@@ -1261,28 +926,21 @@
           <w:szCs w:val="26"/>
           <w:highlight w:val="white"/>
         </w:rPr>
+        <w:numPr>
+          <w:ilvl w:val="0"/>
+          <w:numId w:val="23"/>
+        </w:numPr>
       </w:pPr>
       <w:r>
-        <w:rPr>
-          <w:rFonts w:ascii="Arial" w:eastAsia="Arial" w:hAnsi="Arial" w:cs="Arial"/>
-          <w:b/>
-          <w:bCs/>
-          <w:color w:val="0F766E"/>
-          <w:sz w:val="23"/>
-          <w:szCs w:val="26"/>
-          <w:highlight w:val="white"/>
-        </w:rPr>
-        <w:t>Di chuyển tệp tin (Cut &amp; Paste):</w:t>
+        <w:t>Bước 9. Di chuyển tệp tin (Cut/Paste): Quay lại thư mục chính, tạo tệp DiChuyen.txt; chọn tệp, nhấn Ctrl + X; mở TaiLieu và nhấn Ctrl + V.</w:t>
       </w:r>
     </w:p>
     <w:p>
       <w:pPr>
+        <w:pStyle w:val="ListParagraph"/>
         <w:keepNext w:val="0"/>
         <w:keepLines w:val="0"/>
-        <w:numPr>
-          <w:ilvl w:val="0"/>
-          <w:numId w:val="3"/>
-        </w:numPr>
+        <w:widowControl/>
         <w:shd w:val="clear" w:color="auto" w:fill="FFFFFF"/>
         <w:spacing w:after="120" w:line="276" w:lineRule="auto" w:before="0"/>
         <w:jc w:val="left"/>
@@ -1292,23 +950,24 @@
           <w:szCs w:val="26"/>
           <w:highlight w:val="white"/>
         </w:rPr>
+        <w:numPr>
+          <w:ilvl w:val="1"/>
+          <w:numId w:val="25"/>
+        </w:numPr>
       </w:pPr>
       <w:r>
-        <w:rPr>
-          <w:rFonts w:ascii="Arial" w:eastAsia="Arial" w:hAnsi="Arial" w:cs="Arial"/>
-          <w:highlight w:val="white"/>
-        </w:rPr>
-        <w:t>Quay lại thư mục ThucHanh_NguyenVanA. Tạo một tệp mới tên là DiChuyen.txt.</w:t>
+        <w:t>• Chi tiết: Quay lại thư mục ThucHanh_TrinhThiKieuOanh. Tạo một tệp mới tên là DiChuyen.txt.</w:t>
       </w:r>
     </w:p>
     <w:p>
       <w:pPr>
+        <w:pStyle w:val="Caption"/>
         <w:keepNext w:val="0"/>
         <w:keepLines w:val="0"/>
         <w:shd w:val="clear" w:color="auto" w:fill="FFFFFF"/>
-        <w:spacing w:after="40" w:line="240" w:lineRule="auto" w:before="0"/>
-        <w:ind w:left="141"/>
-        <w:jc w:val="left"/>
+        <w:spacing w:after="160" w:line="240" w:lineRule="auto" w:before="80"/>
+        <w:ind/>
+        <w:jc w:val="center"/>
         <w:rPr>
           <w:rFonts w:ascii="Times New Roman" w:eastAsia="Times New Roman" w:hAnsi="Times New Roman" w:cs="Times New Roman"/>
           <w:sz w:val="26"/>
@@ -1319,6 +978,9 @@
       <w:r>
         <w:rPr>
           <w:rFonts w:ascii="Arial" w:eastAsia="Arial" w:hAnsi="Arial" w:cs="Arial"/>
+          <w:i/>
+          <w:color w:val="66737D"/>
+          <w:sz w:val="19"/>
         </w:rPr>
         <w:drawing>
           <wp:inline distT="0" distB="0" distL="0" distR="0" wp14:anchorId="66258CCA" wp14:editId="179AEB88">
@@ -1359,12 +1021,10 @@
     </w:p>
     <w:p>
       <w:pPr>
+        <w:pStyle w:val="ListParagraph"/>
         <w:keepNext w:val="0"/>
         <w:keepLines w:val="0"/>
-        <w:numPr>
-          <w:ilvl w:val="0"/>
-          <w:numId w:val="1"/>
-        </w:numPr>
+        <w:widowControl/>
         <w:shd w:val="clear" w:color="auto" w:fill="FFFFFF"/>
         <w:spacing w:after="120" w:line="276" w:lineRule="auto" w:before="0"/>
         <w:jc w:val="left"/>
@@ -1374,24 +1034,24 @@
           <w:szCs w:val="26"/>
           <w:highlight w:val="white"/>
         </w:rPr>
+        <w:numPr>
+          <w:ilvl w:val="1"/>
+          <w:numId w:val="25"/>
+        </w:numPr>
       </w:pPr>
       <w:r>
-        <w:rPr>
-          <w:rFonts w:ascii="Arial" w:eastAsia="Arial" w:hAnsi="Arial" w:cs="Arial"/>
-          <w:highlight w:val="white"/>
-        </w:rPr>
-        <w:lastRenderedPageBreak/>
-        <w:t>Nhấp chuột phải vào tệp DiChuyen.txt -&gt; chọn Cut (hoặc chọn tệp rồi nhấn Ctrl + X).</w:t>
+        <w:t>• Chi tiết: Nhấp chuột phải vào tệp DiChuyen.txt → chọn Cut (hoặc chọn tệp rồi nhấn Ctrl + X).</w:t>
       </w:r>
     </w:p>
     <w:p>
       <w:pPr>
+        <w:pStyle w:val="Caption"/>
         <w:keepNext w:val="0"/>
         <w:keepLines w:val="0"/>
         <w:shd w:val="clear" w:color="auto" w:fill="FFFFFF"/>
-        <w:spacing w:after="40" w:line="240" w:lineRule="auto" w:before="0"/>
-        <w:ind w:left="141"/>
-        <w:jc w:val="left"/>
+        <w:spacing w:after="160" w:line="240" w:lineRule="auto" w:before="80"/>
+        <w:ind/>
+        <w:jc w:val="center"/>
         <w:rPr>
           <w:rFonts w:ascii="Times New Roman" w:eastAsia="Times New Roman" w:hAnsi="Times New Roman" w:cs="Times New Roman"/>
           <w:sz w:val="26"/>
@@ -1402,6 +1062,9 @@
       <w:r>
         <w:rPr>
           <w:rFonts w:ascii="Arial" w:eastAsia="Arial" w:hAnsi="Arial" w:cs="Arial"/>
+          <w:i/>
+          <w:color w:val="66737D"/>
+          <w:sz w:val="19"/>
         </w:rPr>
         <w:drawing>
           <wp:inline distT="0" distB="0" distL="0" distR="0" wp14:anchorId="07639C74" wp14:editId="5BF1641C">
@@ -1442,12 +1105,10 @@
     </w:p>
     <w:p>
       <w:pPr>
+        <w:pStyle w:val="ListParagraph"/>
         <w:keepNext w:val="0"/>
         <w:keepLines w:val="0"/>
-        <w:numPr>
-          <w:ilvl w:val="0"/>
-          <w:numId w:val="2"/>
-        </w:numPr>
+        <w:widowControl/>
         <w:shd w:val="clear" w:color="auto" w:fill="FFFFFF"/>
         <w:spacing w:after="120" w:line="276" w:lineRule="auto" w:before="0"/>
         <w:jc w:val="left"/>
@@ -1457,23 +1118,24 @@
           <w:szCs w:val="26"/>
           <w:highlight w:val="white"/>
         </w:rPr>
+        <w:numPr>
+          <w:ilvl w:val="1"/>
+          <w:numId w:val="25"/>
+        </w:numPr>
       </w:pPr>
       <w:r>
-        <w:rPr>
-          <w:rFonts w:ascii="Arial" w:eastAsia="Arial" w:hAnsi="Arial" w:cs="Arial"/>
-          <w:highlight w:val="white"/>
-        </w:rPr>
-        <w:t>Nhấp đúp vào thư mục TaiLieu, nhấp chuột phải vào khoảng trống -&gt; chọn Paste (hoặc nhấn Ctrl + V). Tệp gốc đã biến mất khỏi vị trí cũ và chỉ còn ở vị trí mới.</w:t>
+        <w:t>• Chi tiết: Nhấp đúp vào thư mục TaiLieu, nhấp chuột phải vào khoảng trống → chọn Paste (hoặc nhấn Ctrl + V). Tệp gốc đã biến mất khỏi vị trí cũ và chỉ còn ở vị trí mới.</w:t>
       </w:r>
     </w:p>
     <w:p>
       <w:pPr>
+        <w:pStyle w:val="Caption"/>
         <w:keepNext w:val="0"/>
         <w:keepLines w:val="0"/>
         <w:shd w:val="clear" w:color="auto" w:fill="FFFFFF"/>
-        <w:spacing w:after="40" w:line="240" w:lineRule="auto" w:before="0"/>
-        <w:ind w:left="141"/>
-        <w:jc w:val="left"/>
+        <w:spacing w:after="160" w:line="240" w:lineRule="auto" w:before="80"/>
+        <w:ind/>
+        <w:jc w:val="center"/>
         <w:rPr>
           <w:rFonts w:ascii="Times New Roman" w:eastAsia="Times New Roman" w:hAnsi="Times New Roman" w:cs="Times New Roman"/>
           <w:sz w:val="26"/>
@@ -1484,6 +1146,9 @@
       <w:r>
         <w:rPr>
           <w:rFonts w:ascii="Arial" w:eastAsia="Arial" w:hAnsi="Arial" w:cs="Arial"/>
+          <w:i/>
+          <w:color w:val="66737D"/>
+          <w:sz w:val="19"/>
         </w:rPr>
         <w:lastRenderedPageBreak/>
         <w:drawing>
@@ -1525,14 +1190,20 @@
       <w:r>
         <w:rPr>
           <w:rFonts w:ascii="Arial" w:hAnsi="Arial" w:eastAsia="Arial" w:cs="Arial"/>
+          <w:i/>
           <w:noProof/>
           <w14:ligatures w14:val="standardContextual"/>
+          <w:color w:val="66737D"/>
+          <w:sz w:val="19"/>
         </w:rPr>
         <w:t xml:space="preserve"> </w:t>
       </w:r>
       <w:r>
         <w:rPr>
           <w:rFonts w:ascii="Arial" w:eastAsia="Arial" w:hAnsi="Arial" w:cs="Arial"/>
+          <w:i/>
+          <w:color w:val="66737D"/>
+          <w:sz w:val="19"/>
         </w:rPr>
         <w:drawing>
           <wp:inline distT="0" distB="0" distL="0" distR="0" wp14:anchorId="4B035759" wp14:editId="4879DC9F">
@@ -1573,10 +1244,12 @@
     </w:p>
     <w:p>
       <w:pPr>
+        <w:pStyle w:val="ListParagraph"/>
         <w:keepNext w:val="0"/>
         <w:keepLines w:val="0"/>
+        <w:widowControl/>
         <w:shd w:val="clear" w:color="auto" w:fill="FFFFFF"/>
-        <w:spacing w:after="40" w:line="240" w:lineRule="auto" w:before="0"/>
+        <w:spacing w:after="120" w:line="276" w:lineRule="auto" w:before="0"/>
         <w:jc w:val="left"/>
         <w:rPr>
           <w:rFonts w:ascii="Times New Roman" w:eastAsia="Times New Roman" w:hAnsi="Times New Roman" w:cs="Times New Roman"/>
@@ -1584,66 +1257,24 @@
           <w:szCs w:val="26"/>
           <w:highlight w:val="white"/>
         </w:rPr>
-      </w:pPr>
+        <w:numPr>
+          <w:ilvl w:val="0"/>
+          <w:numId w:val="23"/>
+        </w:numPr>
+      </w:pPr>
+      <w:r>
+        <w:t>Bước 10. Xóa tệp tin: Trong thư mục TaiLieu, chọn GhiChuQuanTrong.txt và nhấn Delete. Tệp sẽ được chuyển vào Recycle Bin.</w:t>
+      </w:r>
     </w:p>
     <w:p>
       <w:pPr>
+        <w:pStyle w:val="Caption"/>
         <w:keepNext w:val="0"/>
         <w:keepLines w:val="0"/>
         <w:shd w:val="clear" w:color="auto" w:fill="FFFFFF"/>
-        <w:spacing w:after="40" w:line="240" w:lineRule="auto" w:before="0"/>
-        <w:jc w:val="left"/>
-        <w:rPr>
-          <w:rFonts w:ascii="Times New Roman" w:eastAsia="Times New Roman" w:hAnsi="Times New Roman" w:cs="Times New Roman"/>
-          <w:sz w:val="26"/>
-          <w:szCs w:val="26"/>
-          <w:highlight w:val="white"/>
-        </w:rPr>
-      </w:pPr>
-    </w:p>
-    <w:p>
-      <w:pPr>
-        <w:keepNext w:val="0"/>
-        <w:keepLines w:val="0"/>
-        <w:numPr>
-          <w:ilvl w:val="0"/>
-          <w:numId w:val="5"/>
-        </w:numPr>
-        <w:shd w:val="clear" w:color="auto" w:fill="FFFFFF"/>
-        <w:spacing w:after="120" w:line="276" w:lineRule="auto" w:before="0"/>
-        <w:jc w:val="left"/>
-        <w:rPr>
-          <w:rFonts w:ascii="Times New Roman" w:eastAsia="Times New Roman" w:hAnsi="Times New Roman" w:cs="Times New Roman"/>
-          <w:sz w:val="26"/>
-          <w:szCs w:val="26"/>
-          <w:highlight w:val="white"/>
-        </w:rPr>
-      </w:pPr>
-      <w:r>
-        <w:rPr>
-          <w:rFonts w:ascii="Arial" w:eastAsia="Arial" w:hAnsi="Arial" w:cs="Arial"/>
-          <w:b/>
-          <w:bCs/>
-          <w:highlight w:val="white"/>
-        </w:rPr>
-        <w:t>Xóa tệp tin:</w:t>
-      </w:r>
-      <w:r>
-        <w:rPr>
-          <w:rFonts w:ascii="Arial" w:eastAsia="Arial" w:hAnsi="Arial" w:cs="Arial"/>
-          <w:highlight w:val="white"/>
-        </w:rPr>
-        <w:t xml:space="preserve"> Trong thư mục TaiLieu, nhấp chuột phải vào tệp GhiChuQuanTrong.txt -&gt; chọn Delete. Tệp sẽ được chuyển vào Thùng rác (Recycle Bin).</w:t>
-      </w:r>
-    </w:p>
-    <w:p>
-      <w:pPr>
-        <w:keepNext w:val="0"/>
-        <w:keepLines w:val="0"/>
-        <w:shd w:val="clear" w:color="auto" w:fill="FFFFFF"/>
-        <w:spacing w:after="40" w:line="240" w:lineRule="auto" w:before="0"/>
-        <w:ind w:left="141"/>
-        <w:jc w:val="left"/>
+        <w:spacing w:after="160" w:line="240" w:lineRule="auto" w:before="80"/>
+        <w:ind/>
+        <w:jc w:val="center"/>
         <w:rPr>
           <w:rFonts w:ascii="Times New Roman" w:eastAsia="Times New Roman" w:hAnsi="Times New Roman" w:cs="Times New Roman"/>
           <w:b/>
@@ -1658,6 +1289,9 @@
           <w:rFonts w:ascii="Arial" w:eastAsia="Arial" w:hAnsi="Arial" w:cs="Arial"/>
           <w:b/>
           <w:bCs/>
+          <w:i/>
+          <w:color w:val="66737D"/>
+          <w:sz w:val="19"/>
         </w:rPr>
         <w:lastRenderedPageBreak/>
         <w:drawing>
@@ -1699,12 +1333,10 @@
     </w:p>
     <w:p>
       <w:pPr>
+        <w:pStyle w:val="ListParagraph"/>
         <w:keepNext w:val="0"/>
         <w:keepLines w:val="0"/>
-        <w:numPr>
-          <w:ilvl w:val="0"/>
-          <w:numId w:val="5"/>
-        </w:numPr>
+        <w:widowControl/>
         <w:shd w:val="clear" w:color="auto" w:fill="FFFFFF"/>
         <w:spacing w:after="120" w:line="276" w:lineRule="auto" w:before="0"/>
         <w:jc w:val="left"/>
@@ -1714,32 +1346,24 @@
           <w:szCs w:val="26"/>
           <w:highlight w:val="white"/>
         </w:rPr>
+        <w:numPr>
+          <w:ilvl w:val="0"/>
+          <w:numId w:val="23"/>
+        </w:numPr>
       </w:pPr>
       <w:r>
-        <w:rPr>
-          <w:rFonts w:ascii="Arial" w:eastAsia="Arial" w:hAnsi="Arial" w:cs="Arial"/>
-          <w:b/>
-          <w:bCs/>
-          <w:highlight w:val="white"/>
-        </w:rPr>
-        <w:t>Xóa vĩnh viễn:</w:t>
-      </w:r>
-      <w:r>
-        <w:rPr>
-          <w:rFonts w:ascii="Arial" w:eastAsia="Arial" w:hAnsi="Arial" w:cs="Arial"/>
-          <w:highlight w:val="white"/>
-        </w:rPr>
-        <w:t xml:space="preserve"> Chọn tệp DiChuyen.txt, nhấn giữ phím Shift và nhấn phím Delete. Một cảnh báo sẽ hiện ra. Nếu đồng ý, tệp sẽ bị xóa vĩnh viễn mà không qua Thùng rác.</w:t>
+        <w:t>Bước 11. Xóa vĩnh viễn: Chọn DiChuyen.txt, giữ Shift và nhấn Delete. Chỉ xác nhận khi chắc chắn không cần khôi phục tệp.</w:t>
       </w:r>
     </w:p>
     <w:p>
       <w:pPr>
+        <w:pStyle w:val="Caption"/>
         <w:keepNext w:val="0"/>
         <w:keepLines w:val="0"/>
         <w:shd w:val="clear" w:color="auto" w:fill="FFFFFF"/>
-        <w:spacing w:after="40" w:line="240" w:lineRule="auto" w:before="0"/>
-        <w:ind w:left="141"/>
-        <w:jc w:val="left"/>
+        <w:spacing w:after="160" w:line="240" w:lineRule="auto" w:before="80"/>
+        <w:ind/>
+        <w:jc w:val="center"/>
         <w:rPr>
           <w:rFonts w:ascii="Times New Roman" w:eastAsia="Times New Roman" w:hAnsi="Times New Roman" w:cs="Times New Roman"/>
           <w:sz w:val="26"/>
@@ -1750,6 +1374,9 @@
       <w:r>
         <w:rPr>
           <w:rFonts w:ascii="Arial" w:eastAsia="Arial" w:hAnsi="Arial" w:cs="Arial"/>
+          <w:i/>
+          <w:color w:val="66737D"/>
+          <w:sz w:val="19"/>
         </w:rPr>
         <w:drawing>
           <wp:inline distT="0" distB="0" distL="0" distR="0" wp14:anchorId="195C02FB" wp14:editId="4777A197">
@@ -1790,12 +1417,10 @@
     </w:p>
     <w:p>
       <w:pPr>
+        <w:pStyle w:val="ListParagraph"/>
         <w:keepNext w:val="0"/>
         <w:keepLines w:val="0"/>
-        <w:numPr>
-          <w:ilvl w:val="0"/>
-          <w:numId w:val="5"/>
-        </w:numPr>
+        <w:widowControl/>
         <w:shd w:val="clear" w:color="auto" w:fill="FFFFFF"/>
         <w:spacing w:after="120" w:line="276" w:lineRule="auto" w:before="0"/>
         <w:jc w:val="left"/>
@@ -1805,32 +1430,24 @@
           <w:szCs w:val="26"/>
           <w:highlight w:val="white"/>
         </w:rPr>
+        <w:numPr>
+          <w:ilvl w:val="0"/>
+          <w:numId w:val="23"/>
+        </w:numPr>
       </w:pPr>
       <w:r>
-        <w:rPr>
-          <w:rFonts w:ascii="Arial" w:eastAsia="Arial" w:hAnsi="Arial" w:cs="Arial"/>
-          <w:b/>
-          <w:bCs/>
-          <w:highlight w:val="white"/>
-        </w:rPr>
-        <w:t xml:space="preserve">Khôi phục từ Thùng rác (Tùy chọn): </w:t>
-      </w:r>
-      <w:r>
-        <w:rPr>
-          <w:rFonts w:ascii="Arial" w:eastAsia="Arial" w:hAnsi="Arial" w:cs="Arial"/>
-          <w:highlight w:val="white"/>
-        </w:rPr>
-        <w:t>Tìm biểu tượng Recycle Bin trên màn hình nền, nhấp đúp để mở. Tìm tệp GhiChuQuanTrong.txt đã xóa, nhấp chuột phải vào nó và chọn Restore. Tệp sẽ quay trở lại vị trí ban đầu.</w:t>
+        <w:t>Bước 12. Khôi phục từ Recycle Bin: Mở Recycle Bin, chọn GhiChuQuanTrong.txt, nhấp chuột phải và chọn Restore; sau đó kiểm tra lại vị trí ban đầu.</w:t>
       </w:r>
     </w:p>
     <w:p>
       <w:pPr>
+        <w:pStyle w:val="Caption"/>
         <w:keepNext w:val="0"/>
         <w:keepLines w:val="0"/>
         <w:shd w:val="clear" w:color="auto" w:fill="FFFFFF"/>
-        <w:spacing w:after="40" w:line="240" w:lineRule="auto" w:before="0"/>
-        <w:ind w:left="141"/>
-        <w:jc w:val="left"/>
+        <w:spacing w:after="160" w:line="240" w:lineRule="auto" w:before="80"/>
+        <w:ind/>
+        <w:jc w:val="center"/>
         <w:rPr>
           <w:rFonts w:ascii="Times New Roman" w:eastAsia="Times New Roman" w:hAnsi="Times New Roman" w:cs="Times New Roman"/>
           <w:sz w:val="26"/>
@@ -1841,6 +1458,9 @@
       <w:r>
         <w:rPr>
           <w:rFonts w:ascii="Arial" w:eastAsia="Arial" w:hAnsi="Arial" w:cs="Arial"/>
+          <w:i/>
+          <w:color w:val="66737D"/>
+          <w:sz w:val="19"/>
         </w:rPr>
         <w:lastRenderedPageBreak/>
         <w:drawing>
@@ -1882,14 +1502,20 @@
       <w:r>
         <w:rPr>
           <w:rFonts w:ascii="Arial" w:hAnsi="Arial" w:eastAsia="Arial" w:cs="Arial"/>
+          <w:i/>
           <w:noProof/>
           <w14:ligatures w14:val="standardContextual"/>
+          <w:color w:val="66737D"/>
+          <w:sz w:val="19"/>
         </w:rPr>
         <w:t xml:space="preserve"> </w:t>
       </w:r>
       <w:r>
         <w:rPr>
           <w:rFonts w:ascii="Arial" w:eastAsia="Arial" w:hAnsi="Arial" w:cs="Arial"/>
+          <w:i/>
+          <w:color w:val="66737D"/>
+          <w:sz w:val="19"/>
         </w:rPr>
         <w:drawing>
           <wp:inline distT="0" distB="0" distL="0" distR="0" wp14:anchorId="565EF65A" wp14:editId="6E57C24F">
@@ -1928,38 +1554,53 @@
         </w:drawing>
       </w:r>
     </w:p>
-    <w:p>
-      <w:pPr>
-        <w:keepNext w:val="0"/>
-        <w:keepLines w:val="0"/>
-        <w:spacing w:line="240" w:lineRule="auto" w:before="0" w:after="40"/>
-        <w:jc w:val="left"/>
-        <w:rPr>
-          <w:rFonts w:ascii="Times New Roman" w:eastAsia="Times New Roman" w:hAnsi="Times New Roman" w:cs="Times New Roman"/>
-          <w:b/>
-          <w:bCs/>
-          <w:sz w:val="26"/>
-          <w:szCs w:val="26"/>
-          <w:highlight w:val="white"/>
-        </w:rPr>
-      </w:pPr>
-    </w:p>
-    <w:p>
-      <w:pPr>
-        <w:keepNext w:val="0"/>
-        <w:keepLines w:val="0"/>
-        <w:spacing w:before="0" w:after="40" w:line="240" w:lineRule="auto"/>
-        <w:jc w:val="left"/>
-      </w:pPr>
-    </w:p>
     <w:sectPr>
+      <w:footerReference w:type="default" r:id="rId25"/>
       <w:pgSz w:w="11906" w:h="16838"/>
-      <w:pgMar w:top="1134" w:right="1134" w:bottom="1134" w:left="1134" w:header="567" w:footer="567" w:gutter="0"/>
+      <w:pgMar w:top="1020" w:right="1020" w:bottom="907" w:left="1020" w:header="454" w:footer="454" w:gutter="0"/>
       <w:pgNumType w:start="1"/>
       <w:cols w:space="720"/>
     </w:sectPr>
   </w:body>
 </w:document>
+</file>
+
+<file path=word/footer1.xml><?xml version="1.0" encoding="utf-8"?>
+<w:ftr xmlns:m="http://schemas.openxmlformats.org/officeDocument/2006/math" xmlns:mc="http://schemas.openxmlformats.org/markup-compatibility/2006" xmlns:mo="http://schemas.microsoft.com/office/mac/office/2008/main" xmlns:mv="urn:schemas-microsoft-com:mac:vml" xmlns:o="urn:schemas-microsoft-com:office:office" xmlns:r="http://schemas.openxmlformats.org/officeDocument/2006/relationships" xmlns:v="urn:schemas-microsoft-com:vml" xmlns:w10="urn:schemas-microsoft-com:office:word" xmlns:w14="http://schemas.microsoft.com/office/word/2010/wordml" xmlns:w="http://schemas.openxmlformats.org/wordprocessingml/2006/main" xmlns:wne="http://schemas.microsoft.com/office/word/2006/wordml" xmlns:wp14="http://schemas.microsoft.com/office/word/2010/wordprocessingDrawing" xmlns:wp="http://schemas.openxmlformats.org/drawingml/2006/wordprocessingDrawing" xmlns:wpc="http://schemas.microsoft.com/office/word/2010/wordprocessingCanvas" xmlns:wpg="http://schemas.microsoft.com/office/word/2010/wordprocessingGroup" xmlns:wpi="http://schemas.microsoft.com/office/word/2010/wordprocessingInk" xmlns:wps="http://schemas.microsoft.com/office/word/2010/wordprocessingShape" mc:Ignorable="w14 wp14">
+  <w:p>
+    <w:pPr>
+      <w:pStyle w:val="Footer"/>
+      <w:jc w:val="center"/>
+    </w:pPr>
+    <w:r>
+      <w:rPr>
+        <w:rFonts w:ascii="Arial" w:hAnsi="Arial" w:cs="Arial" w:eastAsia="Arial"/>
+        <w:color w:val="66737D"/>
+        <w:sz w:val="17"/>
+      </w:rPr>
+    </w:r>
+    <w:r>
+      <w:rPr>
+        <w:rFonts w:ascii="Arial" w:hAnsi="Arial" w:cs="Arial" w:eastAsia="Arial"/>
+        <w:color w:val="66737D"/>
+        <w:sz w:val="17"/>
+      </w:rPr>
+      <w:t xml:space="preserve">TRỊNH THỊ KIỀU OANH · 25041302 · Trang </w:t>
+    </w:r>
+    <w:r>
+      <w:rPr>
+        <w:rFonts w:ascii="Arial" w:hAnsi="Arial" w:cs="Arial" w:eastAsia="Arial"/>
+        <w:color w:val="66737D"/>
+        <w:sz w:val="17"/>
+      </w:rPr>
+      <w:fldChar w:fldCharType="begin"/>
+      <w:instrText xml:space="preserve"> PAGE </w:instrText>
+      <w:fldChar w:fldCharType="separate"/>
+      <w:t>1</w:t>
+      <w:fldChar w:fldCharType="end"/>
+    </w:r>
+  </w:p>
+</w:ftr>
 </file>
 
 <file path=word/numbering.xml><?xml version="1.0" encoding="utf-8"?>
@@ -2677,6 +2318,507 @@
   </w:num>
   <w:num w:numId="6" w16cid:durableId="830101828">
     <w:abstractNumId w:val="3"/>
+  </w:num>
+  <w:abstractNum w:abstractNumId="8">
+    <w:multiLevelType w:val="hybridMultilevel"/>
+    <w:lvl w:ilvl="0">
+      <w:start w:val="1"/>
+      <w:numFmt w:val="decimal"/>
+      <w:lvlText w:val="%1."/>
+      <w:lvlJc w:val="left"/>
+      <w:pPr>
+        <w:tabs>
+          <w:tab w:val="num" w:pos="650"/>
+        </w:tabs>
+        <w:ind w:left="650" w:hanging="360"/>
+        <w:spacing w:after="60" w:line="276" w:lineRule="auto"/>
+      </w:pPr>
+    </w:lvl>
+    <w:lvl w:ilvl="1">
+      <w:start w:val="1"/>
+      <w:numFmt w:val="decimal"/>
+      <w:lvlText w:val="%2."/>
+      <w:lvlJc w:val="left"/>
+      <w:pPr>
+        <w:tabs>
+          <w:tab w:val="num" w:pos="1010"/>
+        </w:tabs>
+        <w:ind w:left="1010" w:hanging="360"/>
+        <w:spacing w:after="60" w:line="276" w:lineRule="auto"/>
+      </w:pPr>
+    </w:lvl>
+    <w:lvl w:ilvl="2">
+      <w:start w:val="1"/>
+      <w:numFmt w:val="decimal"/>
+      <w:lvlText w:val="%3."/>
+      <w:lvlJc w:val="left"/>
+      <w:pPr>
+        <w:tabs>
+          <w:tab w:val="num" w:pos="1370"/>
+        </w:tabs>
+        <w:ind w:left="1370" w:hanging="360"/>
+        <w:spacing w:after="60" w:line="276" w:lineRule="auto"/>
+      </w:pPr>
+    </w:lvl>
+  </w:abstractNum>
+  <w:num w:numId="7">
+    <w:abstractNumId w:val="8"/>
+  </w:num>
+  <w:abstractNum w:abstractNumId="10">
+    <w:multiLevelType w:val="hybridMultilevel"/>
+    <w:lvl w:ilvl="0">
+      <w:start w:val="1"/>
+      <w:numFmt w:val="bullet"/>
+      <w:lvlText w:val="•"/>
+      <w:lvlJc w:val="left"/>
+      <w:pPr>
+        <w:tabs>
+          <w:tab w:val="num" w:pos="650"/>
+        </w:tabs>
+        <w:ind w:left="650" w:hanging="360"/>
+        <w:spacing w:after="60" w:line="276" w:lineRule="auto"/>
+      </w:pPr>
+      <w:rPr>
+        <w:rFonts w:ascii="Arial" w:hAnsi="Arial"/>
+      </w:rPr>
+    </w:lvl>
+    <w:lvl w:ilvl="1">
+      <w:start w:val="1"/>
+      <w:numFmt w:val="bullet"/>
+      <w:lvlText w:val="•"/>
+      <w:lvlJc w:val="left"/>
+      <w:pPr>
+        <w:tabs>
+          <w:tab w:val="num" w:pos="1010"/>
+        </w:tabs>
+        <w:ind w:left="1010" w:hanging="360"/>
+        <w:spacing w:after="60" w:line="276" w:lineRule="auto"/>
+      </w:pPr>
+      <w:rPr>
+        <w:rFonts w:ascii="Arial" w:hAnsi="Arial"/>
+      </w:rPr>
+    </w:lvl>
+    <w:lvl w:ilvl="2">
+      <w:start w:val="1"/>
+      <w:numFmt w:val="bullet"/>
+      <w:lvlText w:val="•"/>
+      <w:lvlJc w:val="left"/>
+      <w:pPr>
+        <w:tabs>
+          <w:tab w:val="num" w:pos="1370"/>
+        </w:tabs>
+        <w:ind w:left="1370" w:hanging="360"/>
+        <w:spacing w:after="60" w:line="276" w:lineRule="auto"/>
+      </w:pPr>
+      <w:rPr>
+        <w:rFonts w:ascii="Arial" w:hAnsi="Arial"/>
+      </w:rPr>
+    </w:lvl>
+  </w:abstractNum>
+  <w:num w:numId="9">
+    <w:abstractNumId w:val="10"/>
+  </w:num>
+  <w:abstractNum w:abstractNumId="12">
+    <w:multiLevelType w:val="hybridMultilevel"/>
+    <w:lvl w:ilvl="0">
+      <w:start w:val="1"/>
+      <w:numFmt w:val="decimal"/>
+      <w:lvlText w:val="%1."/>
+      <w:lvlJc w:val="left"/>
+      <w:pPr>
+        <w:tabs>
+          <w:tab w:val="num" w:pos="650"/>
+        </w:tabs>
+        <w:ind w:left="650" w:hanging="360"/>
+        <w:spacing w:after="60" w:line="276" w:lineRule="auto"/>
+      </w:pPr>
+    </w:lvl>
+    <w:lvl w:ilvl="1">
+      <w:start w:val="1"/>
+      <w:numFmt w:val="decimal"/>
+      <w:lvlText w:val="%2."/>
+      <w:lvlJc w:val="left"/>
+      <w:pPr>
+        <w:tabs>
+          <w:tab w:val="num" w:pos="1010"/>
+        </w:tabs>
+        <w:ind w:left="1010" w:hanging="360"/>
+        <w:spacing w:after="60" w:line="276" w:lineRule="auto"/>
+      </w:pPr>
+    </w:lvl>
+    <w:lvl w:ilvl="2">
+      <w:start w:val="1"/>
+      <w:numFmt w:val="decimal"/>
+      <w:lvlText w:val="%3."/>
+      <w:lvlJc w:val="left"/>
+      <w:pPr>
+        <w:tabs>
+          <w:tab w:val="num" w:pos="1370"/>
+        </w:tabs>
+        <w:ind w:left="1370" w:hanging="360"/>
+        <w:spacing w:after="60" w:line="276" w:lineRule="auto"/>
+      </w:pPr>
+    </w:lvl>
+  </w:abstractNum>
+  <w:num w:numId="11">
+    <w:abstractNumId w:val="12"/>
+  </w:num>
+  <w:abstractNum w:abstractNumId="14">
+    <w:multiLevelType w:val="hybridMultilevel"/>
+    <w:lvl w:ilvl="0">
+      <w:start w:val="1"/>
+      <w:numFmt w:val="bullet"/>
+      <w:lvlText w:val="•"/>
+      <w:lvlJc w:val="left"/>
+      <w:pPr>
+        <w:tabs>
+          <w:tab w:val="num" w:pos="650"/>
+        </w:tabs>
+        <w:ind w:left="650" w:hanging="360"/>
+        <w:spacing w:after="60" w:line="276" w:lineRule="auto"/>
+      </w:pPr>
+      <w:rPr>
+        <w:rFonts w:ascii="Arial" w:hAnsi="Arial"/>
+      </w:rPr>
+    </w:lvl>
+    <w:lvl w:ilvl="1">
+      <w:start w:val="1"/>
+      <w:numFmt w:val="bullet"/>
+      <w:lvlText w:val="•"/>
+      <w:lvlJc w:val="left"/>
+      <w:pPr>
+        <w:tabs>
+          <w:tab w:val="num" w:pos="1010"/>
+        </w:tabs>
+        <w:ind w:left="1010" w:hanging="360"/>
+        <w:spacing w:after="60" w:line="276" w:lineRule="auto"/>
+      </w:pPr>
+      <w:rPr>
+        <w:rFonts w:ascii="Arial" w:hAnsi="Arial"/>
+      </w:rPr>
+    </w:lvl>
+    <w:lvl w:ilvl="2">
+      <w:start w:val="1"/>
+      <w:numFmt w:val="bullet"/>
+      <w:lvlText w:val="•"/>
+      <w:lvlJc w:val="left"/>
+      <w:pPr>
+        <w:tabs>
+          <w:tab w:val="num" w:pos="1370"/>
+        </w:tabs>
+        <w:ind w:left="1370" w:hanging="360"/>
+        <w:spacing w:after="60" w:line="276" w:lineRule="auto"/>
+      </w:pPr>
+      <w:rPr>
+        <w:rFonts w:ascii="Arial" w:hAnsi="Arial"/>
+      </w:rPr>
+    </w:lvl>
+  </w:abstractNum>
+  <w:num w:numId="13">
+    <w:abstractNumId w:val="14"/>
+  </w:num>
+  <w:abstractNum w:abstractNumId="16">
+    <w:multiLevelType w:val="hybridMultilevel"/>
+    <w:lvl w:ilvl="0">
+      <w:start w:val="1"/>
+      <w:numFmt w:val="decimal"/>
+      <w:lvlText w:val="%1."/>
+      <w:lvlJc w:val="left"/>
+      <w:pPr>
+        <w:tabs>
+          <w:tab w:val="num" w:pos="650"/>
+        </w:tabs>
+        <w:ind w:left="650" w:hanging="360"/>
+        <w:spacing w:after="60" w:line="276" w:lineRule="auto"/>
+      </w:pPr>
+    </w:lvl>
+    <w:lvl w:ilvl="1">
+      <w:start w:val="1"/>
+      <w:numFmt w:val="decimal"/>
+      <w:lvlText w:val="%2."/>
+      <w:lvlJc w:val="left"/>
+      <w:pPr>
+        <w:tabs>
+          <w:tab w:val="num" w:pos="1010"/>
+        </w:tabs>
+        <w:ind w:left="1010" w:hanging="360"/>
+        <w:spacing w:after="60" w:line="276" w:lineRule="auto"/>
+      </w:pPr>
+    </w:lvl>
+    <w:lvl w:ilvl="2">
+      <w:start w:val="1"/>
+      <w:numFmt w:val="decimal"/>
+      <w:lvlText w:val="%3."/>
+      <w:lvlJc w:val="left"/>
+      <w:pPr>
+        <w:tabs>
+          <w:tab w:val="num" w:pos="1370"/>
+        </w:tabs>
+        <w:ind w:left="1370" w:hanging="360"/>
+        <w:spacing w:after="60" w:line="276" w:lineRule="auto"/>
+      </w:pPr>
+    </w:lvl>
+  </w:abstractNum>
+  <w:num w:numId="15">
+    <w:abstractNumId w:val="16"/>
+  </w:num>
+  <w:abstractNum w:abstractNumId="18">
+    <w:multiLevelType w:val="hybridMultilevel"/>
+    <w:lvl w:ilvl="0">
+      <w:start w:val="1"/>
+      <w:numFmt w:val="bullet"/>
+      <w:lvlText w:val="•"/>
+      <w:lvlJc w:val="left"/>
+      <w:pPr>
+        <w:tabs>
+          <w:tab w:val="num" w:pos="650"/>
+        </w:tabs>
+        <w:ind w:left="650" w:hanging="360"/>
+        <w:spacing w:after="60" w:line="276" w:lineRule="auto"/>
+      </w:pPr>
+      <w:rPr>
+        <w:rFonts w:ascii="Arial" w:hAnsi="Arial"/>
+      </w:rPr>
+    </w:lvl>
+    <w:lvl w:ilvl="1">
+      <w:start w:val="1"/>
+      <w:numFmt w:val="bullet"/>
+      <w:lvlText w:val="•"/>
+      <w:lvlJc w:val="left"/>
+      <w:pPr>
+        <w:tabs>
+          <w:tab w:val="num" w:pos="1010"/>
+        </w:tabs>
+        <w:ind w:left="1010" w:hanging="360"/>
+        <w:spacing w:after="60" w:line="276" w:lineRule="auto"/>
+      </w:pPr>
+      <w:rPr>
+        <w:rFonts w:ascii="Arial" w:hAnsi="Arial"/>
+      </w:rPr>
+    </w:lvl>
+    <w:lvl w:ilvl="2">
+      <w:start w:val="1"/>
+      <w:numFmt w:val="bullet"/>
+      <w:lvlText w:val="•"/>
+      <w:lvlJc w:val="left"/>
+      <w:pPr>
+        <w:tabs>
+          <w:tab w:val="num" w:pos="1370"/>
+        </w:tabs>
+        <w:ind w:left="1370" w:hanging="360"/>
+        <w:spacing w:after="60" w:line="276" w:lineRule="auto"/>
+      </w:pPr>
+      <w:rPr>
+        <w:rFonts w:ascii="Arial" w:hAnsi="Arial"/>
+      </w:rPr>
+    </w:lvl>
+  </w:abstractNum>
+  <w:num w:numId="17">
+    <w:abstractNumId w:val="18"/>
+  </w:num>
+  <w:abstractNum w:abstractNumId="20">
+    <w:multiLevelType w:val="hybridMultilevel"/>
+    <w:lvl w:ilvl="0">
+      <w:start w:val="1"/>
+      <w:numFmt w:val="decimal"/>
+      <w:lvlText w:val="%1."/>
+      <w:lvlJc w:val="left"/>
+      <w:pPr>
+        <w:tabs>
+          <w:tab w:val="num" w:pos="650"/>
+        </w:tabs>
+        <w:ind w:left="650" w:hanging="360"/>
+        <w:spacing w:after="60" w:line="276" w:lineRule="auto"/>
+      </w:pPr>
+    </w:lvl>
+    <w:lvl w:ilvl="1">
+      <w:start w:val="1"/>
+      <w:numFmt w:val="decimal"/>
+      <w:lvlText w:val="%2."/>
+      <w:lvlJc w:val="left"/>
+      <w:pPr>
+        <w:tabs>
+          <w:tab w:val="num" w:pos="1010"/>
+        </w:tabs>
+        <w:ind w:left="1010" w:hanging="360"/>
+        <w:spacing w:after="60" w:line="276" w:lineRule="auto"/>
+      </w:pPr>
+    </w:lvl>
+    <w:lvl w:ilvl="2">
+      <w:start w:val="1"/>
+      <w:numFmt w:val="decimal"/>
+      <w:lvlText w:val="%3."/>
+      <w:lvlJc w:val="left"/>
+      <w:pPr>
+        <w:tabs>
+          <w:tab w:val="num" w:pos="1370"/>
+        </w:tabs>
+        <w:ind w:left="1370" w:hanging="360"/>
+        <w:spacing w:after="60" w:line="276" w:lineRule="auto"/>
+      </w:pPr>
+    </w:lvl>
+  </w:abstractNum>
+  <w:num w:numId="19">
+    <w:abstractNumId w:val="20"/>
+  </w:num>
+  <w:abstractNum w:abstractNumId="22">
+    <w:multiLevelType w:val="hybridMultilevel"/>
+    <w:lvl w:ilvl="0">
+      <w:start w:val="1"/>
+      <w:numFmt w:val="bullet"/>
+      <w:lvlText w:val="•"/>
+      <w:lvlJc w:val="left"/>
+      <w:pPr>
+        <w:tabs>
+          <w:tab w:val="num" w:pos="650"/>
+        </w:tabs>
+        <w:ind w:left="650" w:hanging="360"/>
+        <w:spacing w:after="60" w:line="276" w:lineRule="auto"/>
+      </w:pPr>
+      <w:rPr>
+        <w:rFonts w:ascii="Arial" w:hAnsi="Arial"/>
+      </w:rPr>
+    </w:lvl>
+    <w:lvl w:ilvl="1">
+      <w:start w:val="1"/>
+      <w:numFmt w:val="bullet"/>
+      <w:lvlText w:val="•"/>
+      <w:lvlJc w:val="left"/>
+      <w:pPr>
+        <w:tabs>
+          <w:tab w:val="num" w:pos="1010"/>
+        </w:tabs>
+        <w:ind w:left="1010" w:hanging="360"/>
+        <w:spacing w:after="60" w:line="276" w:lineRule="auto"/>
+      </w:pPr>
+      <w:rPr>
+        <w:rFonts w:ascii="Arial" w:hAnsi="Arial"/>
+      </w:rPr>
+    </w:lvl>
+    <w:lvl w:ilvl="2">
+      <w:start w:val="1"/>
+      <w:numFmt w:val="bullet"/>
+      <w:lvlText w:val="•"/>
+      <w:lvlJc w:val="left"/>
+      <w:pPr>
+        <w:tabs>
+          <w:tab w:val="num" w:pos="1370"/>
+        </w:tabs>
+        <w:ind w:left="1370" w:hanging="360"/>
+        <w:spacing w:after="60" w:line="276" w:lineRule="auto"/>
+      </w:pPr>
+      <w:rPr>
+        <w:rFonts w:ascii="Arial" w:hAnsi="Arial"/>
+      </w:rPr>
+    </w:lvl>
+  </w:abstractNum>
+  <w:num w:numId="21">
+    <w:abstractNumId w:val="22"/>
+  </w:num>
+  <w:abstractNum w:abstractNumId="24">
+    <w:multiLevelType w:val="hybridMultilevel"/>
+    <w:lvl w:ilvl="0">
+      <w:start w:val="1"/>
+      <w:numFmt w:val="decimal"/>
+      <w:lvlText w:val="%1."/>
+      <w:lvlJc w:val="left"/>
+      <w:pPr>
+        <w:tabs>
+          <w:tab w:val="num" w:pos="650"/>
+        </w:tabs>
+        <w:ind w:left="650" w:hanging="360"/>
+        <w:spacing w:after="60" w:line="276" w:lineRule="auto"/>
+      </w:pPr>
+    </w:lvl>
+    <w:lvl w:ilvl="1">
+      <w:start w:val="1"/>
+      <w:numFmt w:val="decimal"/>
+      <w:lvlText w:val="%2."/>
+      <w:lvlJc w:val="left"/>
+      <w:pPr>
+        <w:tabs>
+          <w:tab w:val="num" w:pos="1010"/>
+        </w:tabs>
+        <w:ind w:left="1010" w:hanging="360"/>
+        <w:spacing w:after="60" w:line="276" w:lineRule="auto"/>
+      </w:pPr>
+    </w:lvl>
+    <w:lvl w:ilvl="2">
+      <w:start w:val="1"/>
+      <w:numFmt w:val="decimal"/>
+      <w:lvlText w:val="%3."/>
+      <w:lvlJc w:val="left"/>
+      <w:pPr>
+        <w:tabs>
+          <w:tab w:val="num" w:pos="1370"/>
+        </w:tabs>
+        <w:ind w:left="1370" w:hanging="360"/>
+        <w:spacing w:after="60" w:line="276" w:lineRule="auto"/>
+      </w:pPr>
+    </w:lvl>
+  </w:abstractNum>
+  <w:num w:numId="23">
+    <w:abstractNumId w:val="24"/>
+    <w:lvlOverride w:ilvl="0">
+      <w:startOverride w:val="1"/>
+    </w:lvlOverride>
+  </w:num>
+  <w:abstractNum w:abstractNumId="26">
+    <w:multiLevelType w:val="hybridMultilevel"/>
+    <w:lvl w:ilvl="0">
+      <w:start w:val="1"/>
+      <w:numFmt w:val="bullet"/>
+      <w:lvlText w:val="•"/>
+      <w:lvlJc w:val="left"/>
+      <w:pPr>
+        <w:tabs>
+          <w:tab w:val="num" w:pos="650"/>
+        </w:tabs>
+        <w:ind w:left="650" w:hanging="360"/>
+        <w:spacing w:after="60" w:line="276" w:lineRule="auto"/>
+      </w:pPr>
+      <w:rPr>
+        <w:rFonts w:ascii="Arial" w:hAnsi="Arial"/>
+      </w:rPr>
+    </w:lvl>
+    <w:lvl w:ilvl="1">
+      <w:start w:val="1"/>
+      <w:numFmt w:val="bullet"/>
+      <w:lvlText w:val="•"/>
+      <w:lvlJc w:val="left"/>
+      <w:pPr>
+        <w:tabs>
+          <w:tab w:val="num" w:pos="1010"/>
+        </w:tabs>
+        <w:ind w:left="1010" w:hanging="360"/>
+        <w:spacing w:after="60" w:line="276" w:lineRule="auto"/>
+      </w:pPr>
+      <w:rPr>
+        <w:rFonts w:ascii="Arial" w:hAnsi="Arial"/>
+      </w:rPr>
+    </w:lvl>
+    <w:lvl w:ilvl="2">
+      <w:start w:val="1"/>
+      <w:numFmt w:val="bullet"/>
+      <w:lvlText w:val="•"/>
+      <w:lvlJc w:val="left"/>
+      <w:pPr>
+        <w:tabs>
+          <w:tab w:val="num" w:pos="1370"/>
+        </w:tabs>
+        <w:ind w:left="1370" w:hanging="360"/>
+        <w:spacing w:after="60" w:line="276" w:lineRule="auto"/>
+      </w:pPr>
+      <w:rPr>
+        <w:rFonts w:ascii="Arial" w:hAnsi="Arial"/>
+      </w:rPr>
+    </w:lvl>
+  </w:abstractNum>
+  <w:num w:numId="25">
+    <w:abstractNumId w:val="26"/>
+    <w:lvlOverride w:ilvl="0">
+      <w:startOverride w:val="1"/>
+    </w:lvlOverride>
   </w:num>
 </w:numbering>
 </file>
@@ -3083,12 +3225,13 @@
     <w:qFormat/>
     <w:rsid w:val="00607A85"/>
     <w:pPr>
-      <w:spacing w:after="120" w:line="276" w:lineRule="auto" w:before="0"/>
+      <w:spacing w:after="100" w:line="276" w:lineRule="auto" w:before="0"/>
     </w:pPr>
     <w:rPr>
       <w:rFonts w:ascii="Arial" w:eastAsia="Arial" w:hAnsi="Arial" w:cs="Arial"/>
       <w:b w:val="0"/>
-      <w:color w:val="243447"/>
+      <w:i w:val="0"/>
+      <w:color w:val="17212B"/>
       <w:kern w:val="0"/>
       <w:sz w:val="22"/>
       <w:szCs w:val="22"/>
@@ -3107,14 +3250,16 @@
     <w:pPr>
       <w:keepNext/>
       <w:keepLines/>
-      <w:spacing w:before="280" w:after="120"/>
+      <w:widowControl/>
+      <w:spacing w:before="280" w:after="120" w:line="276" w:lineRule="auto"/>
       <w:outlineLvl w:val="0"/>
     </w:pPr>
     <w:rPr>
       <w:rFonts w:asciiTheme="majorHAnsi" w:eastAsiaTheme="majorEastAsia" w:hAnsiTheme="majorHAnsi" w:cstheme="majorBidi" w:ascii="Arial" w:hAnsi="Arial" w:eastAsia="Arial" w:cs="Arial"/>
       <w:b/>
-      <w:color w:val="0F766E"/>
-      <w:sz w:val="30"/>
+      <w:i w:val="0"/>
+      <w:color w:val="0E5C50"/>
+      <w:sz w:val="28"/>
       <w:szCs w:val="40"/>
     </w:rPr>
   </w:style>
@@ -3131,14 +3276,16 @@
     <w:pPr>
       <w:keepNext/>
       <w:keepLines/>
-      <w:spacing w:before="200" w:after="80"/>
+      <w:widowControl/>
+      <w:spacing w:before="200" w:after="80" w:line="276" w:lineRule="auto"/>
       <w:outlineLvl w:val="1"/>
     </w:pPr>
     <w:rPr>
       <w:rFonts w:asciiTheme="majorHAnsi" w:eastAsiaTheme="majorEastAsia" w:hAnsiTheme="majorHAnsi" w:cstheme="majorBidi" w:ascii="Arial" w:hAnsi="Arial" w:eastAsia="Arial" w:cs="Arial"/>
       <w:b/>
-      <w:color w:val="1B365D"/>
-      <w:sz w:val="25"/>
+      <w:i w:val="0"/>
+      <w:color w:val="176B61"/>
+      <w:sz w:val="24"/>
       <w:szCs w:val="32"/>
     </w:rPr>
   </w:style>
@@ -3155,14 +3302,16 @@
     <w:pPr>
       <w:keepNext/>
       <w:keepLines/>
-      <w:spacing w:before="160" w:after="60"/>
+      <w:widowControl/>
+      <w:spacing w:before="160" w:after="60" w:line="276" w:lineRule="auto"/>
       <w:outlineLvl w:val="2"/>
     </w:pPr>
     <w:rPr>
       <w:rFonts w:eastAsiaTheme="majorEastAsia" w:cstheme="majorBidi" w:ascii="Arial" w:hAnsi="Arial" w:eastAsia="Arial" w:cs="Arial"/>
       <w:b/>
-      <w:color w:val="0F766E"/>
-      <w:sz w:val="23"/>
+      <w:i w:val="0"/>
+      <w:color w:val="3A506B"/>
+      <w:sz w:val="22"/>
       <w:szCs w:val="28"/>
     </w:rPr>
   </w:style>
@@ -3452,17 +3601,19 @@
     <w:rsid w:val="00607A85"/>
     <w:pPr>
       <w:keepNext/>
-      <w:spacing w:after="200" w:line="240" w:lineRule="auto" w:before="0"/>
+      <w:widowControl/>
+      <w:spacing w:after="200" w:line="276" w:lineRule="auto" w:before="0"/>
       <w:contextualSpacing/>
       <w:jc w:val="center"/>
     </w:pPr>
     <w:rPr>
       <w:rFonts w:asciiTheme="majorHAnsi" w:eastAsiaTheme="majorEastAsia" w:hAnsiTheme="majorHAnsi" w:cstheme="majorBidi" w:ascii="Arial" w:hAnsi="Arial" w:eastAsia="Arial" w:cs="Arial"/>
       <w:b/>
-      <w:color w:val="1B365D"/>
+      <w:i w:val="0"/>
+      <w:color w:val="0E5C50"/>
       <w:spacing w:val="-10"/>
       <w:kern w:val="28"/>
-      <w:sz w:val="44"/>
+      <w:sz w:val="40"/>
       <w:szCs w:val="56"/>
     </w:rPr>
   </w:style>
@@ -3490,18 +3641,20 @@
     <w:rsid w:val="00607A85"/>
     <w:pPr>
       <w:keepNext/>
+      <w:widowControl/>
       <w:numPr>
         <w:ilvl w:val="1"/>
       </w:numPr>
-      <w:spacing w:before="0" w:after="240"/>
+      <w:spacing w:before="0" w:after="80" w:line="276" w:lineRule="auto"/>
       <w:jc w:val="center"/>
     </w:pPr>
     <w:rPr>
       <w:rFonts w:eastAsiaTheme="majorEastAsia" w:cstheme="majorBidi" w:ascii="Arial" w:hAnsi="Arial" w:eastAsia="Arial" w:cs="Arial"/>
       <w:b w:val="0"/>
-      <w:color w:val="5B6472"/>
+      <w:i w:val="0"/>
+      <w:color w:val="66737D"/>
       <w:spacing w:val="15"/>
-      <w:sz w:val="24"/>
+      <w:sz w:val="21"/>
       <w:szCs w:val="28"/>
     </w:rPr>
   </w:style>
@@ -3563,7 +3716,8 @@
     <w:rPr>
       <w:rFonts w:ascii="Arial" w:hAnsi="Arial" w:eastAsia="Arial" w:cs="Arial"/>
       <w:b w:val="0"/>
-      <w:color w:val="243447"/>
+      <w:i w:val="0"/>
+      <w:color w:val="17212B"/>
       <w:sz w:val="22"/>
     </w:rPr>
   </w:style>
@@ -3662,6 +3816,20 @@
       <w:b w:val="0"/>
       <w:color w:val="243447"/>
       <w:sz w:val="22"/>
+    </w:rPr>
+  </w:style>
+  <w:style w:type="paragraph" w:customStyle="1" w:styleId="Caption">
+    <w:name w:val="caption"/>
+    <w:pPr>
+      <w:spacing w:before="60" w:after="160"/>
+      <w:jc w:val="center"/>
+    </w:pPr>
+    <w:rPr>
+      <w:rFonts w:ascii="Arial" w:hAnsi="Arial" w:cs="Arial" w:eastAsia="Arial"/>
+      <w:b w:val="0"/>
+      <w:i/>
+      <w:color w:val="66737D"/>
+      <w:sz w:val="19"/>
     </w:rPr>
   </w:style>
 </w:styles>

</xml_diff>